<commit_message>
git commit -m "links dos projeto no final do plano de implant
</commit_message>
<xml_diff>
--- a/PlanoImplantacao_PortfolioHUB_GustavoLisboa.docx
+++ b/PlanoImplantacao_PortfolioHUB_GustavoLisboa.docx
@@ -214,27 +214,7 @@
           <w:sz w:val="22"/>
           <w:szCs w:val="22"/>
         </w:rPr>
-        <w:t xml:space="preserve">Entrega Final — </w:t>
-      </w:r>
-      <w:proofErr w:type="spellStart"/>
-      <w:r>
-        <w:rPr>
-          <w:rFonts w:ascii="Arial" w:eastAsia="Arial" w:hAnsi="Arial" w:cs="Arial"/>
-          <w:color w:val="666666"/>
-          <w:sz w:val="22"/>
-          <w:szCs w:val="22"/>
-        </w:rPr>
-        <w:t>Bootcamp</w:t>
-      </w:r>
-      <w:proofErr w:type="spellEnd"/>
-      <w:r>
-        <w:rPr>
-          <w:rFonts w:ascii="Arial" w:eastAsia="Arial" w:hAnsi="Arial" w:cs="Arial"/>
-          <w:color w:val="666666"/>
-          <w:sz w:val="22"/>
-          <w:szCs w:val="22"/>
-        </w:rPr>
-        <w:t xml:space="preserve"> I | Prazo: 14/06/2026</w:t>
+        <w:t>Entrega Final — Bootcamp I | Prazo: 14/06/2026</w:t>
       </w:r>
     </w:p>
     <w:p>
@@ -1139,9 +1119,14 @@
           <w:sz w:val="22"/>
           <w:szCs w:val="22"/>
         </w:rPr>
-        <w:t xml:space="preserve">O PortfolioHUB é um portfólio digital profissional desenvolvido ao longo do </w:t>
-      </w:r>
-      <w:proofErr w:type="spellStart"/>
+        <w:t>O PortfolioHUB é um portfólio digital profissional desenvolvido ao longo do Bootcamp I do CEUB, com o objetivo de centralizar e apresentar a trajetória acadêmica, projetos e certificações de Gustavo Lisboa Gonçalves, estudante de Ciência de Dados e Machine Learning.</w:t>
+      </w:r>
+    </w:p>
+    <w:p>
+      <w:pPr>
+        <w:spacing w:after="160"/>
+        <w:jc w:val="both"/>
+      </w:pPr>
       <w:r>
         <w:rPr>
           <w:rFonts w:ascii="Arial" w:eastAsia="Arial" w:hAnsi="Arial" w:cs="Arial"/>
@@ -1149,9 +1134,8 @@
           <w:sz w:val="22"/>
           <w:szCs w:val="22"/>
         </w:rPr>
-        <w:t>Bootcamp</w:t>
-      </w:r>
-      <w:proofErr w:type="spellEnd"/>
+        <w:t xml:space="preserve">     </w:t>
+      </w:r>
       <w:r>
         <w:rPr>
           <w:rFonts w:ascii="Arial" w:eastAsia="Arial" w:hAnsi="Arial" w:cs="Arial"/>
@@ -1159,43 +1143,8 @@
           <w:sz w:val="22"/>
           <w:szCs w:val="22"/>
         </w:rPr>
-        <w:t xml:space="preserve"> I do CEUB, com o objetivo de centralizar e apresentar a trajetória acadêmica, projetos e certificações de Gustavo Lisboa Gonçalves, estudante de Ciência de Dados e Machine Learning.</w:t>
-      </w:r>
-    </w:p>
-    <w:p>
-      <w:pPr>
-        <w:spacing w:after="160"/>
-        <w:jc w:val="both"/>
-      </w:pPr>
-      <w:r>
-        <w:rPr>
-          <w:rFonts w:ascii="Arial" w:eastAsia="Arial" w:hAnsi="Arial" w:cs="Arial"/>
-          <w:color w:val="2C3E50"/>
-          <w:sz w:val="22"/>
-          <w:szCs w:val="22"/>
-        </w:rPr>
-        <w:t xml:space="preserve">     </w:t>
-      </w:r>
-      <w:r>
-        <w:rPr>
-          <w:rFonts w:ascii="Arial" w:eastAsia="Arial" w:hAnsi="Arial" w:cs="Arial"/>
-          <w:color w:val="2C3E50"/>
-          <w:sz w:val="22"/>
-          <w:szCs w:val="22"/>
-        </w:rPr>
-        <w:t xml:space="preserve">A plataforma foi construída utilizando </w:t>
-      </w:r>
-      <w:proofErr w:type="spellStart"/>
-      <w:r>
-        <w:rPr>
-          <w:rFonts w:ascii="Arial" w:eastAsia="Arial" w:hAnsi="Arial" w:cs="Arial"/>
-          <w:color w:val="2C3E50"/>
-          <w:sz w:val="22"/>
-          <w:szCs w:val="22"/>
-        </w:rPr>
-        <w:t>Git</w:t>
-      </w:r>
-      <w:proofErr w:type="spellEnd"/>
+        <w:t>A plataforma foi construída utilizando Git</w:t>
+      </w:r>
       <w:r>
         <w:rPr>
           <w:rFonts w:ascii="Arial" w:eastAsia="Arial" w:hAnsi="Arial" w:cs="Arial"/>
@@ -1701,21 +1650,8 @@
                 <w:sz w:val="22"/>
                 <w:szCs w:val="22"/>
               </w:rPr>
-              <w:t xml:space="preserve">Sou estudante de Ciência de Dados e Machine Learning no CEUB. Estou chegando ao final do meu </w:t>
-            </w:r>
-            <w:proofErr w:type="spellStart"/>
-            <w:r>
-              <w:rPr>
-                <w:rFonts w:ascii="Arial" w:eastAsia="Arial" w:hAnsi="Arial" w:cs="Arial"/>
-                <w:i/>
-                <w:iCs/>
-                <w:color w:val="1E3A5F"/>
-                <w:sz w:val="22"/>
-                <w:szCs w:val="22"/>
-              </w:rPr>
-              <w:t>Bootcamp</w:t>
-            </w:r>
-            <w:proofErr w:type="spellEnd"/>
+              <w:t>Sou estudante de Ciência de Dados e Machine Learning no CEUB. Estou chegando ao final do meu Bootcamp</w:t>
+            </w:r>
             <w:r>
               <w:rPr>
                 <w:rFonts w:ascii="Arial" w:eastAsia="Arial" w:hAnsi="Arial" w:cs="Arial"/>
@@ -2065,29 +2001,7 @@
                 <w:szCs w:val="21"/>
                 <w:lang w:val="en-US"/>
               </w:rPr>
-              <w:t xml:space="preserve">, </w:t>
-            </w:r>
-            <w:proofErr w:type="spellStart"/>
-            <w:r>
-              <w:rPr>
-                <w:rFonts w:ascii="Arial" w:eastAsia="Arial" w:hAnsi="Arial" w:cs="Arial"/>
-                <w:color w:val="2C3E50"/>
-                <w:sz w:val="21"/>
-                <w:szCs w:val="21"/>
-                <w:lang w:val="en-US"/>
-              </w:rPr>
-              <w:t>defina</w:t>
-            </w:r>
-            <w:proofErr w:type="spellEnd"/>
-            <w:r>
-              <w:rPr>
-                <w:rFonts w:ascii="Arial" w:eastAsia="Arial" w:hAnsi="Arial" w:cs="Arial"/>
-                <w:color w:val="2C3E50"/>
-                <w:sz w:val="21"/>
-                <w:szCs w:val="21"/>
-                <w:lang w:val="en-US"/>
-              </w:rPr>
-              <w:t xml:space="preserve"> a </w:t>
+              <w:t xml:space="preserve">, defina a </w:t>
             </w:r>
             <w:r>
               <w:rPr>
@@ -2109,29 +2023,7 @@
                 <w:szCs w:val="21"/>
                 <w:lang w:val="en-US"/>
               </w:rPr>
-              <w:t xml:space="preserve"> </w:t>
-            </w:r>
-            <w:proofErr w:type="spellStart"/>
-            <w:r>
-              <w:rPr>
-                <w:rFonts w:ascii="Arial" w:eastAsia="Arial" w:hAnsi="Arial" w:cs="Arial"/>
-                <w:color w:val="2C3E50"/>
-                <w:sz w:val="21"/>
-                <w:szCs w:val="21"/>
-                <w:lang w:val="en-US"/>
-              </w:rPr>
-              <w:t>como</w:t>
-            </w:r>
-            <w:proofErr w:type="spellEnd"/>
-            <w:r>
-              <w:rPr>
-                <w:rFonts w:ascii="Arial" w:eastAsia="Arial" w:hAnsi="Arial" w:cs="Arial"/>
-                <w:color w:val="2C3E50"/>
-                <w:sz w:val="21"/>
-                <w:szCs w:val="21"/>
-                <w:lang w:val="en-US"/>
-              </w:rPr>
-              <w:t xml:space="preserve"> </w:t>
+              <w:t xml:space="preserve"> como </w:t>
             </w:r>
             <w:r>
               <w:rPr>
@@ -2200,7 +2092,6 @@
               </w:rPr>
               <w:t xml:space="preserve">, selecione </w:t>
             </w:r>
-            <w:proofErr w:type="spellStart"/>
             <w:r>
               <w:rPr>
                 <w:rFonts w:ascii="Arial" w:eastAsia="Arial" w:hAnsi="Arial" w:cs="Arial"/>
@@ -2212,7 +2103,6 @@
               </w:rPr>
               <w:t>main</w:t>
             </w:r>
-            <w:proofErr w:type="spellEnd"/>
             <w:r>
               <w:rPr>
                 <w:rFonts w:ascii="Arial" w:eastAsia="Arial" w:hAnsi="Arial" w:cs="Arial"/>
@@ -2242,7 +2132,6 @@
               </w:rPr>
               <w:t xml:space="preserve">. Clique em </w:t>
             </w:r>
-            <w:proofErr w:type="spellStart"/>
             <w:r>
               <w:rPr>
                 <w:rFonts w:ascii="Arial" w:eastAsia="Arial" w:hAnsi="Arial" w:cs="Arial"/>
@@ -2254,7 +2143,6 @@
               </w:rPr>
               <w:t>Save</w:t>
             </w:r>
-            <w:proofErr w:type="spellEnd"/>
             <w:r>
               <w:rPr>
                 <w:rFonts w:ascii="Arial" w:eastAsia="Arial" w:hAnsi="Arial" w:cs="Arial"/>
@@ -2287,27 +2175,7 @@
                 <w:sz w:val="21"/>
                 <w:szCs w:val="21"/>
               </w:rPr>
-              <w:t>O GitHub gerará o link público (</w:t>
-            </w:r>
-            <w:proofErr w:type="spellStart"/>
-            <w:r>
-              <w:rPr>
-                <w:rFonts w:ascii="Arial" w:eastAsia="Arial" w:hAnsi="Arial" w:cs="Arial"/>
-                <w:color w:val="2C3E50"/>
-                <w:sz w:val="21"/>
-                <w:szCs w:val="21"/>
-              </w:rPr>
-              <w:t>ex</w:t>
-            </w:r>
-            <w:proofErr w:type="spellEnd"/>
-            <w:r>
-              <w:rPr>
-                <w:rFonts w:ascii="Arial" w:eastAsia="Arial" w:hAnsi="Arial" w:cs="Arial"/>
-                <w:color w:val="2C3E50"/>
-                <w:sz w:val="21"/>
-                <w:szCs w:val="21"/>
-              </w:rPr>
-              <w:t>: https://gustavolg95.github.io/PortfolioHUB/).</w:t>
+              <w:t>O GitHub gerará o link público (ex: https://gustavolg95.github.io/PortfolioHUB/).</w:t>
             </w:r>
           </w:p>
           <w:p>
@@ -2386,135 +2254,25 @@
                 <w:szCs w:val="21"/>
               </w:rPr>
             </w:pPr>
-            <w:proofErr w:type="gramStart"/>
-            <w:r>
-              <w:rPr>
-                <w:rFonts w:ascii="Arial" w:eastAsia="Arial" w:hAnsi="Arial" w:cs="Arial"/>
-                <w:b/>
-                <w:bCs/>
-                <w:color w:val="2C3E50"/>
-                <w:sz w:val="21"/>
-                <w:szCs w:val="21"/>
-              </w:rPr>
-              <w:t>Arquivo .</w:t>
-            </w:r>
-            <w:proofErr w:type="spellStart"/>
-            <w:r>
-              <w:rPr>
-                <w:rFonts w:ascii="Arial" w:eastAsia="Arial" w:hAnsi="Arial" w:cs="Arial"/>
-                <w:b/>
-                <w:bCs/>
-                <w:color w:val="2C3E50"/>
-                <w:sz w:val="21"/>
-                <w:szCs w:val="21"/>
-              </w:rPr>
-              <w:t>gitignore</w:t>
-            </w:r>
-            <w:proofErr w:type="spellEnd"/>
-            <w:proofErr w:type="gramEnd"/>
-            <w:r>
-              <w:rPr>
-                <w:rFonts w:ascii="Arial" w:eastAsia="Arial" w:hAnsi="Arial" w:cs="Arial"/>
-                <w:b/>
-                <w:bCs/>
-                <w:color w:val="2C3E50"/>
-                <w:sz w:val="21"/>
-                <w:szCs w:val="21"/>
-              </w:rPr>
-              <w:t>:</w:t>
-            </w:r>
-            <w:r>
-              <w:rPr>
-                <w:rFonts w:ascii="Arial" w:eastAsia="Arial" w:hAnsi="Arial" w:cs="Arial"/>
-                <w:color w:val="2C3E50"/>
-                <w:sz w:val="21"/>
-                <w:szCs w:val="21"/>
-              </w:rPr>
-              <w:t xml:space="preserve"> Crie este arquivo na raiz e adicione nele arquivos de configuração local (</w:t>
-            </w:r>
-            <w:proofErr w:type="spellStart"/>
-            <w:r>
-              <w:rPr>
-                <w:rFonts w:ascii="Arial" w:eastAsia="Arial" w:hAnsi="Arial" w:cs="Arial"/>
-                <w:color w:val="2C3E50"/>
-                <w:sz w:val="21"/>
-                <w:szCs w:val="21"/>
-              </w:rPr>
-              <w:t>ex</w:t>
-            </w:r>
-            <w:proofErr w:type="spellEnd"/>
-            <w:proofErr w:type="gramStart"/>
-            <w:r>
-              <w:rPr>
-                <w:rFonts w:ascii="Arial" w:eastAsia="Arial" w:hAnsi="Arial" w:cs="Arial"/>
-                <w:color w:val="2C3E50"/>
-                <w:sz w:val="21"/>
-                <w:szCs w:val="21"/>
-              </w:rPr>
-              <w:t>: .</w:t>
-            </w:r>
-            <w:proofErr w:type="spellStart"/>
-            <w:r>
-              <w:rPr>
-                <w:rFonts w:ascii="Arial" w:eastAsia="Arial" w:hAnsi="Arial" w:cs="Arial"/>
-                <w:color w:val="2C3E50"/>
-                <w:sz w:val="21"/>
-                <w:szCs w:val="21"/>
-              </w:rPr>
-              <w:t>env</w:t>
-            </w:r>
-            <w:proofErr w:type="spellEnd"/>
-            <w:proofErr w:type="gramEnd"/>
-            <w:r>
-              <w:rPr>
-                <w:rFonts w:ascii="Arial" w:eastAsia="Arial" w:hAnsi="Arial" w:cs="Arial"/>
-                <w:color w:val="2C3E50"/>
-                <w:sz w:val="21"/>
-                <w:szCs w:val="21"/>
-              </w:rPr>
-              <w:t xml:space="preserve">, </w:t>
-            </w:r>
-            <w:proofErr w:type="spellStart"/>
-            <w:proofErr w:type="gramStart"/>
-            <w:r>
-              <w:rPr>
-                <w:rFonts w:ascii="Arial" w:eastAsia="Arial" w:hAnsi="Arial" w:cs="Arial"/>
-                <w:color w:val="2C3E50"/>
-                <w:sz w:val="21"/>
-                <w:szCs w:val="21"/>
-              </w:rPr>
-              <w:t>config.json</w:t>
-            </w:r>
-            <w:proofErr w:type="spellEnd"/>
-            <w:r>
-              <w:rPr>
-                <w:rFonts w:ascii="Arial" w:eastAsia="Arial" w:hAnsi="Arial" w:cs="Arial"/>
-                <w:color w:val="2C3E50"/>
-                <w:sz w:val="21"/>
-                <w:szCs w:val="21"/>
-              </w:rPr>
-              <w:t>, .</w:t>
-            </w:r>
-            <w:proofErr w:type="spellStart"/>
-            <w:r>
-              <w:rPr>
-                <w:rFonts w:ascii="Arial" w:eastAsia="Arial" w:hAnsi="Arial" w:cs="Arial"/>
-                <w:color w:val="2C3E50"/>
-                <w:sz w:val="21"/>
-                <w:szCs w:val="21"/>
-              </w:rPr>
-              <w:t>venv</w:t>
-            </w:r>
-            <w:proofErr w:type="spellEnd"/>
-            <w:proofErr w:type="gramEnd"/>
-            <w:r>
-              <w:rPr>
-                <w:rFonts w:ascii="Arial" w:eastAsia="Arial" w:hAnsi="Arial" w:cs="Arial"/>
-                <w:color w:val="2C3E50"/>
-                <w:sz w:val="21"/>
-                <w:szCs w:val="21"/>
-              </w:rPr>
-              <w:t>/).</w:t>
+            <w:r>
+              <w:rPr>
+                <w:rFonts w:ascii="Arial" w:eastAsia="Arial" w:hAnsi="Arial" w:cs="Arial"/>
+                <w:b/>
+                <w:bCs/>
+                <w:color w:val="2C3E50"/>
+                <w:sz w:val="21"/>
+                <w:szCs w:val="21"/>
+              </w:rPr>
+              <w:t>Arquivo .gitignore:</w:t>
+            </w:r>
+            <w:r>
+              <w:rPr>
+                <w:rFonts w:ascii="Arial" w:eastAsia="Arial" w:hAnsi="Arial" w:cs="Arial"/>
+                <w:color w:val="2C3E50"/>
+                <w:sz w:val="21"/>
+                <w:szCs w:val="21"/>
+              </w:rPr>
+              <w:t xml:space="preserve"> Crie este arquivo na raiz e adicione nele arquivos de configuração local (ex: .env, config.json, .venv/).</w:t>
             </w:r>
           </w:p>
           <w:p>
@@ -2552,7 +2310,6 @@
               </w:rPr>
               <w:t xml:space="preserve"> Monitore vulnerabilidades ativando o </w:t>
             </w:r>
-            <w:proofErr w:type="spellStart"/>
             <w:r>
               <w:rPr>
                 <w:rFonts w:ascii="Arial" w:eastAsia="Arial" w:hAnsi="Arial" w:cs="Arial"/>
@@ -2564,7 +2321,6 @@
               </w:rPr>
               <w:t>Dependabot</w:t>
             </w:r>
-            <w:proofErr w:type="spellEnd"/>
             <w:r>
               <w:rPr>
                 <w:rFonts w:ascii="Arial" w:eastAsia="Arial" w:hAnsi="Arial" w:cs="Arial"/>
@@ -2583,93 +2339,8 @@
                 <w:sz w:val="21"/>
                 <w:szCs w:val="21"/>
               </w:rPr>
-              <w:t xml:space="preserve">Settings &gt; </w:t>
-            </w:r>
-            <w:proofErr w:type="spellStart"/>
-            <w:r>
-              <w:rPr>
-                <w:rFonts w:ascii="Arial" w:eastAsia="Arial" w:hAnsi="Arial" w:cs="Arial"/>
-                <w:i/>
-                <w:iCs/>
-                <w:color w:val="2C3E50"/>
-                <w:sz w:val="21"/>
-                <w:szCs w:val="21"/>
-              </w:rPr>
-              <w:t>Code</w:t>
-            </w:r>
-            <w:proofErr w:type="spellEnd"/>
-            <w:r>
-              <w:rPr>
-                <w:rFonts w:ascii="Arial" w:eastAsia="Arial" w:hAnsi="Arial" w:cs="Arial"/>
-                <w:i/>
-                <w:iCs/>
-                <w:color w:val="2C3E50"/>
-                <w:sz w:val="21"/>
-                <w:szCs w:val="21"/>
-              </w:rPr>
-              <w:t xml:space="preserve"> </w:t>
-            </w:r>
-            <w:proofErr w:type="spellStart"/>
-            <w:r>
-              <w:rPr>
-                <w:rFonts w:ascii="Arial" w:eastAsia="Arial" w:hAnsi="Arial" w:cs="Arial"/>
-                <w:i/>
-                <w:iCs/>
-                <w:color w:val="2C3E50"/>
-                <w:sz w:val="21"/>
-                <w:szCs w:val="21"/>
-              </w:rPr>
-              <w:t>security</w:t>
-            </w:r>
-            <w:proofErr w:type="spellEnd"/>
-            <w:r>
-              <w:rPr>
-                <w:rFonts w:ascii="Arial" w:eastAsia="Arial" w:hAnsi="Arial" w:cs="Arial"/>
-                <w:i/>
-                <w:iCs/>
-                <w:color w:val="2C3E50"/>
-                <w:sz w:val="21"/>
-                <w:szCs w:val="21"/>
-              </w:rPr>
-              <w:t xml:space="preserve"> </w:t>
-            </w:r>
-            <w:proofErr w:type="spellStart"/>
-            <w:r>
-              <w:rPr>
-                <w:rFonts w:ascii="Arial" w:eastAsia="Arial" w:hAnsi="Arial" w:cs="Arial"/>
-                <w:i/>
-                <w:iCs/>
-                <w:color w:val="2C3E50"/>
-                <w:sz w:val="21"/>
-                <w:szCs w:val="21"/>
-              </w:rPr>
-              <w:t>and</w:t>
-            </w:r>
-            <w:proofErr w:type="spellEnd"/>
-            <w:r>
-              <w:rPr>
-                <w:rFonts w:ascii="Arial" w:eastAsia="Arial" w:hAnsi="Arial" w:cs="Arial"/>
-                <w:i/>
-                <w:iCs/>
-                <w:color w:val="2C3E50"/>
-                <w:sz w:val="21"/>
-                <w:szCs w:val="21"/>
-              </w:rPr>
-              <w:t xml:space="preserve"> </w:t>
-            </w:r>
-            <w:proofErr w:type="spellStart"/>
-            <w:r>
-              <w:rPr>
-                <w:rFonts w:ascii="Arial" w:eastAsia="Arial" w:hAnsi="Arial" w:cs="Arial"/>
-                <w:i/>
-                <w:iCs/>
-                <w:color w:val="2C3E50"/>
-                <w:sz w:val="21"/>
-                <w:szCs w:val="21"/>
-              </w:rPr>
-              <w:t>analysis</w:t>
-            </w:r>
-            <w:proofErr w:type="spellEnd"/>
+              <w:t>Settings &gt; Code security and analysis</w:t>
+            </w:r>
             <w:r>
               <w:rPr>
                 <w:rFonts w:ascii="Arial" w:eastAsia="Arial" w:hAnsi="Arial" w:cs="Arial"/>
@@ -2785,9 +2456,17 @@
                 <w:sz w:val="21"/>
                 <w:szCs w:val="21"/>
               </w:rPr>
-              <w:t xml:space="preserve">Settings &gt; </w:t>
-            </w:r>
-            <w:proofErr w:type="spellStart"/>
+              <w:t>Settings &gt; Branches</w:t>
+            </w:r>
+            <w:r>
+              <w:rPr>
+                <w:rFonts w:ascii="Arial" w:eastAsia="Arial" w:hAnsi="Arial" w:cs="Arial"/>
+                <w:color w:val="2C3E50"/>
+                <w:sz w:val="21"/>
+                <w:szCs w:val="21"/>
+              </w:rPr>
+              <w:t xml:space="preserve"> e adicione uma regra de proteção para a main. Exija </w:t>
+            </w:r>
             <w:r>
               <w:rPr>
                 <w:rFonts w:ascii="Arial" w:eastAsia="Arial" w:hAnsi="Arial" w:cs="Arial"/>
@@ -2797,75 +2476,8 @@
                 <w:sz w:val="21"/>
                 <w:szCs w:val="21"/>
               </w:rPr>
-              <w:t>Branches</w:t>
-            </w:r>
-            <w:proofErr w:type="spellEnd"/>
-            <w:r>
-              <w:rPr>
-                <w:rFonts w:ascii="Arial" w:eastAsia="Arial" w:hAnsi="Arial" w:cs="Arial"/>
-                <w:color w:val="2C3E50"/>
-                <w:sz w:val="21"/>
-                <w:szCs w:val="21"/>
-              </w:rPr>
-              <w:t xml:space="preserve"> e adicione uma regra de proteção para a </w:t>
-            </w:r>
-            <w:proofErr w:type="spellStart"/>
-            <w:r>
-              <w:rPr>
-                <w:rFonts w:ascii="Arial" w:eastAsia="Arial" w:hAnsi="Arial" w:cs="Arial"/>
-                <w:color w:val="2C3E50"/>
-                <w:sz w:val="21"/>
-                <w:szCs w:val="21"/>
-              </w:rPr>
-              <w:t>main</w:t>
-            </w:r>
-            <w:proofErr w:type="spellEnd"/>
-            <w:r>
-              <w:rPr>
-                <w:rFonts w:ascii="Arial" w:eastAsia="Arial" w:hAnsi="Arial" w:cs="Arial"/>
-                <w:color w:val="2C3E50"/>
-                <w:sz w:val="21"/>
-                <w:szCs w:val="21"/>
-              </w:rPr>
-              <w:t xml:space="preserve">. Exija </w:t>
-            </w:r>
-            <w:proofErr w:type="spellStart"/>
-            <w:r>
-              <w:rPr>
-                <w:rFonts w:ascii="Arial" w:eastAsia="Arial" w:hAnsi="Arial" w:cs="Arial"/>
-                <w:i/>
-                <w:iCs/>
-                <w:color w:val="2C3E50"/>
-                <w:sz w:val="21"/>
-                <w:szCs w:val="21"/>
-              </w:rPr>
-              <w:t>Pull</w:t>
-            </w:r>
-            <w:proofErr w:type="spellEnd"/>
-            <w:r>
-              <w:rPr>
-                <w:rFonts w:ascii="Arial" w:eastAsia="Arial" w:hAnsi="Arial" w:cs="Arial"/>
-                <w:i/>
-                <w:iCs/>
-                <w:color w:val="2C3E50"/>
-                <w:sz w:val="21"/>
-                <w:szCs w:val="21"/>
-              </w:rPr>
-              <w:t xml:space="preserve"> </w:t>
-            </w:r>
-            <w:proofErr w:type="spellStart"/>
-            <w:r>
-              <w:rPr>
-                <w:rFonts w:ascii="Arial" w:eastAsia="Arial" w:hAnsi="Arial" w:cs="Arial"/>
-                <w:i/>
-                <w:iCs/>
-                <w:color w:val="2C3E50"/>
-                <w:sz w:val="21"/>
-                <w:szCs w:val="21"/>
-              </w:rPr>
-              <w:t>Requests</w:t>
-            </w:r>
-            <w:proofErr w:type="spellEnd"/>
+              <w:t>Pull Requests</w:t>
+            </w:r>
             <w:r>
               <w:rPr>
                 <w:rFonts w:ascii="Arial" w:eastAsia="Arial" w:hAnsi="Arial" w:cs="Arial"/>
@@ -3357,55 +2969,7 @@
                 <w:sz w:val="21"/>
                 <w:szCs w:val="21"/>
               </w:rPr>
-              <w:t>1. Varredura de Segredos (</w:t>
-            </w:r>
-            <w:proofErr w:type="spellStart"/>
-            <w:r>
-              <w:rPr>
-                <w:rFonts w:ascii="Arial" w:eastAsia="Arial" w:hAnsi="Arial" w:cs="Arial"/>
-                <w:b/>
-                <w:bCs/>
-                <w:color w:val="2C3E50"/>
-                <w:sz w:val="21"/>
-                <w:szCs w:val="21"/>
-              </w:rPr>
-              <w:t>Secret</w:t>
-            </w:r>
-            <w:proofErr w:type="spellEnd"/>
-            <w:r>
-              <w:rPr>
-                <w:rFonts w:ascii="Arial" w:eastAsia="Arial" w:hAnsi="Arial" w:cs="Arial"/>
-                <w:b/>
-                <w:bCs/>
-                <w:color w:val="2C3E50"/>
-                <w:sz w:val="21"/>
-                <w:szCs w:val="21"/>
-              </w:rPr>
-              <w:t xml:space="preserve"> </w:t>
-            </w:r>
-            <w:proofErr w:type="spellStart"/>
-            <w:r>
-              <w:rPr>
-                <w:rFonts w:ascii="Arial" w:eastAsia="Arial" w:hAnsi="Arial" w:cs="Arial"/>
-                <w:b/>
-                <w:bCs/>
-                <w:color w:val="2C3E50"/>
-                <w:sz w:val="21"/>
-                <w:szCs w:val="21"/>
-              </w:rPr>
-              <w:t>Scanning</w:t>
-            </w:r>
-            <w:proofErr w:type="spellEnd"/>
-            <w:r>
-              <w:rPr>
-                <w:rFonts w:ascii="Arial" w:eastAsia="Arial" w:hAnsi="Arial" w:cs="Arial"/>
-                <w:b/>
-                <w:bCs/>
-                <w:color w:val="2C3E50"/>
-                <w:sz w:val="21"/>
-                <w:szCs w:val="21"/>
-              </w:rPr>
-              <w:t>)</w:t>
+              <w:t>1. Varredura de Segredos (Secret Scanning)</w:t>
             </w:r>
           </w:p>
           <w:p>
@@ -3454,103 +3018,7 @@
                 <w:sz w:val="21"/>
                 <w:szCs w:val="21"/>
               </w:rPr>
-              <w:t xml:space="preserve">Settings &gt; </w:t>
-            </w:r>
-            <w:proofErr w:type="spellStart"/>
-            <w:r>
-              <w:rPr>
-                <w:rFonts w:ascii="Arial" w:eastAsia="Arial" w:hAnsi="Arial" w:cs="Arial"/>
-                <w:b/>
-                <w:bCs/>
-                <w:color w:val="2C3E50"/>
-                <w:sz w:val="21"/>
-                <w:szCs w:val="21"/>
-              </w:rPr>
-              <w:t>Code</w:t>
-            </w:r>
-            <w:proofErr w:type="spellEnd"/>
-            <w:r>
-              <w:rPr>
-                <w:rFonts w:ascii="Arial" w:eastAsia="Arial" w:hAnsi="Arial" w:cs="Arial"/>
-                <w:b/>
-                <w:bCs/>
-                <w:color w:val="2C3E50"/>
-                <w:sz w:val="21"/>
-                <w:szCs w:val="21"/>
-              </w:rPr>
-              <w:t xml:space="preserve"> </w:t>
-            </w:r>
-            <w:proofErr w:type="spellStart"/>
-            <w:r>
-              <w:rPr>
-                <w:rFonts w:ascii="Arial" w:eastAsia="Arial" w:hAnsi="Arial" w:cs="Arial"/>
-                <w:b/>
-                <w:bCs/>
-                <w:color w:val="2C3E50"/>
-                <w:sz w:val="21"/>
-                <w:szCs w:val="21"/>
-              </w:rPr>
-              <w:t>security</w:t>
-            </w:r>
-            <w:proofErr w:type="spellEnd"/>
-            <w:r>
-              <w:rPr>
-                <w:rFonts w:ascii="Arial" w:eastAsia="Arial" w:hAnsi="Arial" w:cs="Arial"/>
-                <w:b/>
-                <w:bCs/>
-                <w:color w:val="2C3E50"/>
-                <w:sz w:val="21"/>
-                <w:szCs w:val="21"/>
-              </w:rPr>
-              <w:t xml:space="preserve"> </w:t>
-            </w:r>
-            <w:proofErr w:type="spellStart"/>
-            <w:r>
-              <w:rPr>
-                <w:rFonts w:ascii="Arial" w:eastAsia="Arial" w:hAnsi="Arial" w:cs="Arial"/>
-                <w:b/>
-                <w:bCs/>
-                <w:color w:val="2C3E50"/>
-                <w:sz w:val="21"/>
-                <w:szCs w:val="21"/>
-              </w:rPr>
-              <w:t>and</w:t>
-            </w:r>
-            <w:proofErr w:type="spellEnd"/>
-            <w:r>
-              <w:rPr>
-                <w:rFonts w:ascii="Arial" w:eastAsia="Arial" w:hAnsi="Arial" w:cs="Arial"/>
-                <w:b/>
-                <w:bCs/>
-                <w:color w:val="2C3E50"/>
-                <w:sz w:val="21"/>
-                <w:szCs w:val="21"/>
-              </w:rPr>
-              <w:t xml:space="preserve"> </w:t>
-            </w:r>
-            <w:proofErr w:type="spellStart"/>
-            <w:r>
-              <w:rPr>
-                <w:rFonts w:ascii="Arial" w:eastAsia="Arial" w:hAnsi="Arial" w:cs="Arial"/>
-                <w:b/>
-                <w:bCs/>
-                <w:color w:val="2C3E50"/>
-                <w:sz w:val="21"/>
-                <w:szCs w:val="21"/>
-              </w:rPr>
-              <w:t>analysis</w:t>
-            </w:r>
-            <w:proofErr w:type="spellEnd"/>
-            <w:r>
-              <w:rPr>
-                <w:rFonts w:ascii="Arial" w:eastAsia="Arial" w:hAnsi="Arial" w:cs="Arial"/>
-                <w:b/>
-                <w:bCs/>
-                <w:color w:val="2C3E50"/>
-                <w:sz w:val="21"/>
-                <w:szCs w:val="21"/>
-              </w:rPr>
-              <w:t xml:space="preserve"> </w:t>
+              <w:t xml:space="preserve">Settings &gt; Code security and analysis </w:t>
             </w:r>
             <w:r>
               <w:rPr>
@@ -3570,55 +3038,7 @@
                 <w:sz w:val="21"/>
                 <w:szCs w:val="21"/>
               </w:rPr>
-              <w:t xml:space="preserve"> </w:t>
-            </w:r>
-            <w:proofErr w:type="spellStart"/>
-            <w:r>
-              <w:rPr>
-                <w:rFonts w:ascii="Arial" w:eastAsia="Arial" w:hAnsi="Arial" w:cs="Arial"/>
-                <w:b/>
-                <w:bCs/>
-                <w:color w:val="2C3E50"/>
-                <w:sz w:val="21"/>
-                <w:szCs w:val="21"/>
-              </w:rPr>
-              <w:t>Secret</w:t>
-            </w:r>
-            <w:proofErr w:type="spellEnd"/>
-            <w:r>
-              <w:rPr>
-                <w:rFonts w:ascii="Arial" w:eastAsia="Arial" w:hAnsi="Arial" w:cs="Arial"/>
-                <w:b/>
-                <w:bCs/>
-                <w:color w:val="2C3E50"/>
-                <w:sz w:val="21"/>
-                <w:szCs w:val="21"/>
-              </w:rPr>
-              <w:t xml:space="preserve"> </w:t>
-            </w:r>
-            <w:proofErr w:type="spellStart"/>
-            <w:r>
-              <w:rPr>
-                <w:rFonts w:ascii="Arial" w:eastAsia="Arial" w:hAnsi="Arial" w:cs="Arial"/>
-                <w:b/>
-                <w:bCs/>
-                <w:color w:val="2C3E50"/>
-                <w:sz w:val="21"/>
-                <w:szCs w:val="21"/>
-              </w:rPr>
-              <w:t>Scanning</w:t>
-            </w:r>
-            <w:proofErr w:type="spellEnd"/>
-            <w:r>
-              <w:rPr>
-                <w:rFonts w:ascii="Arial" w:eastAsia="Arial" w:hAnsi="Arial" w:cs="Arial"/>
-                <w:b/>
-                <w:bCs/>
-                <w:color w:val="2C3E50"/>
-                <w:sz w:val="21"/>
-                <w:szCs w:val="21"/>
-              </w:rPr>
-              <w:t xml:space="preserve"> </w:t>
+              <w:t xml:space="preserve"> Secret Scanning </w:t>
             </w:r>
             <w:r>
               <w:rPr>
@@ -3638,55 +3058,7 @@
                 <w:sz w:val="21"/>
                 <w:szCs w:val="21"/>
               </w:rPr>
-              <w:t xml:space="preserve"> </w:t>
-            </w:r>
-            <w:proofErr w:type="spellStart"/>
-            <w:r>
-              <w:rPr>
-                <w:rFonts w:ascii="Arial" w:eastAsia="Arial" w:hAnsi="Arial" w:cs="Arial"/>
-                <w:b/>
-                <w:bCs/>
-                <w:color w:val="2C3E50"/>
-                <w:sz w:val="21"/>
-                <w:szCs w:val="21"/>
-              </w:rPr>
-              <w:t>Push</w:t>
-            </w:r>
-            <w:proofErr w:type="spellEnd"/>
-            <w:r>
-              <w:rPr>
-                <w:rFonts w:ascii="Arial" w:eastAsia="Arial" w:hAnsi="Arial" w:cs="Arial"/>
-                <w:b/>
-                <w:bCs/>
-                <w:color w:val="2C3E50"/>
-                <w:sz w:val="21"/>
-                <w:szCs w:val="21"/>
-              </w:rPr>
-              <w:t xml:space="preserve"> </w:t>
-            </w:r>
-            <w:proofErr w:type="spellStart"/>
-            <w:r>
-              <w:rPr>
-                <w:rFonts w:ascii="Arial" w:eastAsia="Arial" w:hAnsi="Arial" w:cs="Arial"/>
-                <w:b/>
-                <w:bCs/>
-                <w:color w:val="2C3E50"/>
-                <w:sz w:val="21"/>
-                <w:szCs w:val="21"/>
-              </w:rPr>
-              <w:t>Protection</w:t>
-            </w:r>
-            <w:proofErr w:type="spellEnd"/>
-            <w:r>
-              <w:rPr>
-                <w:rFonts w:ascii="Arial" w:eastAsia="Arial" w:hAnsi="Arial" w:cs="Arial"/>
-                <w:b/>
-                <w:bCs/>
-                <w:color w:val="2C3E50"/>
-                <w:sz w:val="21"/>
-                <w:szCs w:val="21"/>
-              </w:rPr>
-              <w:t>.</w:t>
+              <w:t xml:space="preserve"> Push Protection.</w:t>
             </w:r>
           </w:p>
           <w:p>
@@ -3726,7 +3098,6 @@
               </w:rPr>
               <w:t xml:space="preserve">O GitHub bloqueará automaticamente qualquer tentativa de dar </w:t>
             </w:r>
-            <w:proofErr w:type="spellStart"/>
             <w:r>
               <w:rPr>
                 <w:rFonts w:ascii="Arial" w:eastAsia="Arial" w:hAnsi="Arial" w:cs="Arial"/>
@@ -3738,7 +3109,6 @@
               </w:rPr>
               <w:t>push</w:t>
             </w:r>
-            <w:proofErr w:type="spellEnd"/>
             <w:r>
               <w:rPr>
                 <w:rFonts w:ascii="Arial" w:eastAsia="Arial" w:hAnsi="Arial" w:cs="Arial"/>
@@ -3771,21 +3141,8 @@
                 <w:sz w:val="21"/>
                 <w:szCs w:val="21"/>
               </w:rPr>
-              <w:t xml:space="preserve">2. Ative o </w:t>
-            </w:r>
-            <w:proofErr w:type="spellStart"/>
-            <w:r>
-              <w:rPr>
-                <w:rFonts w:ascii="Arial" w:eastAsia="Arial" w:hAnsi="Arial" w:cs="Arial"/>
-                <w:b/>
-                <w:bCs/>
-                <w:color w:val="2C3E50"/>
-                <w:sz w:val="21"/>
-                <w:szCs w:val="21"/>
-              </w:rPr>
-              <w:t>Dependabot</w:t>
-            </w:r>
-            <w:proofErr w:type="spellEnd"/>
+              <w:t>2. Ative o Dependabot</w:t>
+            </w:r>
           </w:p>
           <w:p>
             <w:pPr>
@@ -3824,7 +3181,6 @@
               </w:rPr>
               <w:t xml:space="preserve">Na mesma aba de </w:t>
             </w:r>
-            <w:proofErr w:type="spellStart"/>
             <w:r>
               <w:rPr>
                 <w:rFonts w:ascii="Arial" w:eastAsia="Arial" w:hAnsi="Arial" w:cs="Arial"/>
@@ -3834,33 +3190,8 @@
                 <w:sz w:val="21"/>
                 <w:szCs w:val="21"/>
               </w:rPr>
-              <w:t>Code</w:t>
-            </w:r>
-            <w:proofErr w:type="spellEnd"/>
-            <w:r>
-              <w:rPr>
-                <w:rFonts w:ascii="Arial" w:eastAsia="Arial" w:hAnsi="Arial" w:cs="Arial"/>
-                <w:i/>
-                <w:iCs/>
-                <w:color w:val="2C3E50"/>
-                <w:sz w:val="21"/>
-                <w:szCs w:val="21"/>
-              </w:rPr>
-              <w:t xml:space="preserve"> </w:t>
-            </w:r>
-            <w:proofErr w:type="spellStart"/>
-            <w:r>
-              <w:rPr>
-                <w:rFonts w:ascii="Arial" w:eastAsia="Arial" w:hAnsi="Arial" w:cs="Arial"/>
-                <w:i/>
-                <w:iCs/>
-                <w:color w:val="2C3E50"/>
-                <w:sz w:val="21"/>
-                <w:szCs w:val="21"/>
-              </w:rPr>
-              <w:t>security</w:t>
-            </w:r>
-            <w:proofErr w:type="spellEnd"/>
+              <w:t>Code security</w:t>
+            </w:r>
             <w:r>
               <w:rPr>
                 <w:rFonts w:ascii="Arial" w:eastAsia="Arial" w:hAnsi="Arial" w:cs="Arial"/>
@@ -3879,31 +3210,7 @@
                 <w:sz w:val="21"/>
                 <w:szCs w:val="21"/>
               </w:rPr>
-              <w:t xml:space="preserve"> </w:t>
-            </w:r>
-            <w:proofErr w:type="spellStart"/>
-            <w:r>
-              <w:rPr>
-                <w:rFonts w:ascii="Arial" w:eastAsia="Arial" w:hAnsi="Arial" w:cs="Arial"/>
-                <w:b/>
-                <w:bCs/>
-                <w:color w:val="2C3E50"/>
-                <w:sz w:val="21"/>
-                <w:szCs w:val="21"/>
-              </w:rPr>
-              <w:t>Dependabot</w:t>
-            </w:r>
-            <w:proofErr w:type="spellEnd"/>
-            <w:r>
-              <w:rPr>
-                <w:rFonts w:ascii="Arial" w:eastAsia="Arial" w:hAnsi="Arial" w:cs="Arial"/>
-                <w:b/>
-                <w:bCs/>
-                <w:color w:val="2C3E50"/>
-                <w:sz w:val="21"/>
-                <w:szCs w:val="21"/>
-              </w:rPr>
-              <w:t xml:space="preserve"> </w:t>
+              <w:t xml:space="preserve"> Dependabot </w:t>
             </w:r>
             <w:r>
               <w:rPr>
@@ -3923,55 +3230,7 @@
                 <w:sz w:val="21"/>
                 <w:szCs w:val="21"/>
               </w:rPr>
-              <w:t xml:space="preserve"> </w:t>
-            </w:r>
-            <w:proofErr w:type="spellStart"/>
-            <w:r>
-              <w:rPr>
-                <w:rFonts w:ascii="Arial" w:eastAsia="Arial" w:hAnsi="Arial" w:cs="Arial"/>
-                <w:b/>
-                <w:bCs/>
-                <w:color w:val="2C3E50"/>
-                <w:sz w:val="21"/>
-                <w:szCs w:val="21"/>
-              </w:rPr>
-              <w:t>Dependabot</w:t>
-            </w:r>
-            <w:proofErr w:type="spellEnd"/>
-            <w:r>
-              <w:rPr>
-                <w:rFonts w:ascii="Arial" w:eastAsia="Arial" w:hAnsi="Arial" w:cs="Arial"/>
-                <w:b/>
-                <w:bCs/>
-                <w:color w:val="2C3E50"/>
-                <w:sz w:val="21"/>
-                <w:szCs w:val="21"/>
-              </w:rPr>
-              <w:t xml:space="preserve"> </w:t>
-            </w:r>
-            <w:proofErr w:type="spellStart"/>
-            <w:r>
-              <w:rPr>
-                <w:rFonts w:ascii="Arial" w:eastAsia="Arial" w:hAnsi="Arial" w:cs="Arial"/>
-                <w:b/>
-                <w:bCs/>
-                <w:color w:val="2C3E50"/>
-                <w:sz w:val="21"/>
-                <w:szCs w:val="21"/>
-              </w:rPr>
-              <w:t>security</w:t>
-            </w:r>
-            <w:proofErr w:type="spellEnd"/>
-            <w:r>
-              <w:rPr>
-                <w:rFonts w:ascii="Arial" w:eastAsia="Arial" w:hAnsi="Arial" w:cs="Arial"/>
-                <w:b/>
-                <w:bCs/>
-                <w:color w:val="2C3E50"/>
-                <w:sz w:val="21"/>
-                <w:szCs w:val="21"/>
-              </w:rPr>
-              <w:t xml:space="preserve"> updates.</w:t>
+              <w:t xml:space="preserve"> Dependabot security updates.</w:t>
             </w:r>
           </w:p>
           <w:p>
@@ -4007,47 +3266,7 @@
                 <w:sz w:val="21"/>
                 <w:szCs w:val="21"/>
               </w:rPr>
-              <w:t xml:space="preserve">Ele monitora as bibliotecas que você usa no portfólio (Node, Python, etc.) e cria </w:t>
-            </w:r>
-            <w:proofErr w:type="spellStart"/>
-            <w:r>
-              <w:rPr>
-                <w:rFonts w:ascii="Arial" w:eastAsia="Arial" w:hAnsi="Arial" w:cs="Arial"/>
-                <w:color w:val="2C3E50"/>
-                <w:sz w:val="21"/>
-                <w:szCs w:val="21"/>
-              </w:rPr>
-              <w:t>Pull</w:t>
-            </w:r>
-            <w:proofErr w:type="spellEnd"/>
-            <w:r>
-              <w:rPr>
-                <w:rFonts w:ascii="Arial" w:eastAsia="Arial" w:hAnsi="Arial" w:cs="Arial"/>
-                <w:color w:val="2C3E50"/>
-                <w:sz w:val="21"/>
-                <w:szCs w:val="21"/>
-              </w:rPr>
-              <w:t xml:space="preserve"> </w:t>
-            </w:r>
-            <w:proofErr w:type="spellStart"/>
-            <w:r>
-              <w:rPr>
-                <w:rFonts w:ascii="Arial" w:eastAsia="Arial" w:hAnsi="Arial" w:cs="Arial"/>
-                <w:color w:val="2C3E50"/>
-                <w:sz w:val="21"/>
-                <w:szCs w:val="21"/>
-              </w:rPr>
-              <w:t>Requests</w:t>
-            </w:r>
-            <w:proofErr w:type="spellEnd"/>
-            <w:r>
-              <w:rPr>
-                <w:rFonts w:ascii="Arial" w:eastAsia="Arial" w:hAnsi="Arial" w:cs="Arial"/>
-                <w:color w:val="2C3E50"/>
-                <w:sz w:val="21"/>
-                <w:szCs w:val="21"/>
-              </w:rPr>
-              <w:t xml:space="preserve"> automáticos para corrigir vulnerabilidades de segurança encontradas nelas.</w:t>
+              <w:t>Ele monitora as bibliotecas que você usa no portfólio (Node, Python, etc.) e cria Pull Requests automáticos para corrigir vulnerabilidades de segurança encontradas nelas.</w:t>
             </w:r>
           </w:p>
           <w:p>
@@ -4074,7 +3293,6 @@
               </w:rPr>
               <w:t>3. Proteção da Branch Principal (</w:t>
             </w:r>
-            <w:proofErr w:type="spellStart"/>
             <w:r>
               <w:rPr>
                 <w:rFonts w:ascii="Arial" w:eastAsia="Arial" w:hAnsi="Arial" w:cs="Arial"/>
@@ -4088,7 +3306,6 @@
               </w:rPr>
               <w:t>main</w:t>
             </w:r>
-            <w:proofErr w:type="spellEnd"/>
             <w:r>
               <w:rPr>
                 <w:rFonts w:ascii="Arial" w:eastAsia="Arial" w:hAnsi="Arial" w:cs="Arial"/>
@@ -4147,127 +3364,7 @@
                 <w:sz w:val="21"/>
                 <w:szCs w:val="21"/>
               </w:rPr>
-              <w:t xml:space="preserve"> Settings &gt; </w:t>
-            </w:r>
-            <w:proofErr w:type="spellStart"/>
-            <w:r>
-              <w:rPr>
-                <w:rFonts w:ascii="Arial" w:eastAsia="Arial" w:hAnsi="Arial" w:cs="Arial"/>
-                <w:b/>
-                <w:bCs/>
-                <w:color w:val="2C3E50"/>
-                <w:sz w:val="21"/>
-                <w:szCs w:val="21"/>
-              </w:rPr>
-              <w:t>Branches</w:t>
-            </w:r>
-            <w:proofErr w:type="spellEnd"/>
-            <w:r>
-              <w:rPr>
-                <w:rFonts w:ascii="Arial" w:eastAsia="Arial" w:hAnsi="Arial" w:cs="Arial"/>
-                <w:b/>
-                <w:bCs/>
-                <w:color w:val="2C3E50"/>
-                <w:sz w:val="21"/>
-                <w:szCs w:val="21"/>
-              </w:rPr>
-              <w:t xml:space="preserve"> &gt; </w:t>
-            </w:r>
-            <w:proofErr w:type="spellStart"/>
-            <w:r>
-              <w:rPr>
-                <w:rFonts w:ascii="Arial" w:eastAsia="Arial" w:hAnsi="Arial" w:cs="Arial"/>
-                <w:b/>
-                <w:bCs/>
-                <w:color w:val="2C3E50"/>
-                <w:sz w:val="21"/>
-                <w:szCs w:val="21"/>
-              </w:rPr>
-              <w:t>Add</w:t>
-            </w:r>
-            <w:proofErr w:type="spellEnd"/>
-            <w:r>
-              <w:rPr>
-                <w:rFonts w:ascii="Arial" w:eastAsia="Arial" w:hAnsi="Arial" w:cs="Arial"/>
-                <w:b/>
-                <w:bCs/>
-                <w:color w:val="2C3E50"/>
-                <w:sz w:val="21"/>
-                <w:szCs w:val="21"/>
-              </w:rPr>
-              <w:t xml:space="preserve"> </w:t>
-            </w:r>
-            <w:proofErr w:type="spellStart"/>
-            <w:r>
-              <w:rPr>
-                <w:rFonts w:ascii="Arial" w:eastAsia="Arial" w:hAnsi="Arial" w:cs="Arial"/>
-                <w:b/>
-                <w:bCs/>
-                <w:color w:val="2C3E50"/>
-                <w:sz w:val="21"/>
-                <w:szCs w:val="21"/>
-              </w:rPr>
-              <w:t>branch</w:t>
-            </w:r>
-            <w:proofErr w:type="spellEnd"/>
-            <w:r>
-              <w:rPr>
-                <w:rFonts w:ascii="Arial" w:eastAsia="Arial" w:hAnsi="Arial" w:cs="Arial"/>
-                <w:b/>
-                <w:bCs/>
-                <w:color w:val="2C3E50"/>
-                <w:sz w:val="21"/>
-                <w:szCs w:val="21"/>
-              </w:rPr>
-              <w:t xml:space="preserve"> </w:t>
-            </w:r>
-            <w:proofErr w:type="spellStart"/>
-            <w:r>
-              <w:rPr>
-                <w:rFonts w:ascii="Arial" w:eastAsia="Arial" w:hAnsi="Arial" w:cs="Arial"/>
-                <w:b/>
-                <w:bCs/>
-                <w:color w:val="2C3E50"/>
-                <w:sz w:val="21"/>
-                <w:szCs w:val="21"/>
-              </w:rPr>
-              <w:t>protection</w:t>
-            </w:r>
-            <w:proofErr w:type="spellEnd"/>
-            <w:r>
-              <w:rPr>
-                <w:rFonts w:ascii="Arial" w:eastAsia="Arial" w:hAnsi="Arial" w:cs="Arial"/>
-                <w:b/>
-                <w:bCs/>
-                <w:color w:val="2C3E50"/>
-                <w:sz w:val="21"/>
-                <w:szCs w:val="21"/>
-              </w:rPr>
-              <w:t xml:space="preserve"> </w:t>
-            </w:r>
-            <w:proofErr w:type="spellStart"/>
-            <w:r>
-              <w:rPr>
-                <w:rFonts w:ascii="Arial" w:eastAsia="Arial" w:hAnsi="Arial" w:cs="Arial"/>
-                <w:b/>
-                <w:bCs/>
-                <w:color w:val="2C3E50"/>
-                <w:sz w:val="21"/>
-                <w:szCs w:val="21"/>
-              </w:rPr>
-              <w:t>rule</w:t>
-            </w:r>
-            <w:proofErr w:type="spellEnd"/>
-            <w:r>
-              <w:rPr>
-                <w:rFonts w:ascii="Arial" w:eastAsia="Arial" w:hAnsi="Arial" w:cs="Arial"/>
-                <w:b/>
-                <w:bCs/>
-                <w:color w:val="2C3E50"/>
-                <w:sz w:val="21"/>
-                <w:szCs w:val="21"/>
-              </w:rPr>
-              <w:t xml:space="preserve">. </w:t>
+              <w:t xml:space="preserve"> Settings &gt; Branches &gt; Add branch protection rule. </w:t>
             </w:r>
             <w:r>
               <w:rPr>
@@ -4278,7 +3375,6 @@
               </w:rPr>
               <w:t xml:space="preserve">Defina o nome como </w:t>
             </w:r>
-            <w:proofErr w:type="spellStart"/>
             <w:r>
               <w:rPr>
                 <w:rFonts w:ascii="Arial" w:eastAsia="Arial" w:hAnsi="Arial" w:cs="Arial"/>
@@ -4290,7 +3386,6 @@
               </w:rPr>
               <w:t>main</w:t>
             </w:r>
-            <w:proofErr w:type="spellEnd"/>
             <w:r>
               <w:rPr>
                 <w:rFonts w:ascii="Arial" w:eastAsia="Arial" w:hAnsi="Arial" w:cs="Arial"/>
@@ -4309,103 +3404,7 @@
                 <w:sz w:val="21"/>
                 <w:szCs w:val="21"/>
               </w:rPr>
-              <w:t xml:space="preserve"> Require a </w:t>
-            </w:r>
-            <w:proofErr w:type="spellStart"/>
-            <w:r>
-              <w:rPr>
-                <w:rFonts w:ascii="Arial" w:eastAsia="Arial" w:hAnsi="Arial" w:cs="Arial"/>
-                <w:b/>
-                <w:bCs/>
-                <w:color w:val="2C3E50"/>
-                <w:sz w:val="21"/>
-                <w:szCs w:val="21"/>
-              </w:rPr>
-              <w:t>pull</w:t>
-            </w:r>
-            <w:proofErr w:type="spellEnd"/>
-            <w:r>
-              <w:rPr>
-                <w:rFonts w:ascii="Arial" w:eastAsia="Arial" w:hAnsi="Arial" w:cs="Arial"/>
-                <w:b/>
-                <w:bCs/>
-                <w:color w:val="2C3E50"/>
-                <w:sz w:val="21"/>
-                <w:szCs w:val="21"/>
-              </w:rPr>
-              <w:t xml:space="preserve"> </w:t>
-            </w:r>
-            <w:proofErr w:type="spellStart"/>
-            <w:r>
-              <w:rPr>
-                <w:rFonts w:ascii="Arial" w:eastAsia="Arial" w:hAnsi="Arial" w:cs="Arial"/>
-                <w:b/>
-                <w:bCs/>
-                <w:color w:val="2C3E50"/>
-                <w:sz w:val="21"/>
-                <w:szCs w:val="21"/>
-              </w:rPr>
-              <w:t>request</w:t>
-            </w:r>
-            <w:proofErr w:type="spellEnd"/>
-            <w:r>
-              <w:rPr>
-                <w:rFonts w:ascii="Arial" w:eastAsia="Arial" w:hAnsi="Arial" w:cs="Arial"/>
-                <w:b/>
-                <w:bCs/>
-                <w:color w:val="2C3E50"/>
-                <w:sz w:val="21"/>
-                <w:szCs w:val="21"/>
-              </w:rPr>
-              <w:t xml:space="preserve"> </w:t>
-            </w:r>
-            <w:proofErr w:type="spellStart"/>
-            <w:r>
-              <w:rPr>
-                <w:rFonts w:ascii="Arial" w:eastAsia="Arial" w:hAnsi="Arial" w:cs="Arial"/>
-                <w:b/>
-                <w:bCs/>
-                <w:color w:val="2C3E50"/>
-                <w:sz w:val="21"/>
-                <w:szCs w:val="21"/>
-              </w:rPr>
-              <w:t>before</w:t>
-            </w:r>
-            <w:proofErr w:type="spellEnd"/>
-            <w:r>
-              <w:rPr>
-                <w:rFonts w:ascii="Arial" w:eastAsia="Arial" w:hAnsi="Arial" w:cs="Arial"/>
-                <w:b/>
-                <w:bCs/>
-                <w:color w:val="2C3E50"/>
-                <w:sz w:val="21"/>
-                <w:szCs w:val="21"/>
-              </w:rPr>
-              <w:t xml:space="preserve"> </w:t>
-            </w:r>
-            <w:proofErr w:type="spellStart"/>
-            <w:r>
-              <w:rPr>
-                <w:rFonts w:ascii="Arial" w:eastAsia="Arial" w:hAnsi="Arial" w:cs="Arial"/>
-                <w:b/>
-                <w:bCs/>
-                <w:color w:val="2C3E50"/>
-                <w:sz w:val="21"/>
-                <w:szCs w:val="21"/>
-              </w:rPr>
-              <w:t>merging</w:t>
-            </w:r>
-            <w:proofErr w:type="spellEnd"/>
-            <w:r>
-              <w:rPr>
-                <w:rFonts w:ascii="Arial" w:eastAsia="Arial" w:hAnsi="Arial" w:cs="Arial"/>
-                <w:b/>
-                <w:bCs/>
-                <w:color w:val="2C3E50"/>
-                <w:sz w:val="21"/>
-                <w:szCs w:val="21"/>
-              </w:rPr>
-              <w:t>.</w:t>
+              <w:t xml:space="preserve"> Require a pull request before merging.</w:t>
             </w:r>
           </w:p>
           <w:p>
@@ -4441,47 +3440,7 @@
                 <w:sz w:val="21"/>
                 <w:szCs w:val="21"/>
               </w:rPr>
-              <w:t>Impede que você (ou terceiros) alterem o código de produção direto. Toda mudança precisará passar por um processo de revisão (</w:t>
-            </w:r>
-            <w:proofErr w:type="spellStart"/>
-            <w:r>
-              <w:rPr>
-                <w:rFonts w:ascii="Arial" w:eastAsia="Arial" w:hAnsi="Arial" w:cs="Arial"/>
-                <w:color w:val="2C3E50"/>
-                <w:sz w:val="21"/>
-                <w:szCs w:val="21"/>
-              </w:rPr>
-              <w:t>Pull</w:t>
-            </w:r>
-            <w:proofErr w:type="spellEnd"/>
-            <w:r>
-              <w:rPr>
-                <w:rFonts w:ascii="Arial" w:eastAsia="Arial" w:hAnsi="Arial" w:cs="Arial"/>
-                <w:color w:val="2C3E50"/>
-                <w:sz w:val="21"/>
-                <w:szCs w:val="21"/>
-              </w:rPr>
-              <w:t xml:space="preserve"> </w:t>
-            </w:r>
-            <w:proofErr w:type="spellStart"/>
-            <w:r>
-              <w:rPr>
-                <w:rFonts w:ascii="Arial" w:eastAsia="Arial" w:hAnsi="Arial" w:cs="Arial"/>
-                <w:color w:val="2C3E50"/>
-                <w:sz w:val="21"/>
-                <w:szCs w:val="21"/>
-              </w:rPr>
-              <w:t>Request</w:t>
-            </w:r>
-            <w:proofErr w:type="spellEnd"/>
-            <w:r>
-              <w:rPr>
-                <w:rFonts w:ascii="Arial" w:eastAsia="Arial" w:hAnsi="Arial" w:cs="Arial"/>
-                <w:color w:val="2C3E50"/>
-                <w:sz w:val="21"/>
-                <w:szCs w:val="21"/>
-              </w:rPr>
-              <w:t>).</w:t>
+              <w:t>Impede que você (ou terceiros) alterem o código de produção direto. Toda mudança precisará passar por um processo de revisão (Pull Request).</w:t>
             </w:r>
           </w:p>
           <w:p>
@@ -4555,31 +3514,7 @@
                 <w:sz w:val="21"/>
                 <w:szCs w:val="21"/>
               </w:rPr>
-              <w:t xml:space="preserve"> Settings &gt; </w:t>
-            </w:r>
-            <w:proofErr w:type="spellStart"/>
-            <w:r>
-              <w:rPr>
-                <w:rFonts w:ascii="Arial" w:eastAsia="Arial" w:hAnsi="Arial" w:cs="Arial"/>
-                <w:b/>
-                <w:bCs/>
-                <w:color w:val="2C3E50"/>
-                <w:sz w:val="21"/>
-                <w:szCs w:val="21"/>
-              </w:rPr>
-              <w:t>Collaborators</w:t>
-            </w:r>
-            <w:proofErr w:type="spellEnd"/>
-            <w:r>
-              <w:rPr>
-                <w:rFonts w:ascii="Arial" w:eastAsia="Arial" w:hAnsi="Arial" w:cs="Arial"/>
-                <w:b/>
-                <w:bCs/>
-                <w:color w:val="2C3E50"/>
-                <w:sz w:val="21"/>
-                <w:szCs w:val="21"/>
-              </w:rPr>
-              <w:t xml:space="preserve">, </w:t>
+              <w:t xml:space="preserve"> Settings &gt; Collaborators, </w:t>
             </w:r>
             <w:r>
               <w:rPr>
@@ -4709,39 +3644,8 @@
                 <w:sz w:val="21"/>
                 <w:szCs w:val="21"/>
               </w:rPr>
-              <w:t xml:space="preserve">Apagar o arquivo ou fazer um novo </w:t>
-            </w:r>
-            <w:proofErr w:type="spellStart"/>
-            <w:r>
-              <w:rPr>
-                <w:rFonts w:ascii="Arial" w:eastAsia="Arial" w:hAnsi="Arial" w:cs="Arial"/>
-                <w:color w:val="2C3E50"/>
-                <w:sz w:val="21"/>
-                <w:szCs w:val="21"/>
-              </w:rPr>
-              <w:t>commit</w:t>
-            </w:r>
-            <w:proofErr w:type="spellEnd"/>
-            <w:r>
-              <w:rPr>
-                <w:rFonts w:ascii="Arial" w:eastAsia="Arial" w:hAnsi="Arial" w:cs="Arial"/>
-                <w:color w:val="2C3E50"/>
-                <w:sz w:val="21"/>
-                <w:szCs w:val="21"/>
-              </w:rPr>
-              <w:t xml:space="preserve"> não apaga o histórico do </w:t>
-            </w:r>
-            <w:proofErr w:type="spellStart"/>
-            <w:r>
-              <w:rPr>
-                <w:rFonts w:ascii="Arial" w:eastAsia="Arial" w:hAnsi="Arial" w:cs="Arial"/>
-                <w:color w:val="2C3E50"/>
-                <w:sz w:val="21"/>
-                <w:szCs w:val="21"/>
-              </w:rPr>
-              <w:t>Git</w:t>
-            </w:r>
-            <w:proofErr w:type="spellEnd"/>
+              <w:t>Apagar o arquivo ou fazer um novo commit não apaga o histórico do Git</w:t>
+            </w:r>
             <w:r>
               <w:rPr>
                 <w:rFonts w:ascii="Arial" w:eastAsia="Arial" w:hAnsi="Arial" w:cs="Arial"/>
@@ -4798,9 +3702,17 @@
                 <w:sz w:val="21"/>
                 <w:szCs w:val="21"/>
               </w:rPr>
-              <w:t xml:space="preserve">BFG </w:t>
-            </w:r>
-            <w:proofErr w:type="spellStart"/>
+              <w:t>BFG Repo-Cleaner</w:t>
+            </w:r>
+            <w:r>
+              <w:rPr>
+                <w:rFonts w:ascii="Arial" w:eastAsia="Arial" w:hAnsi="Arial" w:cs="Arial"/>
+                <w:color w:val="2C3E50"/>
+                <w:sz w:val="21"/>
+                <w:szCs w:val="21"/>
+              </w:rPr>
+              <w:t xml:space="preserve"> ou o comando </w:t>
+            </w:r>
             <w:r>
               <w:rPr>
                 <w:rFonts w:ascii="Arial" w:eastAsia="Arial" w:hAnsi="Arial" w:cs="Arial"/>
@@ -4810,65 +3722,7 @@
                 <w:sz w:val="21"/>
                 <w:szCs w:val="21"/>
               </w:rPr>
-              <w:t>Repo-Cleaner</w:t>
-            </w:r>
-            <w:proofErr w:type="spellEnd"/>
-            <w:r>
-              <w:rPr>
-                <w:rFonts w:ascii="Arial" w:eastAsia="Arial" w:hAnsi="Arial" w:cs="Arial"/>
-                <w:color w:val="2C3E50"/>
-                <w:sz w:val="21"/>
-                <w:szCs w:val="21"/>
-              </w:rPr>
-              <w:t xml:space="preserve"> ou o comando </w:t>
-            </w:r>
-            <w:proofErr w:type="spellStart"/>
-            <w:r>
-              <w:rPr>
-                <w:rFonts w:ascii="Arial" w:eastAsia="Arial" w:hAnsi="Arial" w:cs="Arial"/>
-                <w:i/>
-                <w:iCs/>
-                <w:color w:val="2C3E50"/>
-                <w:sz w:val="21"/>
-                <w:szCs w:val="21"/>
-              </w:rPr>
-              <w:t>git</w:t>
-            </w:r>
-            <w:proofErr w:type="spellEnd"/>
-            <w:r>
-              <w:rPr>
-                <w:rFonts w:ascii="Arial" w:eastAsia="Arial" w:hAnsi="Arial" w:cs="Arial"/>
-                <w:i/>
-                <w:iCs/>
-                <w:color w:val="2C3E50"/>
-                <w:sz w:val="21"/>
-                <w:szCs w:val="21"/>
-              </w:rPr>
-              <w:t xml:space="preserve"> </w:t>
-            </w:r>
-            <w:proofErr w:type="spellStart"/>
-            <w:r>
-              <w:rPr>
-                <w:rFonts w:ascii="Arial" w:eastAsia="Arial" w:hAnsi="Arial" w:cs="Arial"/>
-                <w:i/>
-                <w:iCs/>
-                <w:color w:val="2C3E50"/>
-                <w:sz w:val="21"/>
-                <w:szCs w:val="21"/>
-              </w:rPr>
-              <w:t>filter-repo</w:t>
-            </w:r>
-            <w:proofErr w:type="spellEnd"/>
-            <w:r>
-              <w:rPr>
-                <w:rFonts w:ascii="Arial" w:eastAsia="Arial" w:hAnsi="Arial" w:cs="Arial"/>
-                <w:i/>
-                <w:iCs/>
-                <w:color w:val="2C3E50"/>
-                <w:sz w:val="21"/>
-                <w:szCs w:val="21"/>
-              </w:rPr>
-              <w:t>.</w:t>
+              <w:t>git filter-repo.</w:t>
             </w:r>
           </w:p>
           <w:p>
@@ -4978,31 +3832,7 @@
                 <w:sz w:val="22"/>
                 <w:szCs w:val="22"/>
               </w:rPr>
-              <w:t xml:space="preserve">Estou chegando ao final do meu </w:t>
-            </w:r>
-            <w:proofErr w:type="spellStart"/>
-            <w:r>
-              <w:rPr>
-                <w:rFonts w:ascii="Arial" w:eastAsia="Arial" w:hAnsi="Arial" w:cs="Arial"/>
-                <w:i/>
-                <w:iCs/>
-                <w:color w:val="1E3A5F"/>
-                <w:sz w:val="22"/>
-                <w:szCs w:val="22"/>
-              </w:rPr>
-              <w:t>Bootcamp</w:t>
-            </w:r>
-            <w:proofErr w:type="spellEnd"/>
-            <w:r>
-              <w:rPr>
-                <w:rFonts w:ascii="Arial" w:eastAsia="Arial" w:hAnsi="Arial" w:cs="Arial"/>
-                <w:i/>
-                <w:iCs/>
-                <w:color w:val="1E3A5F"/>
-                <w:sz w:val="22"/>
-                <w:szCs w:val="22"/>
-              </w:rPr>
-              <w:t xml:space="preserve"> e preciso colocar em produção o meu GitHub Pages. Quais são as diretrizes para que meu portfólio tenha impacto profissional e esteja pronto para ser apresentado a recrutadores e professores?</w:t>
+              <w:t>Estou chegando ao final do meu Bootcamp e preciso colocar em produção o meu GitHub Pages. Quais são as diretrizes para que meu portfólio tenha impacto profissional e esteja pronto para ser apresentado a recrutadores e professores?</w:t>
             </w:r>
           </w:p>
         </w:tc>
@@ -5262,67 +4092,7 @@
                 <w:sz w:val="21"/>
                 <w:szCs w:val="21"/>
               </w:rPr>
-              <w:t xml:space="preserve"> Liste as ferramentas utilizadas (</w:t>
-            </w:r>
-            <w:proofErr w:type="spellStart"/>
-            <w:r>
-              <w:rPr>
-                <w:rFonts w:ascii="Arial" w:eastAsia="Arial" w:hAnsi="Arial" w:cs="Arial"/>
-                <w:color w:val="2C3E50"/>
-                <w:sz w:val="21"/>
-                <w:szCs w:val="21"/>
-              </w:rPr>
-              <w:t>ex</w:t>
-            </w:r>
-            <w:proofErr w:type="spellEnd"/>
-            <w:r>
-              <w:rPr>
-                <w:rFonts w:ascii="Arial" w:eastAsia="Arial" w:hAnsi="Arial" w:cs="Arial"/>
-                <w:color w:val="2C3E50"/>
-                <w:sz w:val="21"/>
-                <w:szCs w:val="21"/>
-              </w:rPr>
-              <w:t xml:space="preserve">: HTML/CSS, </w:t>
-            </w:r>
-            <w:proofErr w:type="spellStart"/>
-            <w:r>
-              <w:rPr>
-                <w:rFonts w:ascii="Arial" w:eastAsia="Arial" w:hAnsi="Arial" w:cs="Arial"/>
-                <w:color w:val="2C3E50"/>
-                <w:sz w:val="21"/>
-                <w:szCs w:val="21"/>
-              </w:rPr>
-              <w:t>JavaScript</w:t>
-            </w:r>
-            <w:proofErr w:type="spellEnd"/>
-            <w:r>
-              <w:rPr>
-                <w:rFonts w:ascii="Arial" w:eastAsia="Arial" w:hAnsi="Arial" w:cs="Arial"/>
-                <w:color w:val="2C3E50"/>
-                <w:sz w:val="21"/>
-                <w:szCs w:val="21"/>
-              </w:rPr>
-              <w:t xml:space="preserve">, Python, etc.) usando </w:t>
-            </w:r>
-            <w:proofErr w:type="spellStart"/>
-            <w:r>
-              <w:rPr>
-                <w:rFonts w:ascii="Arial" w:eastAsia="Arial" w:hAnsi="Arial" w:cs="Arial"/>
-                <w:color w:val="2C3E50"/>
-                <w:sz w:val="21"/>
-                <w:szCs w:val="21"/>
-              </w:rPr>
-              <w:t>badges</w:t>
-            </w:r>
-            <w:proofErr w:type="spellEnd"/>
-            <w:r>
-              <w:rPr>
-                <w:rFonts w:ascii="Arial" w:eastAsia="Arial" w:hAnsi="Arial" w:cs="Arial"/>
-                <w:color w:val="2C3E50"/>
-                <w:sz w:val="21"/>
-                <w:szCs w:val="21"/>
-              </w:rPr>
-              <w:t xml:space="preserve"> visuais.</w:t>
+              <w:t xml:space="preserve"> Liste as ferramentas utilizadas (ex: HTML/CSS, JavaScript, Python, etc.) usando badges visuais.</w:t>
             </w:r>
           </w:p>
           <w:p>
@@ -5512,27 +4282,7 @@
                 <w:sz w:val="21"/>
                 <w:szCs w:val="21"/>
               </w:rPr>
-              <w:t xml:space="preserve"> Foque no impacto (</w:t>
-            </w:r>
-            <w:proofErr w:type="spellStart"/>
-            <w:r>
-              <w:rPr>
-                <w:rFonts w:ascii="Arial" w:eastAsia="Arial" w:hAnsi="Arial" w:cs="Arial"/>
-                <w:color w:val="2C3E50"/>
-                <w:sz w:val="21"/>
-                <w:szCs w:val="21"/>
-              </w:rPr>
-              <w:t>ex</w:t>
-            </w:r>
-            <w:proofErr w:type="spellEnd"/>
-            <w:r>
-              <w:rPr>
-                <w:rFonts w:ascii="Arial" w:eastAsia="Arial" w:hAnsi="Arial" w:cs="Arial"/>
-                <w:color w:val="2C3E50"/>
-                <w:sz w:val="21"/>
-                <w:szCs w:val="21"/>
-              </w:rPr>
-              <w:t xml:space="preserve">: </w:t>
+              <w:t xml:space="preserve"> Foque no impacto (ex: </w:t>
             </w:r>
             <w:r>
               <w:rPr>
@@ -5680,31 +4430,7 @@
                 <w:sz w:val="21"/>
                 <w:szCs w:val="21"/>
               </w:rPr>
-              <w:t>target="_</w:t>
-            </w:r>
-            <w:proofErr w:type="spellStart"/>
-            <w:r>
-              <w:rPr>
-                <w:rFonts w:ascii="Arial" w:eastAsia="Arial" w:hAnsi="Arial" w:cs="Arial"/>
-                <w:i/>
-                <w:iCs/>
-                <w:color w:val="2C3E50"/>
-                <w:sz w:val="21"/>
-                <w:szCs w:val="21"/>
-              </w:rPr>
-              <w:t>blank</w:t>
-            </w:r>
-            <w:proofErr w:type="spellEnd"/>
-            <w:r>
-              <w:rPr>
-                <w:rFonts w:ascii="Arial" w:eastAsia="Arial" w:hAnsi="Arial" w:cs="Arial"/>
-                <w:i/>
-                <w:iCs/>
-                <w:color w:val="2C3E50"/>
-                <w:sz w:val="21"/>
-                <w:szCs w:val="21"/>
-              </w:rPr>
-              <w:t>"</w:t>
+              <w:t>target="_blank"</w:t>
             </w:r>
             <w:r>
               <w:rPr>
@@ -6221,27 +4947,7 @@
                 <w:sz w:val="21"/>
                 <w:szCs w:val="21"/>
               </w:rPr>
-              <w:t xml:space="preserve"> "Olá a todos! Meu nome é Gustavo, sou estudante de Ciência de Dados e Machine Learning no CEUB. Estou concluindo o meu </w:t>
-            </w:r>
-            <w:proofErr w:type="spellStart"/>
-            <w:r>
-              <w:rPr>
-                <w:rFonts w:ascii="Arial" w:eastAsia="Arial" w:hAnsi="Arial" w:cs="Arial"/>
-                <w:color w:val="2C3E50"/>
-                <w:sz w:val="21"/>
-                <w:szCs w:val="21"/>
-              </w:rPr>
-              <w:t>Bootcamp</w:t>
-            </w:r>
-            <w:proofErr w:type="spellEnd"/>
-            <w:r>
-              <w:rPr>
-                <w:rFonts w:ascii="Arial" w:eastAsia="Arial" w:hAnsi="Arial" w:cs="Arial"/>
-                <w:color w:val="2C3E50"/>
-                <w:sz w:val="21"/>
-                <w:szCs w:val="21"/>
-              </w:rPr>
-              <w:t xml:space="preserve"> I e hoje vou apresentar o PortfolioHUB: o ecossistema digital que centraliza e demonstra os meus projetos práticos e a minha evolução técnica na área de dados."</w:t>
+              <w:t xml:space="preserve"> "Olá a todos! Meu nome é Gustavo, sou estudante de Ciência de Dados e Machine Learning no CEUB. Estou concluindo o meu Bootcamp I e hoje vou apresentar o PortfolioHUB: o ecossistema digital que centraliza e demonstra os meus projetos práticos e a minha evolução técnica na área de dados."</w:t>
             </w:r>
           </w:p>
           <w:p>
@@ -6403,38 +5109,7 @@
                 <w:sz w:val="21"/>
                 <w:szCs w:val="21"/>
               </w:rPr>
-              <w:t xml:space="preserve">Tela do código mostrando o </w:t>
-            </w:r>
-            <w:proofErr w:type="gramStart"/>
-            <w:r>
-              <w:rPr>
-                <w:rFonts w:ascii="Arial" w:eastAsia="Arial" w:hAnsi="Arial" w:cs="Arial"/>
-                <w:color w:val="2C3E50"/>
-                <w:sz w:val="21"/>
-                <w:szCs w:val="21"/>
-              </w:rPr>
-              <w:t>arquivo .</w:t>
-            </w:r>
-            <w:proofErr w:type="spellStart"/>
-            <w:r>
-              <w:rPr>
-                <w:rFonts w:ascii="Arial" w:eastAsia="Arial" w:hAnsi="Arial" w:cs="Arial"/>
-                <w:color w:val="2C3E50"/>
-                <w:sz w:val="21"/>
-                <w:szCs w:val="21"/>
-              </w:rPr>
-              <w:t>gitignore</w:t>
-            </w:r>
-            <w:proofErr w:type="spellEnd"/>
-            <w:proofErr w:type="gramEnd"/>
-            <w:r>
-              <w:rPr>
-                <w:rFonts w:ascii="Arial" w:eastAsia="Arial" w:hAnsi="Arial" w:cs="Arial"/>
-                <w:color w:val="2C3E50"/>
-                <w:sz w:val="21"/>
-                <w:szCs w:val="21"/>
-              </w:rPr>
-              <w:t xml:space="preserve"> ou as configurações de segurança do GitHub (</w:t>
+              <w:t>Tela do código mostrando o arquivo .gitignore ou as configurações de segurança do GitHub (</w:t>
             </w:r>
             <w:r>
               <w:rPr>
@@ -6445,31 +5120,7 @@
                 <w:sz w:val="21"/>
                 <w:szCs w:val="21"/>
               </w:rPr>
-              <w:t xml:space="preserve">Settings &gt; </w:t>
-            </w:r>
-            <w:proofErr w:type="spellStart"/>
-            <w:r>
-              <w:rPr>
-                <w:rFonts w:ascii="Arial" w:eastAsia="Arial" w:hAnsi="Arial" w:cs="Arial"/>
-                <w:i/>
-                <w:iCs/>
-                <w:color w:val="2C3E50"/>
-                <w:sz w:val="21"/>
-                <w:szCs w:val="21"/>
-              </w:rPr>
-              <w:t>Code</w:t>
-            </w:r>
-            <w:proofErr w:type="spellEnd"/>
-            <w:r>
-              <w:rPr>
-                <w:rFonts w:ascii="Arial" w:eastAsia="Arial" w:hAnsi="Arial" w:cs="Arial"/>
-                <w:i/>
-                <w:iCs/>
-                <w:color w:val="2C3E50"/>
-                <w:sz w:val="21"/>
-                <w:szCs w:val="21"/>
-              </w:rPr>
-              <w:t xml:space="preserve"> Security</w:t>
+              <w:t>Settings &gt; Code Security</w:t>
             </w:r>
             <w:r>
               <w:rPr>
@@ -6514,40 +5165,8 @@
                 <w:sz w:val="21"/>
                 <w:szCs w:val="21"/>
               </w:rPr>
-              <w:t xml:space="preserve">"Um portfólio público exige cuidados. Para garantir a segurança dos dados, adotei três práticas essenciais: primeiro, o uso rigoroso </w:t>
-            </w:r>
-            <w:proofErr w:type="gramStart"/>
-            <w:r>
-              <w:rPr>
-                <w:rFonts w:ascii="Arial" w:eastAsia="Arial" w:hAnsi="Arial" w:cs="Arial"/>
-                <w:color w:val="2C3E50"/>
-                <w:sz w:val="21"/>
-                <w:szCs w:val="21"/>
-              </w:rPr>
-              <w:t>do .</w:t>
-            </w:r>
-            <w:proofErr w:type="spellStart"/>
-            <w:r>
-              <w:rPr>
-                <w:rFonts w:ascii="Arial" w:eastAsia="Arial" w:hAnsi="Arial" w:cs="Arial"/>
-                <w:color w:val="2C3E50"/>
-                <w:sz w:val="21"/>
-                <w:szCs w:val="21"/>
-              </w:rPr>
-              <w:t>gitignore</w:t>
-            </w:r>
-            <w:proofErr w:type="spellEnd"/>
-            <w:proofErr w:type="gramEnd"/>
-            <w:r>
-              <w:rPr>
-                <w:rFonts w:ascii="Arial" w:eastAsia="Arial" w:hAnsi="Arial" w:cs="Arial"/>
-                <w:color w:val="2C3E50"/>
-                <w:sz w:val="21"/>
-                <w:szCs w:val="21"/>
-              </w:rPr>
-              <w:t xml:space="preserve"> para impedir o vazamento de chaves de API e arquivos de configuração local. Segundo, ativei o </w:t>
-            </w:r>
-            <w:proofErr w:type="spellStart"/>
+              <w:t xml:space="preserve">"Um portfólio público exige cuidados. Para garantir a segurança dos dados, adotei três práticas essenciais: primeiro, o uso rigoroso do .gitignore para impedir o vazamento de chaves de API e arquivos de configuração local. Segundo, ativei o </w:t>
+            </w:r>
             <w:r>
               <w:rPr>
                 <w:rFonts w:ascii="Arial" w:eastAsia="Arial" w:hAnsi="Arial" w:cs="Arial"/>
@@ -6557,9 +5176,17 @@
                 <w:sz w:val="21"/>
                 <w:szCs w:val="21"/>
               </w:rPr>
-              <w:t>Secret</w:t>
-            </w:r>
-            <w:proofErr w:type="spellEnd"/>
+              <w:t>Secret Scanning</w:t>
+            </w:r>
+            <w:r>
+              <w:rPr>
+                <w:rFonts w:ascii="Arial" w:eastAsia="Arial" w:hAnsi="Arial" w:cs="Arial"/>
+                <w:color w:val="2C3E50"/>
+                <w:sz w:val="21"/>
+                <w:szCs w:val="21"/>
+              </w:rPr>
+              <w:t xml:space="preserve"> do GitHub para bloquear qualquer credencial por acidente. E terceiro, configurei alertas do </w:t>
+            </w:r>
             <w:r>
               <w:rPr>
                 <w:rFonts w:ascii="Arial" w:eastAsia="Arial" w:hAnsi="Arial" w:cs="Arial"/>
@@ -6569,71 +5196,16 @@
                 <w:sz w:val="21"/>
                 <w:szCs w:val="21"/>
               </w:rPr>
-              <w:t xml:space="preserve"> </w:t>
-            </w:r>
-            <w:proofErr w:type="spellStart"/>
-            <w:r>
-              <w:rPr>
-                <w:rFonts w:ascii="Arial" w:eastAsia="Arial" w:hAnsi="Arial" w:cs="Arial"/>
-                <w:i/>
-                <w:iCs/>
-                <w:color w:val="2C3E50"/>
-                <w:sz w:val="21"/>
-                <w:szCs w:val="21"/>
-              </w:rPr>
-              <w:t>Scanning</w:t>
-            </w:r>
-            <w:proofErr w:type="spellEnd"/>
-            <w:r>
-              <w:rPr>
-                <w:rFonts w:ascii="Arial" w:eastAsia="Arial" w:hAnsi="Arial" w:cs="Arial"/>
-                <w:color w:val="2C3E50"/>
-                <w:sz w:val="21"/>
-                <w:szCs w:val="21"/>
-              </w:rPr>
-              <w:t xml:space="preserve"> do GitHub para bloquear qualquer credencial por acidente. E terceiro, configurei alertas do </w:t>
-            </w:r>
-            <w:proofErr w:type="spellStart"/>
-            <w:r>
-              <w:rPr>
-                <w:rFonts w:ascii="Arial" w:eastAsia="Arial" w:hAnsi="Arial" w:cs="Arial"/>
-                <w:i/>
-                <w:iCs/>
-                <w:color w:val="2C3E50"/>
-                <w:sz w:val="21"/>
-                <w:szCs w:val="21"/>
-              </w:rPr>
               <w:t>Dependabot</w:t>
             </w:r>
-            <w:proofErr w:type="spellEnd"/>
-            <w:r>
-              <w:rPr>
-                <w:rFonts w:ascii="Arial" w:eastAsia="Arial" w:hAnsi="Arial" w:cs="Arial"/>
-                <w:color w:val="2C3E50"/>
-                <w:sz w:val="21"/>
-                <w:szCs w:val="21"/>
-              </w:rPr>
-              <w:t xml:space="preserve"> para corrigir vulnerabilidades automaticamente, além de regras de proteção na </w:t>
-            </w:r>
-            <w:proofErr w:type="spellStart"/>
-            <w:r>
-              <w:rPr>
-                <w:rFonts w:ascii="Arial" w:eastAsia="Arial" w:hAnsi="Arial" w:cs="Arial"/>
-                <w:color w:val="2C3E50"/>
-                <w:sz w:val="21"/>
-                <w:szCs w:val="21"/>
-              </w:rPr>
-              <w:t>branch</w:t>
-            </w:r>
-            <w:proofErr w:type="spellEnd"/>
-            <w:r>
-              <w:rPr>
-                <w:rFonts w:ascii="Arial" w:eastAsia="Arial" w:hAnsi="Arial" w:cs="Arial"/>
-                <w:color w:val="2C3E50"/>
-                <w:sz w:val="21"/>
-                <w:szCs w:val="21"/>
-              </w:rPr>
-              <w:t xml:space="preserve"> principal."</w:t>
+            <w:r>
+              <w:rPr>
+                <w:rFonts w:ascii="Arial" w:eastAsia="Arial" w:hAnsi="Arial" w:cs="Arial"/>
+                <w:color w:val="2C3E50"/>
+                <w:sz w:val="21"/>
+                <w:szCs w:val="21"/>
+              </w:rPr>
+              <w:t xml:space="preserve"> para corrigir vulnerabilidades automaticamente, além de regras de proteção na branch principal."</w:t>
             </w:r>
           </w:p>
           <w:p>
@@ -7289,39 +5861,8 @@
           <w:sz w:val="22"/>
           <w:szCs w:val="22"/>
         </w:rPr>
-        <w:t xml:space="preserve">Criar repositório público 'PortfolioHUB' no GitHub com </w:t>
-      </w:r>
-      <w:proofErr w:type="spellStart"/>
-      <w:r>
-        <w:rPr>
-          <w:rFonts w:ascii="Arial" w:eastAsia="Arial" w:hAnsi="Arial" w:cs="Arial"/>
-          <w:color w:val="2C3E50"/>
-          <w:sz w:val="22"/>
-          <w:szCs w:val="22"/>
-        </w:rPr>
-        <w:t>branch</w:t>
-      </w:r>
-      <w:proofErr w:type="spellEnd"/>
-      <w:r>
-        <w:rPr>
-          <w:rFonts w:ascii="Arial" w:eastAsia="Arial" w:hAnsi="Arial" w:cs="Arial"/>
-          <w:color w:val="2C3E50"/>
-          <w:sz w:val="22"/>
-          <w:szCs w:val="22"/>
-        </w:rPr>
-        <w:t xml:space="preserve"> </w:t>
-      </w:r>
-      <w:proofErr w:type="spellStart"/>
-      <w:r>
-        <w:rPr>
-          <w:rFonts w:ascii="Arial" w:eastAsia="Arial" w:hAnsi="Arial" w:cs="Arial"/>
-          <w:color w:val="2C3E50"/>
-          <w:sz w:val="22"/>
-          <w:szCs w:val="22"/>
-        </w:rPr>
-        <w:t>main</w:t>
-      </w:r>
-      <w:proofErr w:type="spellEnd"/>
+        <w:t>Criar repositório público 'PortfolioHUB' no GitHub com branch main</w:t>
+      </w:r>
     </w:p>
     <w:p>
       <w:pPr>
@@ -7340,27 +5881,7 @@
           <w:sz w:val="22"/>
           <w:szCs w:val="22"/>
         </w:rPr>
-        <w:t xml:space="preserve">Organizar estrutura de pastas: site/, certificados/, documentos/, </w:t>
-      </w:r>
-      <w:proofErr w:type="spellStart"/>
-      <w:r>
-        <w:rPr>
-          <w:rFonts w:ascii="Arial" w:eastAsia="Arial" w:hAnsi="Arial" w:cs="Arial"/>
-          <w:color w:val="2C3E50"/>
-          <w:sz w:val="22"/>
-          <w:szCs w:val="22"/>
-        </w:rPr>
-        <w:t>apresentacoes</w:t>
-      </w:r>
-      <w:proofErr w:type="spellEnd"/>
-      <w:r>
-        <w:rPr>
-          <w:rFonts w:ascii="Arial" w:eastAsia="Arial" w:hAnsi="Arial" w:cs="Arial"/>
-          <w:color w:val="2C3E50"/>
-          <w:sz w:val="22"/>
-          <w:szCs w:val="22"/>
-        </w:rPr>
-        <w:t>/, projetos/</w:t>
+        <w:t>Organizar estrutura de pastas: site/, certificados/, documentos/, apresentacoes/, projetos/</w:t>
       </w:r>
     </w:p>
     <w:p>
@@ -7400,30 +5921,8 @@
           <w:sz w:val="22"/>
           <w:szCs w:val="22"/>
         </w:rPr>
-        <w:t xml:space="preserve">Criar </w:t>
-      </w:r>
-      <w:proofErr w:type="gramStart"/>
-      <w:r>
-        <w:rPr>
-          <w:rFonts w:ascii="Arial" w:eastAsia="Arial" w:hAnsi="Arial" w:cs="Arial"/>
-          <w:color w:val="2C3E50"/>
-          <w:sz w:val="22"/>
-          <w:szCs w:val="22"/>
-        </w:rPr>
-        <w:t>arquivo .</w:t>
-      </w:r>
-      <w:proofErr w:type="spellStart"/>
-      <w:r>
-        <w:rPr>
-          <w:rFonts w:ascii="Arial" w:eastAsia="Arial" w:hAnsi="Arial" w:cs="Arial"/>
-          <w:color w:val="2C3E50"/>
-          <w:sz w:val="22"/>
-          <w:szCs w:val="22"/>
-        </w:rPr>
-        <w:t>gitignore</w:t>
-      </w:r>
-      <w:proofErr w:type="spellEnd"/>
-      <w:proofErr w:type="gramEnd"/>
+        <w:t>Criar arquivo .gitignore</w:t>
+      </w:r>
     </w:p>
     <w:p>
       <w:pPr>
@@ -7442,129 +5941,7 @@
           <w:sz w:val="22"/>
           <w:szCs w:val="22"/>
         </w:rPr>
-        <w:t xml:space="preserve">Adotar convenção semântica de </w:t>
-      </w:r>
-      <w:proofErr w:type="spellStart"/>
-      <w:r>
-        <w:rPr>
-          <w:rFonts w:ascii="Arial" w:eastAsia="Arial" w:hAnsi="Arial" w:cs="Arial"/>
-          <w:color w:val="2C3E50"/>
-          <w:sz w:val="22"/>
-          <w:szCs w:val="22"/>
-        </w:rPr>
-        <w:t>commits</w:t>
-      </w:r>
-      <w:proofErr w:type="spellEnd"/>
-      <w:r>
-        <w:rPr>
-          <w:rFonts w:ascii="Arial" w:eastAsia="Arial" w:hAnsi="Arial" w:cs="Arial"/>
-          <w:color w:val="2C3E50"/>
-          <w:sz w:val="22"/>
-          <w:szCs w:val="22"/>
-        </w:rPr>
-        <w:t xml:space="preserve">: </w:t>
-      </w:r>
-      <w:proofErr w:type="gramStart"/>
-      <w:r>
-        <w:rPr>
-          <w:rFonts w:ascii="Arial" w:eastAsia="Arial" w:hAnsi="Arial" w:cs="Arial"/>
-          <w:color w:val="2C3E50"/>
-          <w:sz w:val="22"/>
-          <w:szCs w:val="22"/>
-        </w:rPr>
-        <w:t>feat:,</w:t>
-      </w:r>
-      <w:proofErr w:type="gramEnd"/>
-      <w:r>
-        <w:rPr>
-          <w:rFonts w:ascii="Arial" w:eastAsia="Arial" w:hAnsi="Arial" w:cs="Arial"/>
-          <w:color w:val="2C3E50"/>
-          <w:sz w:val="22"/>
-          <w:szCs w:val="22"/>
-        </w:rPr>
-        <w:t xml:space="preserve"> </w:t>
-      </w:r>
-      <w:proofErr w:type="spellStart"/>
-      <w:proofErr w:type="gramStart"/>
-      <w:r>
-        <w:rPr>
-          <w:rFonts w:ascii="Arial" w:eastAsia="Arial" w:hAnsi="Arial" w:cs="Arial"/>
-          <w:color w:val="2C3E50"/>
-          <w:sz w:val="22"/>
-          <w:szCs w:val="22"/>
-        </w:rPr>
-        <w:t>docs</w:t>
-      </w:r>
-      <w:proofErr w:type="spellEnd"/>
-      <w:r>
-        <w:rPr>
-          <w:rFonts w:ascii="Arial" w:eastAsia="Arial" w:hAnsi="Arial" w:cs="Arial"/>
-          <w:color w:val="2C3E50"/>
-          <w:sz w:val="22"/>
-          <w:szCs w:val="22"/>
-        </w:rPr>
-        <w:t>:,</w:t>
-      </w:r>
-      <w:proofErr w:type="gramEnd"/>
-      <w:r>
-        <w:rPr>
-          <w:rFonts w:ascii="Arial" w:eastAsia="Arial" w:hAnsi="Arial" w:cs="Arial"/>
-          <w:color w:val="2C3E50"/>
-          <w:sz w:val="22"/>
-          <w:szCs w:val="22"/>
-        </w:rPr>
-        <w:t xml:space="preserve"> </w:t>
-      </w:r>
-      <w:proofErr w:type="spellStart"/>
-      <w:proofErr w:type="gramStart"/>
-      <w:r>
-        <w:rPr>
-          <w:rFonts w:ascii="Arial" w:eastAsia="Arial" w:hAnsi="Arial" w:cs="Arial"/>
-          <w:color w:val="2C3E50"/>
-          <w:sz w:val="22"/>
-          <w:szCs w:val="22"/>
-        </w:rPr>
-        <w:t>security</w:t>
-      </w:r>
-      <w:proofErr w:type="spellEnd"/>
-      <w:r>
-        <w:rPr>
-          <w:rFonts w:ascii="Arial" w:eastAsia="Arial" w:hAnsi="Arial" w:cs="Arial"/>
-          <w:color w:val="2C3E50"/>
-          <w:sz w:val="22"/>
-          <w:szCs w:val="22"/>
-        </w:rPr>
-        <w:t>:,</w:t>
-      </w:r>
-      <w:proofErr w:type="gramEnd"/>
-      <w:r>
-        <w:rPr>
-          <w:rFonts w:ascii="Arial" w:eastAsia="Arial" w:hAnsi="Arial" w:cs="Arial"/>
-          <w:color w:val="2C3E50"/>
-          <w:sz w:val="22"/>
-          <w:szCs w:val="22"/>
-        </w:rPr>
-        <w:t xml:space="preserve"> </w:t>
-      </w:r>
-      <w:proofErr w:type="spellStart"/>
-      <w:r>
-        <w:rPr>
-          <w:rFonts w:ascii="Arial" w:eastAsia="Arial" w:hAnsi="Arial" w:cs="Arial"/>
-          <w:color w:val="2C3E50"/>
-          <w:sz w:val="22"/>
-          <w:szCs w:val="22"/>
-        </w:rPr>
-        <w:t>fix</w:t>
-      </w:r>
-      <w:proofErr w:type="spellEnd"/>
-      <w:r>
-        <w:rPr>
-          <w:rFonts w:ascii="Arial" w:eastAsia="Arial" w:hAnsi="Arial" w:cs="Arial"/>
-          <w:color w:val="2C3E50"/>
-          <w:sz w:val="22"/>
-          <w:szCs w:val="22"/>
-        </w:rPr>
-        <w:t>:</w:t>
+        <w:t>Adotar convenção semântica de commits: feat:, docs:, security:, fix:</w:t>
       </w:r>
     </w:p>
     <w:p>
@@ -7640,7 +6017,6 @@
         <w:spacing w:after="100"/>
         <w:jc w:val="both"/>
       </w:pPr>
-      <w:proofErr w:type="gramStart"/>
       <w:r>
         <w:rPr>
           <w:rFonts w:ascii="Arial" w:eastAsia="Arial" w:hAnsi="Arial" w:cs="Arial"/>
@@ -7648,99 +6024,7 @@
           <w:sz w:val="22"/>
           <w:szCs w:val="22"/>
         </w:rPr>
-        <w:t>Configurar .</w:t>
-      </w:r>
-      <w:proofErr w:type="spellStart"/>
-      <w:r>
-        <w:rPr>
-          <w:rFonts w:ascii="Arial" w:eastAsia="Arial" w:hAnsi="Arial" w:cs="Arial"/>
-          <w:color w:val="2C3E50"/>
-          <w:sz w:val="22"/>
-          <w:szCs w:val="22"/>
-        </w:rPr>
-        <w:t>gitignore</w:t>
-      </w:r>
-      <w:proofErr w:type="spellEnd"/>
-      <w:proofErr w:type="gramEnd"/>
-      <w:r>
-        <w:rPr>
-          <w:rFonts w:ascii="Arial" w:eastAsia="Arial" w:hAnsi="Arial" w:cs="Arial"/>
-          <w:color w:val="2C3E50"/>
-          <w:sz w:val="22"/>
-          <w:szCs w:val="22"/>
-        </w:rPr>
-        <w:t xml:space="preserve"> completo </w:t>
-      </w:r>
-      <w:proofErr w:type="gramStart"/>
-      <w:r>
-        <w:rPr>
-          <w:rFonts w:ascii="Arial" w:eastAsia="Arial" w:hAnsi="Arial" w:cs="Arial"/>
-          <w:color w:val="2C3E50"/>
-          <w:sz w:val="22"/>
-          <w:szCs w:val="22"/>
-        </w:rPr>
-        <w:t>protegendo .</w:t>
-      </w:r>
-      <w:proofErr w:type="spellStart"/>
-      <w:r>
-        <w:rPr>
-          <w:rFonts w:ascii="Arial" w:eastAsia="Arial" w:hAnsi="Arial" w:cs="Arial"/>
-          <w:color w:val="2C3E50"/>
-          <w:sz w:val="22"/>
-          <w:szCs w:val="22"/>
-        </w:rPr>
-        <w:t>env</w:t>
-      </w:r>
-      <w:proofErr w:type="spellEnd"/>
-      <w:proofErr w:type="gramEnd"/>
-      <w:r>
-        <w:rPr>
-          <w:rFonts w:ascii="Arial" w:eastAsia="Arial" w:hAnsi="Arial" w:cs="Arial"/>
-          <w:color w:val="2C3E50"/>
-          <w:sz w:val="22"/>
-          <w:szCs w:val="22"/>
-        </w:rPr>
-        <w:t>, *.</w:t>
-      </w:r>
-      <w:proofErr w:type="spellStart"/>
-      <w:r>
-        <w:rPr>
-          <w:rFonts w:ascii="Arial" w:eastAsia="Arial" w:hAnsi="Arial" w:cs="Arial"/>
-          <w:color w:val="2C3E50"/>
-          <w:sz w:val="22"/>
-          <w:szCs w:val="22"/>
-        </w:rPr>
-        <w:t>pem</w:t>
-      </w:r>
-      <w:proofErr w:type="spellEnd"/>
-      <w:r>
-        <w:rPr>
-          <w:rFonts w:ascii="Arial" w:eastAsia="Arial" w:hAnsi="Arial" w:cs="Arial"/>
-          <w:color w:val="2C3E50"/>
-          <w:sz w:val="22"/>
-          <w:szCs w:val="22"/>
-        </w:rPr>
-        <w:t>, *.</w:t>
-      </w:r>
-      <w:proofErr w:type="spellStart"/>
-      <w:r>
-        <w:rPr>
-          <w:rFonts w:ascii="Arial" w:eastAsia="Arial" w:hAnsi="Arial" w:cs="Arial"/>
-          <w:color w:val="2C3E50"/>
-          <w:sz w:val="22"/>
-          <w:szCs w:val="22"/>
-        </w:rPr>
-        <w:t>key</w:t>
-      </w:r>
-      <w:proofErr w:type="spellEnd"/>
-      <w:r>
-        <w:rPr>
-          <w:rFonts w:ascii="Arial" w:eastAsia="Arial" w:hAnsi="Arial" w:cs="Arial"/>
-          <w:color w:val="2C3E50"/>
-          <w:sz w:val="22"/>
-          <w:szCs w:val="22"/>
-        </w:rPr>
-        <w:t xml:space="preserve"> e arquivos de sistema</w:t>
+        <w:t>Configurar .gitignore completo protegendo .env, *.pem, *.key e arquivos de sistema</w:t>
       </w:r>
     </w:p>
     <w:p>
@@ -7780,27 +6064,7 @@
           <w:sz w:val="22"/>
           <w:szCs w:val="22"/>
         </w:rPr>
-        <w:t xml:space="preserve">Ativar </w:t>
-      </w:r>
-      <w:proofErr w:type="spellStart"/>
-      <w:r>
-        <w:rPr>
-          <w:rFonts w:ascii="Arial" w:eastAsia="Arial" w:hAnsi="Arial" w:cs="Arial"/>
-          <w:color w:val="2C3E50"/>
-          <w:sz w:val="22"/>
-          <w:szCs w:val="22"/>
-        </w:rPr>
-        <w:t>Dependabot</w:t>
-      </w:r>
-      <w:proofErr w:type="spellEnd"/>
-      <w:r>
-        <w:rPr>
-          <w:rFonts w:ascii="Arial" w:eastAsia="Arial" w:hAnsi="Arial" w:cs="Arial"/>
-          <w:color w:val="2C3E50"/>
-          <w:sz w:val="22"/>
-          <w:szCs w:val="22"/>
-        </w:rPr>
-        <w:t xml:space="preserve"> Alerts nas configurações de segurança do repositório</w:t>
+        <w:t>Ativar Dependabot Alerts nas configurações de segurança do repositório</w:t>
       </w:r>
     </w:p>
     <w:p>
@@ -7820,19 +6084,8 @@
           <w:sz w:val="22"/>
           <w:szCs w:val="22"/>
         </w:rPr>
-        <w:t xml:space="preserve">Verificar que nenhum dado sensível está no histórico de </w:t>
-      </w:r>
-      <w:proofErr w:type="spellStart"/>
-      <w:r>
-        <w:rPr>
-          <w:rFonts w:ascii="Arial" w:eastAsia="Arial" w:hAnsi="Arial" w:cs="Arial"/>
-          <w:color w:val="2C3E50"/>
-          <w:sz w:val="22"/>
-          <w:szCs w:val="22"/>
-        </w:rPr>
-        <w:t>commits</w:t>
-      </w:r>
-      <w:proofErr w:type="spellEnd"/>
+        <w:t>Verificar que nenhum dado sensível está no histórico de commits</w:t>
+      </w:r>
     </w:p>
     <w:p>
       <w:pPr>
@@ -7847,7 +6100,6 @@
           <w:lang w:val="en-US"/>
         </w:rPr>
       </w:pPr>
-      <w:proofErr w:type="spellStart"/>
       <w:r>
         <w:rPr>
           <w:rFonts w:ascii="Arial" w:eastAsia="Arial" w:hAnsi="Arial" w:cs="Arial"/>
@@ -7856,40 +6108,7 @@
           <w:szCs w:val="22"/>
           <w:lang w:val="en-US"/>
         </w:rPr>
-        <w:t>Ativar</w:t>
-      </w:r>
-      <w:proofErr w:type="spellEnd"/>
-      <w:r>
-        <w:rPr>
-          <w:rFonts w:ascii="Arial" w:eastAsia="Arial" w:hAnsi="Arial" w:cs="Arial"/>
-          <w:color w:val="2C3E50"/>
-          <w:sz w:val="22"/>
-          <w:szCs w:val="22"/>
-          <w:lang w:val="en-US"/>
-        </w:rPr>
-        <w:t xml:space="preserve"> Branch Protection </w:t>
-      </w:r>
-      <w:proofErr w:type="spellStart"/>
-      <w:r>
-        <w:rPr>
-          <w:rFonts w:ascii="Arial" w:eastAsia="Arial" w:hAnsi="Arial" w:cs="Arial"/>
-          <w:color w:val="2C3E50"/>
-          <w:sz w:val="22"/>
-          <w:szCs w:val="22"/>
-          <w:lang w:val="en-US"/>
-        </w:rPr>
-        <w:t>na</w:t>
-      </w:r>
-      <w:proofErr w:type="spellEnd"/>
-      <w:r>
-        <w:rPr>
-          <w:rFonts w:ascii="Arial" w:eastAsia="Arial" w:hAnsi="Arial" w:cs="Arial"/>
-          <w:color w:val="2C3E50"/>
-          <w:sz w:val="22"/>
-          <w:szCs w:val="22"/>
-          <w:lang w:val="en-US"/>
-        </w:rPr>
-        <w:t xml:space="preserve"> branch main</w:t>
+        <w:t>Ativar Branch Protection na branch main</w:t>
       </w:r>
     </w:p>
     <w:p>
@@ -7935,47 +6154,7 @@
           <w:sz w:val="22"/>
           <w:szCs w:val="22"/>
         </w:rPr>
-        <w:t xml:space="preserve">Configurar GitHub Pages na </w:t>
-      </w:r>
-      <w:proofErr w:type="spellStart"/>
-      <w:r>
-        <w:rPr>
-          <w:rFonts w:ascii="Arial" w:eastAsia="Arial" w:hAnsi="Arial" w:cs="Arial"/>
-          <w:color w:val="2C3E50"/>
-          <w:sz w:val="22"/>
-          <w:szCs w:val="22"/>
-        </w:rPr>
-        <w:t>branch</w:t>
-      </w:r>
-      <w:proofErr w:type="spellEnd"/>
-      <w:r>
-        <w:rPr>
-          <w:rFonts w:ascii="Arial" w:eastAsia="Arial" w:hAnsi="Arial" w:cs="Arial"/>
-          <w:color w:val="2C3E50"/>
-          <w:sz w:val="22"/>
-          <w:szCs w:val="22"/>
-        </w:rPr>
-        <w:t xml:space="preserve"> </w:t>
-      </w:r>
-      <w:proofErr w:type="spellStart"/>
-      <w:r>
-        <w:rPr>
-          <w:rFonts w:ascii="Arial" w:eastAsia="Arial" w:hAnsi="Arial" w:cs="Arial"/>
-          <w:color w:val="2C3E50"/>
-          <w:sz w:val="22"/>
-          <w:szCs w:val="22"/>
-        </w:rPr>
-        <w:t>main</w:t>
-      </w:r>
-      <w:proofErr w:type="spellEnd"/>
-      <w:r>
-        <w:rPr>
-          <w:rFonts w:ascii="Arial" w:eastAsia="Arial" w:hAnsi="Arial" w:cs="Arial"/>
-          <w:color w:val="2C3E50"/>
-          <w:sz w:val="22"/>
-          <w:szCs w:val="22"/>
-        </w:rPr>
-        <w:t>, pasta raiz (/)</w:t>
+        <w:t>Configurar GitHub Pages na branch main, pasta raiz (/)</w:t>
       </w:r>
     </w:p>
     <w:p>
@@ -7995,47 +6174,7 @@
           <w:sz w:val="22"/>
           <w:szCs w:val="22"/>
         </w:rPr>
-        <w:t xml:space="preserve">Definir níveis de acesso: </w:t>
-      </w:r>
-      <w:proofErr w:type="spellStart"/>
-      <w:r>
-        <w:rPr>
-          <w:rFonts w:ascii="Arial" w:eastAsia="Arial" w:hAnsi="Arial" w:cs="Arial"/>
-          <w:color w:val="2C3E50"/>
-          <w:sz w:val="22"/>
-          <w:szCs w:val="22"/>
-        </w:rPr>
-        <w:t>Owner</w:t>
-      </w:r>
-      <w:proofErr w:type="spellEnd"/>
-      <w:r>
-        <w:rPr>
-          <w:rFonts w:ascii="Arial" w:eastAsia="Arial" w:hAnsi="Arial" w:cs="Arial"/>
-          <w:color w:val="2C3E50"/>
-          <w:sz w:val="22"/>
-          <w:szCs w:val="22"/>
-        </w:rPr>
-        <w:t xml:space="preserve"> (estudante) com escrita, </w:t>
-      </w:r>
-      <w:proofErr w:type="spellStart"/>
-      <w:r>
-        <w:rPr>
-          <w:rFonts w:ascii="Arial" w:eastAsia="Arial" w:hAnsi="Arial" w:cs="Arial"/>
-          <w:color w:val="2C3E50"/>
-          <w:sz w:val="22"/>
-          <w:szCs w:val="22"/>
-        </w:rPr>
-        <w:t>Read</w:t>
-      </w:r>
-      <w:proofErr w:type="spellEnd"/>
-      <w:r>
-        <w:rPr>
-          <w:rFonts w:ascii="Arial" w:eastAsia="Arial" w:hAnsi="Arial" w:cs="Arial"/>
-          <w:color w:val="2C3E50"/>
-          <w:sz w:val="22"/>
-          <w:szCs w:val="22"/>
-        </w:rPr>
-        <w:t xml:space="preserve"> para visitantes públicos</w:t>
+        <w:t>Definir níveis de acesso: Owner (estudante) com escrita, Read para visitantes públicos</w:t>
       </w:r>
     </w:p>
     <w:p>
@@ -8075,27 +6214,7 @@
           <w:sz w:val="22"/>
           <w:szCs w:val="22"/>
         </w:rPr>
-        <w:t xml:space="preserve">Usar histórico de </w:t>
-      </w:r>
-      <w:proofErr w:type="spellStart"/>
-      <w:r>
-        <w:rPr>
-          <w:rFonts w:ascii="Arial" w:eastAsia="Arial" w:hAnsi="Arial" w:cs="Arial"/>
-          <w:color w:val="2C3E50"/>
-          <w:sz w:val="22"/>
-          <w:szCs w:val="22"/>
-        </w:rPr>
-        <w:t>commits</w:t>
-      </w:r>
-      <w:proofErr w:type="spellEnd"/>
-      <w:r>
-        <w:rPr>
-          <w:rFonts w:ascii="Arial" w:eastAsia="Arial" w:hAnsi="Arial" w:cs="Arial"/>
-          <w:color w:val="2C3E50"/>
-          <w:sz w:val="22"/>
-          <w:szCs w:val="22"/>
-        </w:rPr>
-        <w:t xml:space="preserve"> como rastreabilidade de todas as alterações</w:t>
+        <w:t>Usar histórico de commits como rastreabilidade de todas as alterações</w:t>
       </w:r>
     </w:p>
     <w:p>
@@ -8258,39 +6377,8 @@
           <w:sz w:val="22"/>
           <w:szCs w:val="22"/>
         </w:rPr>
-        <w:t xml:space="preserve">Atualizar habilidades com: </w:t>
-      </w:r>
-      <w:proofErr w:type="spellStart"/>
-      <w:r>
-        <w:rPr>
-          <w:rFonts w:ascii="Arial" w:eastAsia="Arial" w:hAnsi="Arial" w:cs="Arial"/>
-          <w:color w:val="2C3E50"/>
-          <w:sz w:val="22"/>
-          <w:szCs w:val="22"/>
-        </w:rPr>
-        <w:t>Git</w:t>
-      </w:r>
-      <w:proofErr w:type="spellEnd"/>
-      <w:r>
-        <w:rPr>
-          <w:rFonts w:ascii="Arial" w:eastAsia="Arial" w:hAnsi="Arial" w:cs="Arial"/>
-          <w:color w:val="2C3E50"/>
-          <w:sz w:val="22"/>
-          <w:szCs w:val="22"/>
-        </w:rPr>
-        <w:t xml:space="preserve">, GitHub, GitHub Pages, HTML, CSS, </w:t>
-      </w:r>
-      <w:proofErr w:type="spellStart"/>
-      <w:r>
-        <w:rPr>
-          <w:rFonts w:ascii="Arial" w:eastAsia="Arial" w:hAnsi="Arial" w:cs="Arial"/>
-          <w:color w:val="2C3E50"/>
-          <w:sz w:val="22"/>
-          <w:szCs w:val="22"/>
-        </w:rPr>
-        <w:t>JavaScript</w:t>
-      </w:r>
-      <w:proofErr w:type="spellEnd"/>
+        <w:t>Atualizar habilidades com: Git, GitHub, GitHub Pages, HTML, CSS, JavaScript</w:t>
+      </w:r>
     </w:p>
     <w:p>
       <w:pPr>
@@ -8353,27 +6441,7 @@
           <w:szCs w:val="22"/>
         </w:rPr>
         <w:lastRenderedPageBreak/>
-        <w:t xml:space="preserve">Verificar responsividade com </w:t>
-      </w:r>
-      <w:proofErr w:type="spellStart"/>
-      <w:r>
-        <w:rPr>
-          <w:rFonts w:ascii="Arial" w:eastAsia="Arial" w:hAnsi="Arial" w:cs="Arial"/>
-          <w:color w:val="2C3E50"/>
-          <w:sz w:val="22"/>
-          <w:szCs w:val="22"/>
-        </w:rPr>
-        <w:t>DevTools</w:t>
-      </w:r>
-      <w:proofErr w:type="spellEnd"/>
-      <w:r>
-        <w:rPr>
-          <w:rFonts w:ascii="Arial" w:eastAsia="Arial" w:hAnsi="Arial" w:cs="Arial"/>
-          <w:color w:val="2C3E50"/>
-          <w:sz w:val="22"/>
-          <w:szCs w:val="22"/>
-        </w:rPr>
-        <w:t xml:space="preserve"> (F12) em telas de 360px a 1920px</w:t>
+        <w:t>Verificar responsividade com DevTools (F12) em telas de 360px a 1920px</w:t>
       </w:r>
     </w:p>
     <w:p>
@@ -8485,7 +6553,7 @@
     <w:tbl>
       <w:tblPr>
         <w:tblStyle w:val="TableNormal"/>
-        <w:tblW w:w="9360" w:type="dxa"/>
+        <w:tblW w:w="9776" w:type="dxa"/>
         <w:tblBorders>
           <w:top w:val="single" w:sz="4" w:space="0" w:color="auto"/>
           <w:left w:val="single" w:sz="4" w:space="0" w:color="auto"/>
@@ -8494,6 +6562,7 @@
           <w:insideH w:val="single" w:sz="4" w:space="0" w:color="auto"/>
           <w:insideV w:val="single" w:sz="4" w:space="0" w:color="auto"/>
         </w:tblBorders>
+        <w:tblLayout w:type="fixed"/>
         <w:tblCellMar>
           <w:left w:w="10" w:type="dxa"/>
           <w:right w:w="10" w:type="dxa"/>
@@ -8501,16 +6570,17 @@
         <w:tblLook w:val="0000" w:firstRow="0" w:lastRow="0" w:firstColumn="0" w:lastColumn="0" w:noHBand="0" w:noVBand="0"/>
       </w:tblPr>
       <w:tblGrid>
-        <w:gridCol w:w="2500"/>
-        <w:gridCol w:w="6860"/>
+        <w:gridCol w:w="2689"/>
+        <w:gridCol w:w="7087"/>
       </w:tblGrid>
       <w:tr>
         <w:trPr>
+          <w:trHeight w:val="398"/>
           <w:tblHeader/>
         </w:trPr>
         <w:tc>
           <w:tcPr>
-            <w:tcW w:w="2500" w:type="dxa"/>
+            <w:tcW w:w="2689" w:type="dxa"/>
             <w:shd w:val="clear" w:color="auto" w:fill="6B48FF"/>
             <w:tcMar>
               <w:top w:w="100" w:type="dxa"/>
@@ -8538,7 +6608,7 @@
         </w:tc>
         <w:tc>
           <w:tcPr>
-            <w:tcW w:w="6860" w:type="dxa"/>
+            <w:tcW w:w="7087" w:type="dxa"/>
             <w:shd w:val="clear" w:color="auto" w:fill="6B48FF"/>
             <w:tcMar>
               <w:top w:w="100" w:type="dxa"/>
@@ -8566,9 +6636,12 @@
         </w:tc>
       </w:tr>
       <w:tr>
+        <w:trPr>
+          <w:trHeight w:val="353"/>
+        </w:trPr>
         <w:tc>
           <w:tcPr>
-            <w:tcW w:w="2500" w:type="dxa"/>
+            <w:tcW w:w="2689" w:type="dxa"/>
             <w:shd w:val="clear" w:color="auto" w:fill="FFFFFF"/>
             <w:tcMar>
               <w:top w:w="80" w:type="dxa"/>
@@ -8594,7 +6667,7 @@
         </w:tc>
         <w:tc>
           <w:tcPr>
-            <w:tcW w:w="6860" w:type="dxa"/>
+            <w:tcW w:w="7087" w:type="dxa"/>
             <w:shd w:val="clear" w:color="auto" w:fill="FFFFFF"/>
             <w:tcMar>
               <w:top w:w="80" w:type="dxa"/>
@@ -8620,9 +6693,12 @@
         </w:tc>
       </w:tr>
       <w:tr>
+        <w:trPr>
+          <w:trHeight w:val="353"/>
+        </w:trPr>
         <w:tc>
           <w:tcPr>
-            <w:tcW w:w="2500" w:type="dxa"/>
+            <w:tcW w:w="2689" w:type="dxa"/>
             <w:shd w:val="clear" w:color="auto" w:fill="F3F0FF"/>
             <w:tcMar>
               <w:top w:w="80" w:type="dxa"/>
@@ -8648,7 +6724,7 @@
         </w:tc>
         <w:tc>
           <w:tcPr>
-            <w:tcW w:w="6860" w:type="dxa"/>
+            <w:tcW w:w="7087" w:type="dxa"/>
             <w:shd w:val="clear" w:color="auto" w:fill="F3F0FF"/>
             <w:tcMar>
               <w:top w:w="80" w:type="dxa"/>
@@ -8674,54 +6750,12 @@
         </w:tc>
       </w:tr>
       <w:tr>
+        <w:trPr>
+          <w:trHeight w:val="353"/>
+        </w:trPr>
         <w:tc>
           <w:tcPr>
-            <w:tcW w:w="2500" w:type="dxa"/>
-            <w:shd w:val="clear" w:color="auto" w:fill="FFFFFF"/>
-            <w:tcMar>
-              <w:top w:w="80" w:type="dxa"/>
-              <w:left w:w="150" w:type="dxa"/>
-              <w:bottom w:w="80" w:type="dxa"/>
-              <w:right w:w="150" w:type="dxa"/>
-            </w:tcMar>
-          </w:tcPr>
-          <w:p>
-            <w:pPr>
-              <w:jc w:val="both"/>
-            </w:pPr>
-            <w:r>
-              <w:rPr>
-                <w:rFonts w:ascii="Arial" w:eastAsia="Arial" w:hAnsi="Arial" w:cs="Arial"/>
-                <w:b/>
-                <w:bCs/>
-                <w:color w:val="1E3A5F"/>
-              </w:rPr>
-              <w:t>Plano de Implantação</w:t>
-            </w:r>
-          </w:p>
-        </w:tc>
-        <w:tc>
-          <w:tcPr>
-            <w:tcW w:w="6860" w:type="dxa"/>
-            <w:shd w:val="clear" w:color="auto" w:fill="FFFFFF"/>
-            <w:tcMar>
-              <w:top w:w="80" w:type="dxa"/>
-              <w:left w:w="150" w:type="dxa"/>
-              <w:bottom w:w="80" w:type="dxa"/>
-              <w:right w:w="150" w:type="dxa"/>
-            </w:tcMar>
-          </w:tcPr>
-          <w:p>
-            <w:pPr>
-              <w:jc w:val="both"/>
-            </w:pPr>
-          </w:p>
-        </w:tc>
-      </w:tr>
-      <w:tr>
-        <w:tc>
-          <w:tcPr>
-            <w:tcW w:w="2500" w:type="dxa"/>
+            <w:tcW w:w="2689" w:type="dxa"/>
             <w:shd w:val="clear" w:color="auto" w:fill="F3F0FF"/>
             <w:tcMar>
               <w:top w:w="80" w:type="dxa"/>
@@ -8747,7 +6781,7 @@
         </w:tc>
         <w:tc>
           <w:tcPr>
-            <w:tcW w:w="6860" w:type="dxa"/>
+            <w:tcW w:w="7087" w:type="dxa"/>
             <w:shd w:val="clear" w:color="auto" w:fill="F3F0FF"/>
             <w:tcMar>
               <w:top w:w="80" w:type="dxa"/>
@@ -8773,9 +6807,12 @@
         </w:tc>
       </w:tr>
       <w:tr>
+        <w:trPr>
+          <w:trHeight w:val="353"/>
+        </w:trPr>
         <w:tc>
           <w:tcPr>
-            <w:tcW w:w="2500" w:type="dxa"/>
+            <w:tcW w:w="2689" w:type="dxa"/>
             <w:shd w:val="clear" w:color="auto" w:fill="FFFFFF"/>
             <w:tcMar>
               <w:top w:w="80" w:type="dxa"/>
@@ -8801,7 +6838,7 @@
         </w:tc>
         <w:tc>
           <w:tcPr>
-            <w:tcW w:w="6860" w:type="dxa"/>
+            <w:tcW w:w="7087" w:type="dxa"/>
             <w:shd w:val="clear" w:color="auto" w:fill="FFFFFF"/>
             <w:tcMar>
               <w:top w:w="80" w:type="dxa"/>
@@ -9020,7 +7057,6 @@
       <w:pPr>
         <w:jc w:val="center"/>
       </w:pPr>
-      <w:proofErr w:type="spellStart"/>
       <w:r>
         <w:rPr>
           <w:rFonts w:ascii="Arial" w:eastAsia="Arial" w:hAnsi="Arial" w:cs="Arial"/>
@@ -9028,17 +7064,7 @@
           <w:sz w:val="18"/>
           <w:szCs w:val="18"/>
         </w:rPr>
-        <w:t>Bootcamp</w:t>
-      </w:r>
-      <w:proofErr w:type="spellEnd"/>
-      <w:r>
-        <w:rPr>
-          <w:rFonts w:ascii="Arial" w:eastAsia="Arial" w:hAnsi="Arial" w:cs="Arial"/>
-          <w:color w:val="666666"/>
-          <w:sz w:val="18"/>
-          <w:szCs w:val="18"/>
-        </w:rPr>
-        <w:t xml:space="preserve"> I — CEUB 2026 | © Gustavo Lisboa Gonçalves</w:t>
+        <w:t>Bootcamp I — CEUB 2026 | © Gustavo Lisboa Gonçalves</w:t>
       </w:r>
     </w:p>
     <w:sectPr>
@@ -9097,6 +7123,7 @@
         <w:docPartUnique/>
       </w:docPartObj>
     </w:sdtPr>
+    <w:sdtEndPr/>
     <w:sdtContent>
       <w:p>
         <w:pPr>

</xml_diff>

<commit_message>
adicionei o nome do professor
</commit_message>
<xml_diff>
--- a/PlanoImplantacao_PortfolioHUB_GustavoLisboa.docx
+++ b/PlanoImplantacao_PortfolioHUB_GustavoLisboa.docx
@@ -24,6 +24,7 @@
         <w:spacing w:after="100"/>
         <w:jc w:val="center"/>
       </w:pPr>
+      <w:proofErr w:type="spellStart"/>
       <w:r>
         <w:rPr>
           <w:rFonts w:ascii="Arial" w:eastAsia="Arial" w:hAnsi="Arial" w:cs="Arial"/>
@@ -31,7 +32,17 @@
           <w:sz w:val="36"/>
           <w:szCs w:val="36"/>
         </w:rPr>
-        <w:t>PortfolioHUB + IA Generativa</w:t>
+        <w:t>PortfolioHUB</w:t>
+      </w:r>
+      <w:proofErr w:type="spellEnd"/>
+      <w:r>
+        <w:rPr>
+          <w:rFonts w:ascii="Arial" w:eastAsia="Arial" w:hAnsi="Arial" w:cs="Arial"/>
+          <w:color w:val="1E3A5F"/>
+          <w:sz w:val="36"/>
+          <w:szCs w:val="36"/>
+        </w:rPr>
+        <w:t xml:space="preserve"> + IA Generativa</w:t>
       </w:r>
     </w:p>
     <w:p>
@@ -144,8 +155,6 @@
       <w:pPr>
         <w:spacing w:after="100"/>
         <w:jc w:val="center"/>
-      </w:pPr>
-      <w:r>
         <w:rPr>
           <w:rFonts w:ascii="Arial" w:eastAsia="Arial" w:hAnsi="Arial" w:cs="Arial"/>
           <w:b/>
@@ -154,7 +163,55 @@
           <w:sz w:val="28"/>
           <w:szCs w:val="28"/>
         </w:rPr>
+      </w:pPr>
+      <w:r>
+        <w:rPr>
+          <w:rFonts w:ascii="Arial" w:eastAsia="Arial" w:hAnsi="Arial" w:cs="Arial"/>
+          <w:b/>
+          <w:bCs/>
+          <w:color w:val="1E3A5F"/>
+          <w:sz w:val="28"/>
+          <w:szCs w:val="28"/>
+        </w:rPr>
+        <w:t xml:space="preserve">Estudante: </w:t>
+      </w:r>
+      <w:r>
+        <w:rPr>
+          <w:rFonts w:ascii="Arial" w:eastAsia="Arial" w:hAnsi="Arial" w:cs="Arial"/>
+          <w:color w:val="1E3A5F"/>
+          <w:sz w:val="28"/>
+          <w:szCs w:val="28"/>
+        </w:rPr>
         <w:t>Gustavo Lisboa Gonçalves</w:t>
+      </w:r>
+    </w:p>
+    <w:p>
+      <w:pPr>
+        <w:spacing w:after="100"/>
+        <w:jc w:val="center"/>
+        <w:rPr>
+          <w:rFonts w:ascii="Arial" w:hAnsi="Arial" w:cs="Arial"/>
+          <w:sz w:val="24"/>
+          <w:szCs w:val="24"/>
+        </w:rPr>
+      </w:pPr>
+      <w:r>
+        <w:rPr>
+          <w:rFonts w:ascii="Arial" w:hAnsi="Arial" w:cs="Arial"/>
+          <w:b/>
+          <w:bCs/>
+          <w:sz w:val="24"/>
+          <w:szCs w:val="24"/>
+        </w:rPr>
+        <w:t>Professor:</w:t>
+      </w:r>
+      <w:r>
+        <w:rPr>
+          <w:rFonts w:ascii="Arial" w:hAnsi="Arial" w:cs="Arial"/>
+          <w:sz w:val="24"/>
+          <w:szCs w:val="24"/>
+        </w:rPr>
+        <w:t xml:space="preserve"> Marcelo Carboni Gomes</w:t>
       </w:r>
     </w:p>
     <w:p>
@@ -214,7 +271,27 @@
           <w:sz w:val="22"/>
           <w:szCs w:val="22"/>
         </w:rPr>
-        <w:t>Entrega Final — Bootcamp I | Prazo: 14/06/2026</w:t>
+        <w:t xml:space="preserve">Entrega Final — </w:t>
+      </w:r>
+      <w:proofErr w:type="spellStart"/>
+      <w:r>
+        <w:rPr>
+          <w:rFonts w:ascii="Arial" w:eastAsia="Arial" w:hAnsi="Arial" w:cs="Arial"/>
+          <w:color w:val="666666"/>
+          <w:sz w:val="22"/>
+          <w:szCs w:val="22"/>
+        </w:rPr>
+        <w:t>Bootcamp</w:t>
+      </w:r>
+      <w:proofErr w:type="spellEnd"/>
+      <w:r>
+        <w:rPr>
+          <w:rFonts w:ascii="Arial" w:eastAsia="Arial" w:hAnsi="Arial" w:cs="Arial"/>
+          <w:color w:val="666666"/>
+          <w:sz w:val="22"/>
+          <w:szCs w:val="22"/>
+        </w:rPr>
+        <w:t xml:space="preserve"> I | Prazo: 14/06/2026</w:t>
       </w:r>
     </w:p>
     <w:p>
@@ -225,10 +302,8 @@
     </w:p>
     <w:p>
       <w:pPr>
-        <w:pBdr>
-          <w:bottom w:val="single" w:sz="6" w:space="0" w:color="6B48FF"/>
-        </w:pBdr>
-        <w:spacing w:before="240" w:after="240"/>
+        <w:spacing w:after="80"/>
+        <w:jc w:val="center"/>
       </w:pPr>
     </w:p>
     <w:p>
@@ -1119,7 +1194,47 @@
           <w:sz w:val="22"/>
           <w:szCs w:val="22"/>
         </w:rPr>
-        <w:t>O PortfolioHUB é um portfólio digital profissional desenvolvido ao longo do Bootcamp I do CEUB, com o objetivo de centralizar e apresentar a trajetória acadêmica, projetos e certificações de Gustavo Lisboa Gonçalves, estudante de Ciência de Dados e Machine Learning.</w:t>
+        <w:t xml:space="preserve">O </w:t>
+      </w:r>
+      <w:proofErr w:type="spellStart"/>
+      <w:r>
+        <w:rPr>
+          <w:rFonts w:ascii="Arial" w:eastAsia="Arial" w:hAnsi="Arial" w:cs="Arial"/>
+          <w:color w:val="2C3E50"/>
+          <w:sz w:val="22"/>
+          <w:szCs w:val="22"/>
+        </w:rPr>
+        <w:t>PortfolioHUB</w:t>
+      </w:r>
+      <w:proofErr w:type="spellEnd"/>
+      <w:r>
+        <w:rPr>
+          <w:rFonts w:ascii="Arial" w:eastAsia="Arial" w:hAnsi="Arial" w:cs="Arial"/>
+          <w:color w:val="2C3E50"/>
+          <w:sz w:val="22"/>
+          <w:szCs w:val="22"/>
+        </w:rPr>
+        <w:t xml:space="preserve"> é um portfólio digital profissional desenvolvido ao longo do </w:t>
+      </w:r>
+      <w:proofErr w:type="spellStart"/>
+      <w:r>
+        <w:rPr>
+          <w:rFonts w:ascii="Arial" w:eastAsia="Arial" w:hAnsi="Arial" w:cs="Arial"/>
+          <w:color w:val="2C3E50"/>
+          <w:sz w:val="22"/>
+          <w:szCs w:val="22"/>
+        </w:rPr>
+        <w:t>Bootcamp</w:t>
+      </w:r>
+      <w:proofErr w:type="spellEnd"/>
+      <w:r>
+        <w:rPr>
+          <w:rFonts w:ascii="Arial" w:eastAsia="Arial" w:hAnsi="Arial" w:cs="Arial"/>
+          <w:color w:val="2C3E50"/>
+          <w:sz w:val="22"/>
+          <w:szCs w:val="22"/>
+        </w:rPr>
+        <w:t xml:space="preserve"> I do CEUB, com o objetivo de centralizar e apresentar a trajetória acadêmica, projetos e certificações de Gustavo Lisboa Gonçalves, estudante de Ciência de Dados e Machine Learning.</w:t>
       </w:r>
     </w:p>
     <w:p>
@@ -1143,8 +1258,19 @@
           <w:sz w:val="22"/>
           <w:szCs w:val="22"/>
         </w:rPr>
-        <w:t>A plataforma foi construída utilizando Git</w:t>
-      </w:r>
+        <w:t xml:space="preserve">A plataforma foi construída utilizando </w:t>
+      </w:r>
+      <w:proofErr w:type="spellStart"/>
+      <w:r>
+        <w:rPr>
+          <w:rFonts w:ascii="Arial" w:eastAsia="Arial" w:hAnsi="Arial" w:cs="Arial"/>
+          <w:color w:val="2C3E50"/>
+          <w:sz w:val="22"/>
+          <w:szCs w:val="22"/>
+        </w:rPr>
+        <w:t>Git</w:t>
+      </w:r>
+      <w:proofErr w:type="spellEnd"/>
       <w:r>
         <w:rPr>
           <w:rFonts w:ascii="Arial" w:eastAsia="Arial" w:hAnsi="Arial" w:cs="Arial"/>
@@ -1204,8 +1330,19 @@
           <w:sz w:val="22"/>
           <w:szCs w:val="22"/>
         </w:rPr>
-        <w:t>Documentar o processo completo de implantação do PortfolioHUB</w:t>
-      </w:r>
+        <w:t xml:space="preserve">Documentar o processo completo de implantação do </w:t>
+      </w:r>
+      <w:proofErr w:type="spellStart"/>
+      <w:r>
+        <w:rPr>
+          <w:rFonts w:ascii="Arial" w:eastAsia="Arial" w:hAnsi="Arial" w:cs="Arial"/>
+          <w:color w:val="2C3E50"/>
+          <w:sz w:val="22"/>
+          <w:szCs w:val="22"/>
+        </w:rPr>
+        <w:t>PortfolioHUB</w:t>
+      </w:r>
+      <w:proofErr w:type="spellEnd"/>
     </w:p>
     <w:p>
       <w:pPr>
@@ -1376,7 +1513,27 @@
           <w:sz w:val="22"/>
           <w:szCs w:val="22"/>
         </w:rPr>
-        <w:t>, como ferramenta de apoio à implantação do PortfolioHUB.</w:t>
+        <w:t xml:space="preserve">, como ferramenta de apoio à implantação do </w:t>
+      </w:r>
+      <w:proofErr w:type="spellStart"/>
+      <w:r>
+        <w:rPr>
+          <w:rFonts w:ascii="Arial" w:eastAsia="Arial" w:hAnsi="Arial" w:cs="Arial"/>
+          <w:color w:val="2C3E50"/>
+          <w:sz w:val="22"/>
+          <w:szCs w:val="22"/>
+        </w:rPr>
+        <w:t>PortfolioHUB</w:t>
+      </w:r>
+      <w:proofErr w:type="spellEnd"/>
+      <w:r>
+        <w:rPr>
+          <w:rFonts w:ascii="Arial" w:eastAsia="Arial" w:hAnsi="Arial" w:cs="Arial"/>
+          <w:color w:val="2C3E50"/>
+          <w:sz w:val="22"/>
+          <w:szCs w:val="22"/>
+        </w:rPr>
+        <w:t>.</w:t>
       </w:r>
     </w:p>
     <w:p>
@@ -1549,7 +1706,27 @@
           <w:sz w:val="22"/>
           <w:szCs w:val="22"/>
         </w:rPr>
-        <w:t xml:space="preserve"> durante o planejamento da implantação do PortfolioHUB. Os prompts foram elaborados seguindo a metáfora do funil — partindo do geral para o específico.</w:t>
+        <w:t xml:space="preserve"> durante o planejamento da implantação do </w:t>
+      </w:r>
+      <w:proofErr w:type="spellStart"/>
+      <w:r>
+        <w:rPr>
+          <w:rFonts w:ascii="Arial" w:eastAsia="Arial" w:hAnsi="Arial" w:cs="Arial"/>
+          <w:color w:val="2C3E50"/>
+          <w:sz w:val="22"/>
+          <w:szCs w:val="22"/>
+        </w:rPr>
+        <w:t>PortfolioHUB</w:t>
+      </w:r>
+      <w:proofErr w:type="spellEnd"/>
+      <w:r>
+        <w:rPr>
+          <w:rFonts w:ascii="Arial" w:eastAsia="Arial" w:hAnsi="Arial" w:cs="Arial"/>
+          <w:color w:val="2C3E50"/>
+          <w:sz w:val="22"/>
+          <w:szCs w:val="22"/>
+        </w:rPr>
+        <w:t>. Os prompts foram elaborados seguindo a metáfora do funil — partindo do geral para o específico.</w:t>
       </w:r>
     </w:p>
     <w:p>
@@ -1650,8 +1827,9 @@
                 <w:sz w:val="22"/>
                 <w:szCs w:val="22"/>
               </w:rPr>
-              <w:t>Sou estudante de Ciência de Dados e Machine Learning no CEUB. Estou chegando ao final do meu Bootcamp</w:t>
-            </w:r>
+              <w:t xml:space="preserve">Sou estudante de Ciência de Dados e Machine Learning no CEUB. Estou chegando ao final do meu </w:t>
+            </w:r>
+            <w:proofErr w:type="spellStart"/>
             <w:r>
               <w:rPr>
                 <w:rFonts w:ascii="Arial" w:eastAsia="Arial" w:hAnsi="Arial" w:cs="Arial"/>
@@ -1661,8 +1839,9 @@
                 <w:sz w:val="22"/>
                 <w:szCs w:val="22"/>
               </w:rPr>
-              <w:t xml:space="preserve"> I</w:t>
-            </w:r>
+              <w:t>Bootcamp</w:t>
+            </w:r>
+            <w:proofErr w:type="spellEnd"/>
             <w:r>
               <w:rPr>
                 <w:rFonts w:ascii="Arial" w:eastAsia="Arial" w:hAnsi="Arial" w:cs="Arial"/>
@@ -1672,7 +1851,42 @@
                 <w:sz w:val="22"/>
                 <w:szCs w:val="22"/>
               </w:rPr>
-              <w:t xml:space="preserve"> e preciso criar um Plano de Implantação do meu PortfolioHUB, que é um portfólio digital hospedado no GitHub</w:t>
+              <w:t xml:space="preserve"> I</w:t>
+            </w:r>
+            <w:r>
+              <w:rPr>
+                <w:rFonts w:ascii="Arial" w:eastAsia="Arial" w:hAnsi="Arial" w:cs="Arial"/>
+                <w:i/>
+                <w:iCs/>
+                <w:color w:val="1E3A5F"/>
+                <w:sz w:val="22"/>
+                <w:szCs w:val="22"/>
+              </w:rPr>
+              <w:t xml:space="preserve"> e preciso criar um Plano de Implantação do meu </w:t>
+            </w:r>
+            <w:proofErr w:type="spellStart"/>
+            <w:r>
+              <w:rPr>
+                <w:rFonts w:ascii="Arial" w:eastAsia="Arial" w:hAnsi="Arial" w:cs="Arial"/>
+                <w:i/>
+                <w:iCs/>
+                <w:color w:val="1E3A5F"/>
+                <w:sz w:val="22"/>
+                <w:szCs w:val="22"/>
+              </w:rPr>
+              <w:t>PortfolioHUB</w:t>
+            </w:r>
+            <w:proofErr w:type="spellEnd"/>
+            <w:r>
+              <w:rPr>
+                <w:rFonts w:ascii="Arial" w:eastAsia="Arial" w:hAnsi="Arial" w:cs="Arial"/>
+                <w:i/>
+                <w:iCs/>
+                <w:color w:val="1E3A5F"/>
+                <w:sz w:val="22"/>
+                <w:szCs w:val="22"/>
+              </w:rPr>
+              <w:t>, que é um portfólio digital hospedado no GitHub</w:t>
             </w:r>
             <w:r>
               <w:rPr>
@@ -1819,6 +2033,7 @@
               </w:rPr>
               <w:t xml:space="preserve">Aqui está o plano de implantação direto e resumido para o seu </w:t>
             </w:r>
+            <w:proofErr w:type="spellStart"/>
             <w:r>
               <w:rPr>
                 <w:rFonts w:ascii="Arial" w:eastAsia="Arial" w:hAnsi="Arial" w:cs="Arial"/>
@@ -1830,6 +2045,7 @@
               </w:rPr>
               <w:t>PortfolioHUB</w:t>
             </w:r>
+            <w:proofErr w:type="spellEnd"/>
             <w:r>
               <w:rPr>
                 <w:rFonts w:ascii="Arial" w:eastAsia="Arial" w:hAnsi="Arial" w:cs="Arial"/>
@@ -1887,7 +2103,27 @@
                 <w:sz w:val="21"/>
                 <w:szCs w:val="21"/>
               </w:rPr>
-              <w:t xml:space="preserve">No seu repositório PortfolioHUB, vá em </w:t>
+              <w:t xml:space="preserve">No seu repositório </w:t>
+            </w:r>
+            <w:proofErr w:type="spellStart"/>
+            <w:r>
+              <w:rPr>
+                <w:rFonts w:ascii="Arial" w:eastAsia="Arial" w:hAnsi="Arial" w:cs="Arial"/>
+                <w:color w:val="2C3E50"/>
+                <w:sz w:val="21"/>
+                <w:szCs w:val="21"/>
+              </w:rPr>
+              <w:t>PortfolioHUB</w:t>
+            </w:r>
+            <w:proofErr w:type="spellEnd"/>
+            <w:r>
+              <w:rPr>
+                <w:rFonts w:ascii="Arial" w:eastAsia="Arial" w:hAnsi="Arial" w:cs="Arial"/>
+                <w:color w:val="2C3E50"/>
+                <w:sz w:val="21"/>
+                <w:szCs w:val="21"/>
+              </w:rPr>
+              <w:t xml:space="preserve">, vá em </w:t>
             </w:r>
             <w:r>
               <w:rPr>
@@ -2001,7 +2237,29 @@
                 <w:szCs w:val="21"/>
                 <w:lang w:val="en-US"/>
               </w:rPr>
-              <w:t xml:space="preserve">, defina a </w:t>
+              <w:t xml:space="preserve">, </w:t>
+            </w:r>
+            <w:proofErr w:type="spellStart"/>
+            <w:r>
+              <w:rPr>
+                <w:rFonts w:ascii="Arial" w:eastAsia="Arial" w:hAnsi="Arial" w:cs="Arial"/>
+                <w:color w:val="2C3E50"/>
+                <w:sz w:val="21"/>
+                <w:szCs w:val="21"/>
+                <w:lang w:val="en-US"/>
+              </w:rPr>
+              <w:t>defina</w:t>
+            </w:r>
+            <w:proofErr w:type="spellEnd"/>
+            <w:r>
+              <w:rPr>
+                <w:rFonts w:ascii="Arial" w:eastAsia="Arial" w:hAnsi="Arial" w:cs="Arial"/>
+                <w:color w:val="2C3E50"/>
+                <w:sz w:val="21"/>
+                <w:szCs w:val="21"/>
+                <w:lang w:val="en-US"/>
+              </w:rPr>
+              <w:t xml:space="preserve"> a </w:t>
             </w:r>
             <w:r>
               <w:rPr>
@@ -2023,7 +2281,29 @@
                 <w:szCs w:val="21"/>
                 <w:lang w:val="en-US"/>
               </w:rPr>
-              <w:t xml:space="preserve"> como </w:t>
+              <w:t xml:space="preserve"> </w:t>
+            </w:r>
+            <w:proofErr w:type="spellStart"/>
+            <w:r>
+              <w:rPr>
+                <w:rFonts w:ascii="Arial" w:eastAsia="Arial" w:hAnsi="Arial" w:cs="Arial"/>
+                <w:color w:val="2C3E50"/>
+                <w:sz w:val="21"/>
+                <w:szCs w:val="21"/>
+                <w:lang w:val="en-US"/>
+              </w:rPr>
+              <w:t>como</w:t>
+            </w:r>
+            <w:proofErr w:type="spellEnd"/>
+            <w:r>
+              <w:rPr>
+                <w:rFonts w:ascii="Arial" w:eastAsia="Arial" w:hAnsi="Arial" w:cs="Arial"/>
+                <w:color w:val="2C3E50"/>
+                <w:sz w:val="21"/>
+                <w:szCs w:val="21"/>
+                <w:lang w:val="en-US"/>
+              </w:rPr>
+              <w:t xml:space="preserve"> </w:t>
             </w:r>
             <w:r>
               <w:rPr>
@@ -2092,6 +2372,7 @@
               </w:rPr>
               <w:t xml:space="preserve">, selecione </w:t>
             </w:r>
+            <w:proofErr w:type="spellStart"/>
             <w:r>
               <w:rPr>
                 <w:rFonts w:ascii="Arial" w:eastAsia="Arial" w:hAnsi="Arial" w:cs="Arial"/>
@@ -2103,6 +2384,7 @@
               </w:rPr>
               <w:t>main</w:t>
             </w:r>
+            <w:proofErr w:type="spellEnd"/>
             <w:r>
               <w:rPr>
                 <w:rFonts w:ascii="Arial" w:eastAsia="Arial" w:hAnsi="Arial" w:cs="Arial"/>
@@ -2132,6 +2414,7 @@
               </w:rPr>
               <w:t xml:space="preserve">. Clique em </w:t>
             </w:r>
+            <w:proofErr w:type="spellStart"/>
             <w:r>
               <w:rPr>
                 <w:rFonts w:ascii="Arial" w:eastAsia="Arial" w:hAnsi="Arial" w:cs="Arial"/>
@@ -2143,6 +2426,7 @@
               </w:rPr>
               <w:t>Save</w:t>
             </w:r>
+            <w:proofErr w:type="spellEnd"/>
             <w:r>
               <w:rPr>
                 <w:rFonts w:ascii="Arial" w:eastAsia="Arial" w:hAnsi="Arial" w:cs="Arial"/>
@@ -2175,7 +2459,27 @@
                 <w:sz w:val="21"/>
                 <w:szCs w:val="21"/>
               </w:rPr>
-              <w:t>O GitHub gerará o link público (ex: https://gustavolg95.github.io/PortfolioHUB/).</w:t>
+              <w:t>O GitHub gerará o link público (</w:t>
+            </w:r>
+            <w:proofErr w:type="spellStart"/>
+            <w:r>
+              <w:rPr>
+                <w:rFonts w:ascii="Arial" w:eastAsia="Arial" w:hAnsi="Arial" w:cs="Arial"/>
+                <w:color w:val="2C3E50"/>
+                <w:sz w:val="21"/>
+                <w:szCs w:val="21"/>
+              </w:rPr>
+              <w:t>ex</w:t>
+            </w:r>
+            <w:proofErr w:type="spellEnd"/>
+            <w:r>
+              <w:rPr>
+                <w:rFonts w:ascii="Arial" w:eastAsia="Arial" w:hAnsi="Arial" w:cs="Arial"/>
+                <w:color w:val="2C3E50"/>
+                <w:sz w:val="21"/>
+                <w:szCs w:val="21"/>
+              </w:rPr>
+              <w:t>: https://gustavolg95.github.io/PortfolioHUB/).</w:t>
             </w:r>
           </w:p>
           <w:p>
@@ -2254,25 +2558,135 @@
                 <w:szCs w:val="21"/>
               </w:rPr>
             </w:pPr>
-            <w:r>
-              <w:rPr>
-                <w:rFonts w:ascii="Arial" w:eastAsia="Arial" w:hAnsi="Arial" w:cs="Arial"/>
-                <w:b/>
-                <w:bCs/>
-                <w:color w:val="2C3E50"/>
-                <w:sz w:val="21"/>
-                <w:szCs w:val="21"/>
-              </w:rPr>
-              <w:t>Arquivo .gitignore:</w:t>
-            </w:r>
-            <w:r>
-              <w:rPr>
-                <w:rFonts w:ascii="Arial" w:eastAsia="Arial" w:hAnsi="Arial" w:cs="Arial"/>
-                <w:color w:val="2C3E50"/>
-                <w:sz w:val="21"/>
-                <w:szCs w:val="21"/>
-              </w:rPr>
-              <w:t xml:space="preserve"> Crie este arquivo na raiz e adicione nele arquivos de configuração local (ex: .env, config.json, .venv/).</w:t>
+            <w:proofErr w:type="gramStart"/>
+            <w:r>
+              <w:rPr>
+                <w:rFonts w:ascii="Arial" w:eastAsia="Arial" w:hAnsi="Arial" w:cs="Arial"/>
+                <w:b/>
+                <w:bCs/>
+                <w:color w:val="2C3E50"/>
+                <w:sz w:val="21"/>
+                <w:szCs w:val="21"/>
+              </w:rPr>
+              <w:t>Arquivo .</w:t>
+            </w:r>
+            <w:proofErr w:type="spellStart"/>
+            <w:r>
+              <w:rPr>
+                <w:rFonts w:ascii="Arial" w:eastAsia="Arial" w:hAnsi="Arial" w:cs="Arial"/>
+                <w:b/>
+                <w:bCs/>
+                <w:color w:val="2C3E50"/>
+                <w:sz w:val="21"/>
+                <w:szCs w:val="21"/>
+              </w:rPr>
+              <w:t>gitignore</w:t>
+            </w:r>
+            <w:proofErr w:type="spellEnd"/>
+            <w:proofErr w:type="gramEnd"/>
+            <w:r>
+              <w:rPr>
+                <w:rFonts w:ascii="Arial" w:eastAsia="Arial" w:hAnsi="Arial" w:cs="Arial"/>
+                <w:b/>
+                <w:bCs/>
+                <w:color w:val="2C3E50"/>
+                <w:sz w:val="21"/>
+                <w:szCs w:val="21"/>
+              </w:rPr>
+              <w:t>:</w:t>
+            </w:r>
+            <w:r>
+              <w:rPr>
+                <w:rFonts w:ascii="Arial" w:eastAsia="Arial" w:hAnsi="Arial" w:cs="Arial"/>
+                <w:color w:val="2C3E50"/>
+                <w:sz w:val="21"/>
+                <w:szCs w:val="21"/>
+              </w:rPr>
+              <w:t xml:space="preserve"> Crie este arquivo na raiz e adicione nele arquivos de configuração local (</w:t>
+            </w:r>
+            <w:proofErr w:type="spellStart"/>
+            <w:r>
+              <w:rPr>
+                <w:rFonts w:ascii="Arial" w:eastAsia="Arial" w:hAnsi="Arial" w:cs="Arial"/>
+                <w:color w:val="2C3E50"/>
+                <w:sz w:val="21"/>
+                <w:szCs w:val="21"/>
+              </w:rPr>
+              <w:t>ex</w:t>
+            </w:r>
+            <w:proofErr w:type="spellEnd"/>
+            <w:proofErr w:type="gramStart"/>
+            <w:r>
+              <w:rPr>
+                <w:rFonts w:ascii="Arial" w:eastAsia="Arial" w:hAnsi="Arial" w:cs="Arial"/>
+                <w:color w:val="2C3E50"/>
+                <w:sz w:val="21"/>
+                <w:szCs w:val="21"/>
+              </w:rPr>
+              <w:t>: .</w:t>
+            </w:r>
+            <w:proofErr w:type="spellStart"/>
+            <w:r>
+              <w:rPr>
+                <w:rFonts w:ascii="Arial" w:eastAsia="Arial" w:hAnsi="Arial" w:cs="Arial"/>
+                <w:color w:val="2C3E50"/>
+                <w:sz w:val="21"/>
+                <w:szCs w:val="21"/>
+              </w:rPr>
+              <w:t>env</w:t>
+            </w:r>
+            <w:proofErr w:type="spellEnd"/>
+            <w:proofErr w:type="gramEnd"/>
+            <w:r>
+              <w:rPr>
+                <w:rFonts w:ascii="Arial" w:eastAsia="Arial" w:hAnsi="Arial" w:cs="Arial"/>
+                <w:color w:val="2C3E50"/>
+                <w:sz w:val="21"/>
+                <w:szCs w:val="21"/>
+              </w:rPr>
+              <w:t xml:space="preserve">, </w:t>
+            </w:r>
+            <w:proofErr w:type="spellStart"/>
+            <w:proofErr w:type="gramStart"/>
+            <w:r>
+              <w:rPr>
+                <w:rFonts w:ascii="Arial" w:eastAsia="Arial" w:hAnsi="Arial" w:cs="Arial"/>
+                <w:color w:val="2C3E50"/>
+                <w:sz w:val="21"/>
+                <w:szCs w:val="21"/>
+              </w:rPr>
+              <w:t>config.json</w:t>
+            </w:r>
+            <w:proofErr w:type="spellEnd"/>
+            <w:r>
+              <w:rPr>
+                <w:rFonts w:ascii="Arial" w:eastAsia="Arial" w:hAnsi="Arial" w:cs="Arial"/>
+                <w:color w:val="2C3E50"/>
+                <w:sz w:val="21"/>
+                <w:szCs w:val="21"/>
+              </w:rPr>
+              <w:t>, .</w:t>
+            </w:r>
+            <w:proofErr w:type="spellStart"/>
+            <w:r>
+              <w:rPr>
+                <w:rFonts w:ascii="Arial" w:eastAsia="Arial" w:hAnsi="Arial" w:cs="Arial"/>
+                <w:color w:val="2C3E50"/>
+                <w:sz w:val="21"/>
+                <w:szCs w:val="21"/>
+              </w:rPr>
+              <w:t>venv</w:t>
+            </w:r>
+            <w:proofErr w:type="spellEnd"/>
+            <w:proofErr w:type="gramEnd"/>
+            <w:r>
+              <w:rPr>
+                <w:rFonts w:ascii="Arial" w:eastAsia="Arial" w:hAnsi="Arial" w:cs="Arial"/>
+                <w:color w:val="2C3E50"/>
+                <w:sz w:val="21"/>
+                <w:szCs w:val="21"/>
+              </w:rPr>
+              <w:t>/).</w:t>
             </w:r>
           </w:p>
           <w:p>
@@ -2310,6 +2724,7 @@
               </w:rPr>
               <w:t xml:space="preserve"> Monitore vulnerabilidades ativando o </w:t>
             </w:r>
+            <w:proofErr w:type="spellStart"/>
             <w:r>
               <w:rPr>
                 <w:rFonts w:ascii="Arial" w:eastAsia="Arial" w:hAnsi="Arial" w:cs="Arial"/>
@@ -2321,6 +2736,7 @@
               </w:rPr>
               <w:t>Dependabot</w:t>
             </w:r>
+            <w:proofErr w:type="spellEnd"/>
             <w:r>
               <w:rPr>
                 <w:rFonts w:ascii="Arial" w:eastAsia="Arial" w:hAnsi="Arial" w:cs="Arial"/>
@@ -2339,8 +2755,93 @@
                 <w:sz w:val="21"/>
                 <w:szCs w:val="21"/>
               </w:rPr>
-              <w:t>Settings &gt; Code security and analysis</w:t>
-            </w:r>
+              <w:t xml:space="preserve">Settings &gt; </w:t>
+            </w:r>
+            <w:proofErr w:type="spellStart"/>
+            <w:r>
+              <w:rPr>
+                <w:rFonts w:ascii="Arial" w:eastAsia="Arial" w:hAnsi="Arial" w:cs="Arial"/>
+                <w:i/>
+                <w:iCs/>
+                <w:color w:val="2C3E50"/>
+                <w:sz w:val="21"/>
+                <w:szCs w:val="21"/>
+              </w:rPr>
+              <w:t>Code</w:t>
+            </w:r>
+            <w:proofErr w:type="spellEnd"/>
+            <w:r>
+              <w:rPr>
+                <w:rFonts w:ascii="Arial" w:eastAsia="Arial" w:hAnsi="Arial" w:cs="Arial"/>
+                <w:i/>
+                <w:iCs/>
+                <w:color w:val="2C3E50"/>
+                <w:sz w:val="21"/>
+                <w:szCs w:val="21"/>
+              </w:rPr>
+              <w:t xml:space="preserve"> </w:t>
+            </w:r>
+            <w:proofErr w:type="spellStart"/>
+            <w:r>
+              <w:rPr>
+                <w:rFonts w:ascii="Arial" w:eastAsia="Arial" w:hAnsi="Arial" w:cs="Arial"/>
+                <w:i/>
+                <w:iCs/>
+                <w:color w:val="2C3E50"/>
+                <w:sz w:val="21"/>
+                <w:szCs w:val="21"/>
+              </w:rPr>
+              <w:t>security</w:t>
+            </w:r>
+            <w:proofErr w:type="spellEnd"/>
+            <w:r>
+              <w:rPr>
+                <w:rFonts w:ascii="Arial" w:eastAsia="Arial" w:hAnsi="Arial" w:cs="Arial"/>
+                <w:i/>
+                <w:iCs/>
+                <w:color w:val="2C3E50"/>
+                <w:sz w:val="21"/>
+                <w:szCs w:val="21"/>
+              </w:rPr>
+              <w:t xml:space="preserve"> </w:t>
+            </w:r>
+            <w:proofErr w:type="spellStart"/>
+            <w:r>
+              <w:rPr>
+                <w:rFonts w:ascii="Arial" w:eastAsia="Arial" w:hAnsi="Arial" w:cs="Arial"/>
+                <w:i/>
+                <w:iCs/>
+                <w:color w:val="2C3E50"/>
+                <w:sz w:val="21"/>
+                <w:szCs w:val="21"/>
+              </w:rPr>
+              <w:t>and</w:t>
+            </w:r>
+            <w:proofErr w:type="spellEnd"/>
+            <w:r>
+              <w:rPr>
+                <w:rFonts w:ascii="Arial" w:eastAsia="Arial" w:hAnsi="Arial" w:cs="Arial"/>
+                <w:i/>
+                <w:iCs/>
+                <w:color w:val="2C3E50"/>
+                <w:sz w:val="21"/>
+                <w:szCs w:val="21"/>
+              </w:rPr>
+              <w:t xml:space="preserve"> </w:t>
+            </w:r>
+            <w:proofErr w:type="spellStart"/>
+            <w:r>
+              <w:rPr>
+                <w:rFonts w:ascii="Arial" w:eastAsia="Arial" w:hAnsi="Arial" w:cs="Arial"/>
+                <w:i/>
+                <w:iCs/>
+                <w:color w:val="2C3E50"/>
+                <w:sz w:val="21"/>
+                <w:szCs w:val="21"/>
+              </w:rPr>
+              <w:t>analysis</w:t>
+            </w:r>
+            <w:proofErr w:type="spellEnd"/>
             <w:r>
               <w:rPr>
                 <w:rFonts w:ascii="Arial" w:eastAsia="Arial" w:hAnsi="Arial" w:cs="Arial"/>
@@ -2456,17 +2957,9 @@
                 <w:sz w:val="21"/>
                 <w:szCs w:val="21"/>
               </w:rPr>
-              <w:t>Settings &gt; Branches</w:t>
-            </w:r>
-            <w:r>
-              <w:rPr>
-                <w:rFonts w:ascii="Arial" w:eastAsia="Arial" w:hAnsi="Arial" w:cs="Arial"/>
-                <w:color w:val="2C3E50"/>
-                <w:sz w:val="21"/>
-                <w:szCs w:val="21"/>
-              </w:rPr>
-              <w:t xml:space="preserve"> e adicione uma regra de proteção para a main. Exija </w:t>
-            </w:r>
+              <w:t xml:space="preserve">Settings &gt; </w:t>
+            </w:r>
+            <w:proofErr w:type="spellStart"/>
             <w:r>
               <w:rPr>
                 <w:rFonts w:ascii="Arial" w:eastAsia="Arial" w:hAnsi="Arial" w:cs="Arial"/>
@@ -2476,8 +2969,75 @@
                 <w:sz w:val="21"/>
                 <w:szCs w:val="21"/>
               </w:rPr>
-              <w:t>Pull Requests</w:t>
-            </w:r>
+              <w:t>Branches</w:t>
+            </w:r>
+            <w:proofErr w:type="spellEnd"/>
+            <w:r>
+              <w:rPr>
+                <w:rFonts w:ascii="Arial" w:eastAsia="Arial" w:hAnsi="Arial" w:cs="Arial"/>
+                <w:color w:val="2C3E50"/>
+                <w:sz w:val="21"/>
+                <w:szCs w:val="21"/>
+              </w:rPr>
+              <w:t xml:space="preserve"> e adicione uma regra de proteção para a </w:t>
+            </w:r>
+            <w:proofErr w:type="spellStart"/>
+            <w:r>
+              <w:rPr>
+                <w:rFonts w:ascii="Arial" w:eastAsia="Arial" w:hAnsi="Arial" w:cs="Arial"/>
+                <w:color w:val="2C3E50"/>
+                <w:sz w:val="21"/>
+                <w:szCs w:val="21"/>
+              </w:rPr>
+              <w:t>main</w:t>
+            </w:r>
+            <w:proofErr w:type="spellEnd"/>
+            <w:r>
+              <w:rPr>
+                <w:rFonts w:ascii="Arial" w:eastAsia="Arial" w:hAnsi="Arial" w:cs="Arial"/>
+                <w:color w:val="2C3E50"/>
+                <w:sz w:val="21"/>
+                <w:szCs w:val="21"/>
+              </w:rPr>
+              <w:t xml:space="preserve">. Exija </w:t>
+            </w:r>
+            <w:proofErr w:type="spellStart"/>
+            <w:r>
+              <w:rPr>
+                <w:rFonts w:ascii="Arial" w:eastAsia="Arial" w:hAnsi="Arial" w:cs="Arial"/>
+                <w:i/>
+                <w:iCs/>
+                <w:color w:val="2C3E50"/>
+                <w:sz w:val="21"/>
+                <w:szCs w:val="21"/>
+              </w:rPr>
+              <w:t>Pull</w:t>
+            </w:r>
+            <w:proofErr w:type="spellEnd"/>
+            <w:r>
+              <w:rPr>
+                <w:rFonts w:ascii="Arial" w:eastAsia="Arial" w:hAnsi="Arial" w:cs="Arial"/>
+                <w:i/>
+                <w:iCs/>
+                <w:color w:val="2C3E50"/>
+                <w:sz w:val="21"/>
+                <w:szCs w:val="21"/>
+              </w:rPr>
+              <w:t xml:space="preserve"> </w:t>
+            </w:r>
+            <w:proofErr w:type="spellStart"/>
+            <w:r>
+              <w:rPr>
+                <w:rFonts w:ascii="Arial" w:eastAsia="Arial" w:hAnsi="Arial" w:cs="Arial"/>
+                <w:i/>
+                <w:iCs/>
+                <w:color w:val="2C3E50"/>
+                <w:sz w:val="21"/>
+                <w:szCs w:val="21"/>
+              </w:rPr>
+              <w:t>Requests</w:t>
+            </w:r>
+            <w:proofErr w:type="spellEnd"/>
             <w:r>
               <w:rPr>
                 <w:rFonts w:ascii="Arial" w:eastAsia="Arial" w:hAnsi="Arial" w:cs="Arial"/>
@@ -2944,7 +3504,27 @@
                 <w:sz w:val="21"/>
                 <w:szCs w:val="21"/>
               </w:rPr>
-              <w:t>Para manter seu repositório público do PortfolioHUB seguro, implemente estas 5 práticas essenciais direto no GitHub:</w:t>
+              <w:t xml:space="preserve">Para manter seu repositório público do </w:t>
+            </w:r>
+            <w:proofErr w:type="spellStart"/>
+            <w:r>
+              <w:rPr>
+                <w:rFonts w:ascii="Arial" w:eastAsia="Arial" w:hAnsi="Arial" w:cs="Arial"/>
+                <w:color w:val="2C3E50"/>
+                <w:sz w:val="21"/>
+                <w:szCs w:val="21"/>
+              </w:rPr>
+              <w:t>PortfolioHUB</w:t>
+            </w:r>
+            <w:proofErr w:type="spellEnd"/>
+            <w:r>
+              <w:rPr>
+                <w:rFonts w:ascii="Arial" w:eastAsia="Arial" w:hAnsi="Arial" w:cs="Arial"/>
+                <w:color w:val="2C3E50"/>
+                <w:sz w:val="21"/>
+                <w:szCs w:val="21"/>
+              </w:rPr>
+              <w:t xml:space="preserve"> seguro, implemente estas 5 práticas essenciais direto no GitHub:</w:t>
             </w:r>
           </w:p>
           <w:p>
@@ -2969,7 +3549,55 @@
                 <w:sz w:val="21"/>
                 <w:szCs w:val="21"/>
               </w:rPr>
-              <w:t>1. Varredura de Segredos (Secret Scanning)</w:t>
+              <w:t>1. Varredura de Segredos (</w:t>
+            </w:r>
+            <w:proofErr w:type="spellStart"/>
+            <w:r>
+              <w:rPr>
+                <w:rFonts w:ascii="Arial" w:eastAsia="Arial" w:hAnsi="Arial" w:cs="Arial"/>
+                <w:b/>
+                <w:bCs/>
+                <w:color w:val="2C3E50"/>
+                <w:sz w:val="21"/>
+                <w:szCs w:val="21"/>
+              </w:rPr>
+              <w:t>Secret</w:t>
+            </w:r>
+            <w:proofErr w:type="spellEnd"/>
+            <w:r>
+              <w:rPr>
+                <w:rFonts w:ascii="Arial" w:eastAsia="Arial" w:hAnsi="Arial" w:cs="Arial"/>
+                <w:b/>
+                <w:bCs/>
+                <w:color w:val="2C3E50"/>
+                <w:sz w:val="21"/>
+                <w:szCs w:val="21"/>
+              </w:rPr>
+              <w:t xml:space="preserve"> </w:t>
+            </w:r>
+            <w:proofErr w:type="spellStart"/>
+            <w:r>
+              <w:rPr>
+                <w:rFonts w:ascii="Arial" w:eastAsia="Arial" w:hAnsi="Arial" w:cs="Arial"/>
+                <w:b/>
+                <w:bCs/>
+                <w:color w:val="2C3E50"/>
+                <w:sz w:val="21"/>
+                <w:szCs w:val="21"/>
+              </w:rPr>
+              <w:t>Scanning</w:t>
+            </w:r>
+            <w:proofErr w:type="spellEnd"/>
+            <w:r>
+              <w:rPr>
+                <w:rFonts w:ascii="Arial" w:eastAsia="Arial" w:hAnsi="Arial" w:cs="Arial"/>
+                <w:b/>
+                <w:bCs/>
+                <w:color w:val="2C3E50"/>
+                <w:sz w:val="21"/>
+                <w:szCs w:val="21"/>
+              </w:rPr>
+              <w:t>)</w:t>
             </w:r>
           </w:p>
           <w:p>
@@ -3018,7 +3646,103 @@
                 <w:sz w:val="21"/>
                 <w:szCs w:val="21"/>
               </w:rPr>
-              <w:t xml:space="preserve">Settings &gt; Code security and analysis </w:t>
+              <w:t xml:space="preserve">Settings &gt; </w:t>
+            </w:r>
+            <w:proofErr w:type="spellStart"/>
+            <w:r>
+              <w:rPr>
+                <w:rFonts w:ascii="Arial" w:eastAsia="Arial" w:hAnsi="Arial" w:cs="Arial"/>
+                <w:b/>
+                <w:bCs/>
+                <w:color w:val="2C3E50"/>
+                <w:sz w:val="21"/>
+                <w:szCs w:val="21"/>
+              </w:rPr>
+              <w:t>Code</w:t>
+            </w:r>
+            <w:proofErr w:type="spellEnd"/>
+            <w:r>
+              <w:rPr>
+                <w:rFonts w:ascii="Arial" w:eastAsia="Arial" w:hAnsi="Arial" w:cs="Arial"/>
+                <w:b/>
+                <w:bCs/>
+                <w:color w:val="2C3E50"/>
+                <w:sz w:val="21"/>
+                <w:szCs w:val="21"/>
+              </w:rPr>
+              <w:t xml:space="preserve"> </w:t>
+            </w:r>
+            <w:proofErr w:type="spellStart"/>
+            <w:r>
+              <w:rPr>
+                <w:rFonts w:ascii="Arial" w:eastAsia="Arial" w:hAnsi="Arial" w:cs="Arial"/>
+                <w:b/>
+                <w:bCs/>
+                <w:color w:val="2C3E50"/>
+                <w:sz w:val="21"/>
+                <w:szCs w:val="21"/>
+              </w:rPr>
+              <w:t>security</w:t>
+            </w:r>
+            <w:proofErr w:type="spellEnd"/>
+            <w:r>
+              <w:rPr>
+                <w:rFonts w:ascii="Arial" w:eastAsia="Arial" w:hAnsi="Arial" w:cs="Arial"/>
+                <w:b/>
+                <w:bCs/>
+                <w:color w:val="2C3E50"/>
+                <w:sz w:val="21"/>
+                <w:szCs w:val="21"/>
+              </w:rPr>
+              <w:t xml:space="preserve"> </w:t>
+            </w:r>
+            <w:proofErr w:type="spellStart"/>
+            <w:r>
+              <w:rPr>
+                <w:rFonts w:ascii="Arial" w:eastAsia="Arial" w:hAnsi="Arial" w:cs="Arial"/>
+                <w:b/>
+                <w:bCs/>
+                <w:color w:val="2C3E50"/>
+                <w:sz w:val="21"/>
+                <w:szCs w:val="21"/>
+              </w:rPr>
+              <w:t>and</w:t>
+            </w:r>
+            <w:proofErr w:type="spellEnd"/>
+            <w:r>
+              <w:rPr>
+                <w:rFonts w:ascii="Arial" w:eastAsia="Arial" w:hAnsi="Arial" w:cs="Arial"/>
+                <w:b/>
+                <w:bCs/>
+                <w:color w:val="2C3E50"/>
+                <w:sz w:val="21"/>
+                <w:szCs w:val="21"/>
+              </w:rPr>
+              <w:t xml:space="preserve"> </w:t>
+            </w:r>
+            <w:proofErr w:type="spellStart"/>
+            <w:r>
+              <w:rPr>
+                <w:rFonts w:ascii="Arial" w:eastAsia="Arial" w:hAnsi="Arial" w:cs="Arial"/>
+                <w:b/>
+                <w:bCs/>
+                <w:color w:val="2C3E50"/>
+                <w:sz w:val="21"/>
+                <w:szCs w:val="21"/>
+              </w:rPr>
+              <w:t>analysis</w:t>
+            </w:r>
+            <w:proofErr w:type="spellEnd"/>
+            <w:r>
+              <w:rPr>
+                <w:rFonts w:ascii="Arial" w:eastAsia="Arial" w:hAnsi="Arial" w:cs="Arial"/>
+                <w:b/>
+                <w:bCs/>
+                <w:color w:val="2C3E50"/>
+                <w:sz w:val="21"/>
+                <w:szCs w:val="21"/>
+              </w:rPr>
+              <w:t xml:space="preserve"> </w:t>
             </w:r>
             <w:r>
               <w:rPr>
@@ -3038,7 +3762,55 @@
                 <w:sz w:val="21"/>
                 <w:szCs w:val="21"/>
               </w:rPr>
-              <w:t xml:space="preserve"> Secret Scanning </w:t>
+              <w:t xml:space="preserve"> </w:t>
+            </w:r>
+            <w:proofErr w:type="spellStart"/>
+            <w:r>
+              <w:rPr>
+                <w:rFonts w:ascii="Arial" w:eastAsia="Arial" w:hAnsi="Arial" w:cs="Arial"/>
+                <w:b/>
+                <w:bCs/>
+                <w:color w:val="2C3E50"/>
+                <w:sz w:val="21"/>
+                <w:szCs w:val="21"/>
+              </w:rPr>
+              <w:t>Secret</w:t>
+            </w:r>
+            <w:proofErr w:type="spellEnd"/>
+            <w:r>
+              <w:rPr>
+                <w:rFonts w:ascii="Arial" w:eastAsia="Arial" w:hAnsi="Arial" w:cs="Arial"/>
+                <w:b/>
+                <w:bCs/>
+                <w:color w:val="2C3E50"/>
+                <w:sz w:val="21"/>
+                <w:szCs w:val="21"/>
+              </w:rPr>
+              <w:t xml:space="preserve"> </w:t>
+            </w:r>
+            <w:proofErr w:type="spellStart"/>
+            <w:r>
+              <w:rPr>
+                <w:rFonts w:ascii="Arial" w:eastAsia="Arial" w:hAnsi="Arial" w:cs="Arial"/>
+                <w:b/>
+                <w:bCs/>
+                <w:color w:val="2C3E50"/>
+                <w:sz w:val="21"/>
+                <w:szCs w:val="21"/>
+              </w:rPr>
+              <w:t>Scanning</w:t>
+            </w:r>
+            <w:proofErr w:type="spellEnd"/>
+            <w:r>
+              <w:rPr>
+                <w:rFonts w:ascii="Arial" w:eastAsia="Arial" w:hAnsi="Arial" w:cs="Arial"/>
+                <w:b/>
+                <w:bCs/>
+                <w:color w:val="2C3E50"/>
+                <w:sz w:val="21"/>
+                <w:szCs w:val="21"/>
+              </w:rPr>
+              <w:t xml:space="preserve"> </w:t>
             </w:r>
             <w:r>
               <w:rPr>
@@ -3058,7 +3830,55 @@
                 <w:sz w:val="21"/>
                 <w:szCs w:val="21"/>
               </w:rPr>
-              <w:t xml:space="preserve"> Push Protection.</w:t>
+              <w:t xml:space="preserve"> </w:t>
+            </w:r>
+            <w:proofErr w:type="spellStart"/>
+            <w:r>
+              <w:rPr>
+                <w:rFonts w:ascii="Arial" w:eastAsia="Arial" w:hAnsi="Arial" w:cs="Arial"/>
+                <w:b/>
+                <w:bCs/>
+                <w:color w:val="2C3E50"/>
+                <w:sz w:val="21"/>
+                <w:szCs w:val="21"/>
+              </w:rPr>
+              <w:t>Push</w:t>
+            </w:r>
+            <w:proofErr w:type="spellEnd"/>
+            <w:r>
+              <w:rPr>
+                <w:rFonts w:ascii="Arial" w:eastAsia="Arial" w:hAnsi="Arial" w:cs="Arial"/>
+                <w:b/>
+                <w:bCs/>
+                <w:color w:val="2C3E50"/>
+                <w:sz w:val="21"/>
+                <w:szCs w:val="21"/>
+              </w:rPr>
+              <w:t xml:space="preserve"> </w:t>
+            </w:r>
+            <w:proofErr w:type="spellStart"/>
+            <w:r>
+              <w:rPr>
+                <w:rFonts w:ascii="Arial" w:eastAsia="Arial" w:hAnsi="Arial" w:cs="Arial"/>
+                <w:b/>
+                <w:bCs/>
+                <w:color w:val="2C3E50"/>
+                <w:sz w:val="21"/>
+                <w:szCs w:val="21"/>
+              </w:rPr>
+              <w:t>Protection</w:t>
+            </w:r>
+            <w:proofErr w:type="spellEnd"/>
+            <w:r>
+              <w:rPr>
+                <w:rFonts w:ascii="Arial" w:eastAsia="Arial" w:hAnsi="Arial" w:cs="Arial"/>
+                <w:b/>
+                <w:bCs/>
+                <w:color w:val="2C3E50"/>
+                <w:sz w:val="21"/>
+                <w:szCs w:val="21"/>
+              </w:rPr>
+              <w:t>.</w:t>
             </w:r>
           </w:p>
           <w:p>
@@ -3098,6 +3918,7 @@
               </w:rPr>
               <w:t xml:space="preserve">O GitHub bloqueará automaticamente qualquer tentativa de dar </w:t>
             </w:r>
+            <w:proofErr w:type="spellStart"/>
             <w:r>
               <w:rPr>
                 <w:rFonts w:ascii="Arial" w:eastAsia="Arial" w:hAnsi="Arial" w:cs="Arial"/>
@@ -3109,6 +3930,7 @@
               </w:rPr>
               <w:t>push</w:t>
             </w:r>
+            <w:proofErr w:type="spellEnd"/>
             <w:r>
               <w:rPr>
                 <w:rFonts w:ascii="Arial" w:eastAsia="Arial" w:hAnsi="Arial" w:cs="Arial"/>
@@ -3141,8 +3963,21 @@
                 <w:sz w:val="21"/>
                 <w:szCs w:val="21"/>
               </w:rPr>
-              <w:t>2. Ative o Dependabot</w:t>
-            </w:r>
+              <w:t xml:space="preserve">2. Ative o </w:t>
+            </w:r>
+            <w:proofErr w:type="spellStart"/>
+            <w:r>
+              <w:rPr>
+                <w:rFonts w:ascii="Arial" w:eastAsia="Arial" w:hAnsi="Arial" w:cs="Arial"/>
+                <w:b/>
+                <w:bCs/>
+                <w:color w:val="2C3E50"/>
+                <w:sz w:val="21"/>
+                <w:szCs w:val="21"/>
+              </w:rPr>
+              <w:t>Dependabot</w:t>
+            </w:r>
+            <w:proofErr w:type="spellEnd"/>
           </w:p>
           <w:p>
             <w:pPr>
@@ -3181,6 +4016,7 @@
               </w:rPr>
               <w:t xml:space="preserve">Na mesma aba de </w:t>
             </w:r>
+            <w:proofErr w:type="spellStart"/>
             <w:r>
               <w:rPr>
                 <w:rFonts w:ascii="Arial" w:eastAsia="Arial" w:hAnsi="Arial" w:cs="Arial"/>
@@ -3190,8 +4026,33 @@
                 <w:sz w:val="21"/>
                 <w:szCs w:val="21"/>
               </w:rPr>
-              <w:t>Code security</w:t>
-            </w:r>
+              <w:t>Code</w:t>
+            </w:r>
+            <w:proofErr w:type="spellEnd"/>
+            <w:r>
+              <w:rPr>
+                <w:rFonts w:ascii="Arial" w:eastAsia="Arial" w:hAnsi="Arial" w:cs="Arial"/>
+                <w:i/>
+                <w:iCs/>
+                <w:color w:val="2C3E50"/>
+                <w:sz w:val="21"/>
+                <w:szCs w:val="21"/>
+              </w:rPr>
+              <w:t xml:space="preserve"> </w:t>
+            </w:r>
+            <w:proofErr w:type="spellStart"/>
+            <w:r>
+              <w:rPr>
+                <w:rFonts w:ascii="Arial" w:eastAsia="Arial" w:hAnsi="Arial" w:cs="Arial"/>
+                <w:i/>
+                <w:iCs/>
+                <w:color w:val="2C3E50"/>
+                <w:sz w:val="21"/>
+                <w:szCs w:val="21"/>
+              </w:rPr>
+              <w:t>security</w:t>
+            </w:r>
+            <w:proofErr w:type="spellEnd"/>
             <w:r>
               <w:rPr>
                 <w:rFonts w:ascii="Arial" w:eastAsia="Arial" w:hAnsi="Arial" w:cs="Arial"/>
@@ -3210,7 +4071,31 @@
                 <w:sz w:val="21"/>
                 <w:szCs w:val="21"/>
               </w:rPr>
-              <w:t xml:space="preserve"> Dependabot </w:t>
+              <w:t xml:space="preserve"> </w:t>
+            </w:r>
+            <w:proofErr w:type="spellStart"/>
+            <w:r>
+              <w:rPr>
+                <w:rFonts w:ascii="Arial" w:eastAsia="Arial" w:hAnsi="Arial" w:cs="Arial"/>
+                <w:b/>
+                <w:bCs/>
+                <w:color w:val="2C3E50"/>
+                <w:sz w:val="21"/>
+                <w:szCs w:val="21"/>
+              </w:rPr>
+              <w:t>Dependabot</w:t>
+            </w:r>
+            <w:proofErr w:type="spellEnd"/>
+            <w:r>
+              <w:rPr>
+                <w:rFonts w:ascii="Arial" w:eastAsia="Arial" w:hAnsi="Arial" w:cs="Arial"/>
+                <w:b/>
+                <w:bCs/>
+                <w:color w:val="2C3E50"/>
+                <w:sz w:val="21"/>
+                <w:szCs w:val="21"/>
+              </w:rPr>
+              <w:t xml:space="preserve"> </w:t>
             </w:r>
             <w:r>
               <w:rPr>
@@ -3230,7 +4115,55 @@
                 <w:sz w:val="21"/>
                 <w:szCs w:val="21"/>
               </w:rPr>
-              <w:t xml:space="preserve"> Dependabot security updates.</w:t>
+              <w:t xml:space="preserve"> </w:t>
+            </w:r>
+            <w:proofErr w:type="spellStart"/>
+            <w:r>
+              <w:rPr>
+                <w:rFonts w:ascii="Arial" w:eastAsia="Arial" w:hAnsi="Arial" w:cs="Arial"/>
+                <w:b/>
+                <w:bCs/>
+                <w:color w:val="2C3E50"/>
+                <w:sz w:val="21"/>
+                <w:szCs w:val="21"/>
+              </w:rPr>
+              <w:t>Dependabot</w:t>
+            </w:r>
+            <w:proofErr w:type="spellEnd"/>
+            <w:r>
+              <w:rPr>
+                <w:rFonts w:ascii="Arial" w:eastAsia="Arial" w:hAnsi="Arial" w:cs="Arial"/>
+                <w:b/>
+                <w:bCs/>
+                <w:color w:val="2C3E50"/>
+                <w:sz w:val="21"/>
+                <w:szCs w:val="21"/>
+              </w:rPr>
+              <w:t xml:space="preserve"> </w:t>
+            </w:r>
+            <w:proofErr w:type="spellStart"/>
+            <w:r>
+              <w:rPr>
+                <w:rFonts w:ascii="Arial" w:eastAsia="Arial" w:hAnsi="Arial" w:cs="Arial"/>
+                <w:b/>
+                <w:bCs/>
+                <w:color w:val="2C3E50"/>
+                <w:sz w:val="21"/>
+                <w:szCs w:val="21"/>
+              </w:rPr>
+              <w:t>security</w:t>
+            </w:r>
+            <w:proofErr w:type="spellEnd"/>
+            <w:r>
+              <w:rPr>
+                <w:rFonts w:ascii="Arial" w:eastAsia="Arial" w:hAnsi="Arial" w:cs="Arial"/>
+                <w:b/>
+                <w:bCs/>
+                <w:color w:val="2C3E50"/>
+                <w:sz w:val="21"/>
+                <w:szCs w:val="21"/>
+              </w:rPr>
+              <w:t xml:space="preserve"> updates.</w:t>
             </w:r>
           </w:p>
           <w:p>
@@ -3266,7 +4199,47 @@
                 <w:sz w:val="21"/>
                 <w:szCs w:val="21"/>
               </w:rPr>
-              <w:t>Ele monitora as bibliotecas que você usa no portfólio (Node, Python, etc.) e cria Pull Requests automáticos para corrigir vulnerabilidades de segurança encontradas nelas.</w:t>
+              <w:t xml:space="preserve">Ele monitora as bibliotecas que você usa no portfólio (Node, Python, etc.) e cria </w:t>
+            </w:r>
+            <w:proofErr w:type="spellStart"/>
+            <w:r>
+              <w:rPr>
+                <w:rFonts w:ascii="Arial" w:eastAsia="Arial" w:hAnsi="Arial" w:cs="Arial"/>
+                <w:color w:val="2C3E50"/>
+                <w:sz w:val="21"/>
+                <w:szCs w:val="21"/>
+              </w:rPr>
+              <w:t>Pull</w:t>
+            </w:r>
+            <w:proofErr w:type="spellEnd"/>
+            <w:r>
+              <w:rPr>
+                <w:rFonts w:ascii="Arial" w:eastAsia="Arial" w:hAnsi="Arial" w:cs="Arial"/>
+                <w:color w:val="2C3E50"/>
+                <w:sz w:val="21"/>
+                <w:szCs w:val="21"/>
+              </w:rPr>
+              <w:t xml:space="preserve"> </w:t>
+            </w:r>
+            <w:proofErr w:type="spellStart"/>
+            <w:r>
+              <w:rPr>
+                <w:rFonts w:ascii="Arial" w:eastAsia="Arial" w:hAnsi="Arial" w:cs="Arial"/>
+                <w:color w:val="2C3E50"/>
+                <w:sz w:val="21"/>
+                <w:szCs w:val="21"/>
+              </w:rPr>
+              <w:t>Requests</w:t>
+            </w:r>
+            <w:proofErr w:type="spellEnd"/>
+            <w:r>
+              <w:rPr>
+                <w:rFonts w:ascii="Arial" w:eastAsia="Arial" w:hAnsi="Arial" w:cs="Arial"/>
+                <w:color w:val="2C3E50"/>
+                <w:sz w:val="21"/>
+                <w:szCs w:val="21"/>
+              </w:rPr>
+              <w:t xml:space="preserve"> automáticos para corrigir vulnerabilidades de segurança encontradas nelas.</w:t>
             </w:r>
           </w:p>
           <w:p>
@@ -3293,6 +4266,7 @@
               </w:rPr>
               <w:t>3. Proteção da Branch Principal (</w:t>
             </w:r>
+            <w:proofErr w:type="spellStart"/>
             <w:r>
               <w:rPr>
                 <w:rFonts w:ascii="Arial" w:eastAsia="Arial" w:hAnsi="Arial" w:cs="Arial"/>
@@ -3306,6 +4280,7 @@
               </w:rPr>
               <w:t>main</w:t>
             </w:r>
+            <w:proofErr w:type="spellEnd"/>
             <w:r>
               <w:rPr>
                 <w:rFonts w:ascii="Arial" w:eastAsia="Arial" w:hAnsi="Arial" w:cs="Arial"/>
@@ -3364,7 +4339,127 @@
                 <w:sz w:val="21"/>
                 <w:szCs w:val="21"/>
               </w:rPr>
-              <w:t xml:space="preserve"> Settings &gt; Branches &gt; Add branch protection rule. </w:t>
+              <w:t xml:space="preserve"> Settings &gt; </w:t>
+            </w:r>
+            <w:proofErr w:type="spellStart"/>
+            <w:r>
+              <w:rPr>
+                <w:rFonts w:ascii="Arial" w:eastAsia="Arial" w:hAnsi="Arial" w:cs="Arial"/>
+                <w:b/>
+                <w:bCs/>
+                <w:color w:val="2C3E50"/>
+                <w:sz w:val="21"/>
+                <w:szCs w:val="21"/>
+              </w:rPr>
+              <w:t>Branches</w:t>
+            </w:r>
+            <w:proofErr w:type="spellEnd"/>
+            <w:r>
+              <w:rPr>
+                <w:rFonts w:ascii="Arial" w:eastAsia="Arial" w:hAnsi="Arial" w:cs="Arial"/>
+                <w:b/>
+                <w:bCs/>
+                <w:color w:val="2C3E50"/>
+                <w:sz w:val="21"/>
+                <w:szCs w:val="21"/>
+              </w:rPr>
+              <w:t xml:space="preserve"> &gt; </w:t>
+            </w:r>
+            <w:proofErr w:type="spellStart"/>
+            <w:r>
+              <w:rPr>
+                <w:rFonts w:ascii="Arial" w:eastAsia="Arial" w:hAnsi="Arial" w:cs="Arial"/>
+                <w:b/>
+                <w:bCs/>
+                <w:color w:val="2C3E50"/>
+                <w:sz w:val="21"/>
+                <w:szCs w:val="21"/>
+              </w:rPr>
+              <w:t>Add</w:t>
+            </w:r>
+            <w:proofErr w:type="spellEnd"/>
+            <w:r>
+              <w:rPr>
+                <w:rFonts w:ascii="Arial" w:eastAsia="Arial" w:hAnsi="Arial" w:cs="Arial"/>
+                <w:b/>
+                <w:bCs/>
+                <w:color w:val="2C3E50"/>
+                <w:sz w:val="21"/>
+                <w:szCs w:val="21"/>
+              </w:rPr>
+              <w:t xml:space="preserve"> </w:t>
+            </w:r>
+            <w:proofErr w:type="spellStart"/>
+            <w:r>
+              <w:rPr>
+                <w:rFonts w:ascii="Arial" w:eastAsia="Arial" w:hAnsi="Arial" w:cs="Arial"/>
+                <w:b/>
+                <w:bCs/>
+                <w:color w:val="2C3E50"/>
+                <w:sz w:val="21"/>
+                <w:szCs w:val="21"/>
+              </w:rPr>
+              <w:t>branch</w:t>
+            </w:r>
+            <w:proofErr w:type="spellEnd"/>
+            <w:r>
+              <w:rPr>
+                <w:rFonts w:ascii="Arial" w:eastAsia="Arial" w:hAnsi="Arial" w:cs="Arial"/>
+                <w:b/>
+                <w:bCs/>
+                <w:color w:val="2C3E50"/>
+                <w:sz w:val="21"/>
+                <w:szCs w:val="21"/>
+              </w:rPr>
+              <w:t xml:space="preserve"> </w:t>
+            </w:r>
+            <w:proofErr w:type="spellStart"/>
+            <w:r>
+              <w:rPr>
+                <w:rFonts w:ascii="Arial" w:eastAsia="Arial" w:hAnsi="Arial" w:cs="Arial"/>
+                <w:b/>
+                <w:bCs/>
+                <w:color w:val="2C3E50"/>
+                <w:sz w:val="21"/>
+                <w:szCs w:val="21"/>
+              </w:rPr>
+              <w:t>protection</w:t>
+            </w:r>
+            <w:proofErr w:type="spellEnd"/>
+            <w:r>
+              <w:rPr>
+                <w:rFonts w:ascii="Arial" w:eastAsia="Arial" w:hAnsi="Arial" w:cs="Arial"/>
+                <w:b/>
+                <w:bCs/>
+                <w:color w:val="2C3E50"/>
+                <w:sz w:val="21"/>
+                <w:szCs w:val="21"/>
+              </w:rPr>
+              <w:t xml:space="preserve"> </w:t>
+            </w:r>
+            <w:proofErr w:type="spellStart"/>
+            <w:r>
+              <w:rPr>
+                <w:rFonts w:ascii="Arial" w:eastAsia="Arial" w:hAnsi="Arial" w:cs="Arial"/>
+                <w:b/>
+                <w:bCs/>
+                <w:color w:val="2C3E50"/>
+                <w:sz w:val="21"/>
+                <w:szCs w:val="21"/>
+              </w:rPr>
+              <w:t>rule</w:t>
+            </w:r>
+            <w:proofErr w:type="spellEnd"/>
+            <w:r>
+              <w:rPr>
+                <w:rFonts w:ascii="Arial" w:eastAsia="Arial" w:hAnsi="Arial" w:cs="Arial"/>
+                <w:b/>
+                <w:bCs/>
+                <w:color w:val="2C3E50"/>
+                <w:sz w:val="21"/>
+                <w:szCs w:val="21"/>
+              </w:rPr>
+              <w:t xml:space="preserve">. </w:t>
             </w:r>
             <w:r>
               <w:rPr>
@@ -3375,6 +4470,7 @@
               </w:rPr>
               <w:t xml:space="preserve">Defina o nome como </w:t>
             </w:r>
+            <w:proofErr w:type="spellStart"/>
             <w:r>
               <w:rPr>
                 <w:rFonts w:ascii="Arial" w:eastAsia="Arial" w:hAnsi="Arial" w:cs="Arial"/>
@@ -3386,6 +4482,7 @@
               </w:rPr>
               <w:t>main</w:t>
             </w:r>
+            <w:proofErr w:type="spellEnd"/>
             <w:r>
               <w:rPr>
                 <w:rFonts w:ascii="Arial" w:eastAsia="Arial" w:hAnsi="Arial" w:cs="Arial"/>
@@ -3404,7 +4501,103 @@
                 <w:sz w:val="21"/>
                 <w:szCs w:val="21"/>
               </w:rPr>
-              <w:t xml:space="preserve"> Require a pull request before merging.</w:t>
+              <w:t xml:space="preserve"> Require a </w:t>
+            </w:r>
+            <w:proofErr w:type="spellStart"/>
+            <w:r>
+              <w:rPr>
+                <w:rFonts w:ascii="Arial" w:eastAsia="Arial" w:hAnsi="Arial" w:cs="Arial"/>
+                <w:b/>
+                <w:bCs/>
+                <w:color w:val="2C3E50"/>
+                <w:sz w:val="21"/>
+                <w:szCs w:val="21"/>
+              </w:rPr>
+              <w:t>pull</w:t>
+            </w:r>
+            <w:proofErr w:type="spellEnd"/>
+            <w:r>
+              <w:rPr>
+                <w:rFonts w:ascii="Arial" w:eastAsia="Arial" w:hAnsi="Arial" w:cs="Arial"/>
+                <w:b/>
+                <w:bCs/>
+                <w:color w:val="2C3E50"/>
+                <w:sz w:val="21"/>
+                <w:szCs w:val="21"/>
+              </w:rPr>
+              <w:t xml:space="preserve"> </w:t>
+            </w:r>
+            <w:proofErr w:type="spellStart"/>
+            <w:r>
+              <w:rPr>
+                <w:rFonts w:ascii="Arial" w:eastAsia="Arial" w:hAnsi="Arial" w:cs="Arial"/>
+                <w:b/>
+                <w:bCs/>
+                <w:color w:val="2C3E50"/>
+                <w:sz w:val="21"/>
+                <w:szCs w:val="21"/>
+              </w:rPr>
+              <w:t>request</w:t>
+            </w:r>
+            <w:proofErr w:type="spellEnd"/>
+            <w:r>
+              <w:rPr>
+                <w:rFonts w:ascii="Arial" w:eastAsia="Arial" w:hAnsi="Arial" w:cs="Arial"/>
+                <w:b/>
+                <w:bCs/>
+                <w:color w:val="2C3E50"/>
+                <w:sz w:val="21"/>
+                <w:szCs w:val="21"/>
+              </w:rPr>
+              <w:t xml:space="preserve"> </w:t>
+            </w:r>
+            <w:proofErr w:type="spellStart"/>
+            <w:r>
+              <w:rPr>
+                <w:rFonts w:ascii="Arial" w:eastAsia="Arial" w:hAnsi="Arial" w:cs="Arial"/>
+                <w:b/>
+                <w:bCs/>
+                <w:color w:val="2C3E50"/>
+                <w:sz w:val="21"/>
+                <w:szCs w:val="21"/>
+              </w:rPr>
+              <w:t>before</w:t>
+            </w:r>
+            <w:proofErr w:type="spellEnd"/>
+            <w:r>
+              <w:rPr>
+                <w:rFonts w:ascii="Arial" w:eastAsia="Arial" w:hAnsi="Arial" w:cs="Arial"/>
+                <w:b/>
+                <w:bCs/>
+                <w:color w:val="2C3E50"/>
+                <w:sz w:val="21"/>
+                <w:szCs w:val="21"/>
+              </w:rPr>
+              <w:t xml:space="preserve"> </w:t>
+            </w:r>
+            <w:proofErr w:type="spellStart"/>
+            <w:r>
+              <w:rPr>
+                <w:rFonts w:ascii="Arial" w:eastAsia="Arial" w:hAnsi="Arial" w:cs="Arial"/>
+                <w:b/>
+                <w:bCs/>
+                <w:color w:val="2C3E50"/>
+                <w:sz w:val="21"/>
+                <w:szCs w:val="21"/>
+              </w:rPr>
+              <w:t>merging</w:t>
+            </w:r>
+            <w:proofErr w:type="spellEnd"/>
+            <w:r>
+              <w:rPr>
+                <w:rFonts w:ascii="Arial" w:eastAsia="Arial" w:hAnsi="Arial" w:cs="Arial"/>
+                <w:b/>
+                <w:bCs/>
+                <w:color w:val="2C3E50"/>
+                <w:sz w:val="21"/>
+                <w:szCs w:val="21"/>
+              </w:rPr>
+              <w:t>.</w:t>
             </w:r>
           </w:p>
           <w:p>
@@ -3440,7 +4633,47 @@
                 <w:sz w:val="21"/>
                 <w:szCs w:val="21"/>
               </w:rPr>
-              <w:t>Impede que você (ou terceiros) alterem o código de produção direto. Toda mudança precisará passar por um processo de revisão (Pull Request).</w:t>
+              <w:t>Impede que você (ou terceiros) alterem o código de produção direto. Toda mudança precisará passar por um processo de revisão (</w:t>
+            </w:r>
+            <w:proofErr w:type="spellStart"/>
+            <w:r>
+              <w:rPr>
+                <w:rFonts w:ascii="Arial" w:eastAsia="Arial" w:hAnsi="Arial" w:cs="Arial"/>
+                <w:color w:val="2C3E50"/>
+                <w:sz w:val="21"/>
+                <w:szCs w:val="21"/>
+              </w:rPr>
+              <w:t>Pull</w:t>
+            </w:r>
+            <w:proofErr w:type="spellEnd"/>
+            <w:r>
+              <w:rPr>
+                <w:rFonts w:ascii="Arial" w:eastAsia="Arial" w:hAnsi="Arial" w:cs="Arial"/>
+                <w:color w:val="2C3E50"/>
+                <w:sz w:val="21"/>
+                <w:szCs w:val="21"/>
+              </w:rPr>
+              <w:t xml:space="preserve"> </w:t>
+            </w:r>
+            <w:proofErr w:type="spellStart"/>
+            <w:r>
+              <w:rPr>
+                <w:rFonts w:ascii="Arial" w:eastAsia="Arial" w:hAnsi="Arial" w:cs="Arial"/>
+                <w:color w:val="2C3E50"/>
+                <w:sz w:val="21"/>
+                <w:szCs w:val="21"/>
+              </w:rPr>
+              <w:t>Request</w:t>
+            </w:r>
+            <w:proofErr w:type="spellEnd"/>
+            <w:r>
+              <w:rPr>
+                <w:rFonts w:ascii="Arial" w:eastAsia="Arial" w:hAnsi="Arial" w:cs="Arial"/>
+                <w:color w:val="2C3E50"/>
+                <w:sz w:val="21"/>
+                <w:szCs w:val="21"/>
+              </w:rPr>
+              <w:t>).</w:t>
             </w:r>
           </w:p>
           <w:p>
@@ -3514,7 +4747,31 @@
                 <w:sz w:val="21"/>
                 <w:szCs w:val="21"/>
               </w:rPr>
-              <w:t xml:space="preserve"> Settings &gt; Collaborators, </w:t>
+              <w:t xml:space="preserve"> Settings &gt; </w:t>
+            </w:r>
+            <w:proofErr w:type="spellStart"/>
+            <w:r>
+              <w:rPr>
+                <w:rFonts w:ascii="Arial" w:eastAsia="Arial" w:hAnsi="Arial" w:cs="Arial"/>
+                <w:b/>
+                <w:bCs/>
+                <w:color w:val="2C3E50"/>
+                <w:sz w:val="21"/>
+                <w:szCs w:val="21"/>
+              </w:rPr>
+              <w:t>Collaborators</w:t>
+            </w:r>
+            <w:proofErr w:type="spellEnd"/>
+            <w:r>
+              <w:rPr>
+                <w:rFonts w:ascii="Arial" w:eastAsia="Arial" w:hAnsi="Arial" w:cs="Arial"/>
+                <w:b/>
+                <w:bCs/>
+                <w:color w:val="2C3E50"/>
+                <w:sz w:val="21"/>
+                <w:szCs w:val="21"/>
+              </w:rPr>
+              <w:t xml:space="preserve">, </w:t>
             </w:r>
             <w:r>
               <w:rPr>
@@ -3644,8 +4901,39 @@
                 <w:sz w:val="21"/>
                 <w:szCs w:val="21"/>
               </w:rPr>
-              <w:t>Apagar o arquivo ou fazer um novo commit não apaga o histórico do Git</w:t>
-            </w:r>
+              <w:t xml:space="preserve">Apagar o arquivo ou fazer um novo </w:t>
+            </w:r>
+            <w:proofErr w:type="spellStart"/>
+            <w:r>
+              <w:rPr>
+                <w:rFonts w:ascii="Arial" w:eastAsia="Arial" w:hAnsi="Arial" w:cs="Arial"/>
+                <w:color w:val="2C3E50"/>
+                <w:sz w:val="21"/>
+                <w:szCs w:val="21"/>
+              </w:rPr>
+              <w:t>commit</w:t>
+            </w:r>
+            <w:proofErr w:type="spellEnd"/>
+            <w:r>
+              <w:rPr>
+                <w:rFonts w:ascii="Arial" w:eastAsia="Arial" w:hAnsi="Arial" w:cs="Arial"/>
+                <w:color w:val="2C3E50"/>
+                <w:sz w:val="21"/>
+                <w:szCs w:val="21"/>
+              </w:rPr>
+              <w:t xml:space="preserve"> não apaga o histórico do </w:t>
+            </w:r>
+            <w:proofErr w:type="spellStart"/>
+            <w:r>
+              <w:rPr>
+                <w:rFonts w:ascii="Arial" w:eastAsia="Arial" w:hAnsi="Arial" w:cs="Arial"/>
+                <w:color w:val="2C3E50"/>
+                <w:sz w:val="21"/>
+                <w:szCs w:val="21"/>
+              </w:rPr>
+              <w:t>Git</w:t>
+            </w:r>
+            <w:proofErr w:type="spellEnd"/>
             <w:r>
               <w:rPr>
                 <w:rFonts w:ascii="Arial" w:eastAsia="Arial" w:hAnsi="Arial" w:cs="Arial"/>
@@ -3702,17 +4990,9 @@
                 <w:sz w:val="21"/>
                 <w:szCs w:val="21"/>
               </w:rPr>
-              <w:t>BFG Repo-Cleaner</w:t>
-            </w:r>
-            <w:r>
-              <w:rPr>
-                <w:rFonts w:ascii="Arial" w:eastAsia="Arial" w:hAnsi="Arial" w:cs="Arial"/>
-                <w:color w:val="2C3E50"/>
-                <w:sz w:val="21"/>
-                <w:szCs w:val="21"/>
-              </w:rPr>
-              <w:t xml:space="preserve"> ou o comando </w:t>
-            </w:r>
+              <w:t xml:space="preserve">BFG </w:t>
+            </w:r>
+            <w:proofErr w:type="spellStart"/>
             <w:r>
               <w:rPr>
                 <w:rFonts w:ascii="Arial" w:eastAsia="Arial" w:hAnsi="Arial" w:cs="Arial"/>
@@ -3722,7 +5002,65 @@
                 <w:sz w:val="21"/>
                 <w:szCs w:val="21"/>
               </w:rPr>
-              <w:t>git filter-repo.</w:t>
+              <w:t>Repo-Cleaner</w:t>
+            </w:r>
+            <w:proofErr w:type="spellEnd"/>
+            <w:r>
+              <w:rPr>
+                <w:rFonts w:ascii="Arial" w:eastAsia="Arial" w:hAnsi="Arial" w:cs="Arial"/>
+                <w:color w:val="2C3E50"/>
+                <w:sz w:val="21"/>
+                <w:szCs w:val="21"/>
+              </w:rPr>
+              <w:t xml:space="preserve"> ou o comando </w:t>
+            </w:r>
+            <w:proofErr w:type="spellStart"/>
+            <w:r>
+              <w:rPr>
+                <w:rFonts w:ascii="Arial" w:eastAsia="Arial" w:hAnsi="Arial" w:cs="Arial"/>
+                <w:i/>
+                <w:iCs/>
+                <w:color w:val="2C3E50"/>
+                <w:sz w:val="21"/>
+                <w:szCs w:val="21"/>
+              </w:rPr>
+              <w:t>git</w:t>
+            </w:r>
+            <w:proofErr w:type="spellEnd"/>
+            <w:r>
+              <w:rPr>
+                <w:rFonts w:ascii="Arial" w:eastAsia="Arial" w:hAnsi="Arial" w:cs="Arial"/>
+                <w:i/>
+                <w:iCs/>
+                <w:color w:val="2C3E50"/>
+                <w:sz w:val="21"/>
+                <w:szCs w:val="21"/>
+              </w:rPr>
+              <w:t xml:space="preserve"> </w:t>
+            </w:r>
+            <w:proofErr w:type="spellStart"/>
+            <w:r>
+              <w:rPr>
+                <w:rFonts w:ascii="Arial" w:eastAsia="Arial" w:hAnsi="Arial" w:cs="Arial"/>
+                <w:i/>
+                <w:iCs/>
+                <w:color w:val="2C3E50"/>
+                <w:sz w:val="21"/>
+                <w:szCs w:val="21"/>
+              </w:rPr>
+              <w:t>filter-repo</w:t>
+            </w:r>
+            <w:proofErr w:type="spellEnd"/>
+            <w:r>
+              <w:rPr>
+                <w:rFonts w:ascii="Arial" w:eastAsia="Arial" w:hAnsi="Arial" w:cs="Arial"/>
+                <w:i/>
+                <w:iCs/>
+                <w:color w:val="2C3E50"/>
+                <w:sz w:val="21"/>
+                <w:szCs w:val="21"/>
+              </w:rPr>
+              <w:t>.</w:t>
             </w:r>
           </w:p>
           <w:p>
@@ -3832,7 +5170,31 @@
                 <w:sz w:val="22"/>
                 <w:szCs w:val="22"/>
               </w:rPr>
-              <w:t>Estou chegando ao final do meu Bootcamp e preciso colocar em produção o meu GitHub Pages. Quais são as diretrizes para que meu portfólio tenha impacto profissional e esteja pronto para ser apresentado a recrutadores e professores?</w:t>
+              <w:t xml:space="preserve">Estou chegando ao final do meu </w:t>
+            </w:r>
+            <w:proofErr w:type="spellStart"/>
+            <w:r>
+              <w:rPr>
+                <w:rFonts w:ascii="Arial" w:eastAsia="Arial" w:hAnsi="Arial" w:cs="Arial"/>
+                <w:i/>
+                <w:iCs/>
+                <w:color w:val="1E3A5F"/>
+                <w:sz w:val="22"/>
+                <w:szCs w:val="22"/>
+              </w:rPr>
+              <w:t>Bootcamp</w:t>
+            </w:r>
+            <w:proofErr w:type="spellEnd"/>
+            <w:r>
+              <w:rPr>
+                <w:rFonts w:ascii="Arial" w:eastAsia="Arial" w:hAnsi="Arial" w:cs="Arial"/>
+                <w:i/>
+                <w:iCs/>
+                <w:color w:val="1E3A5F"/>
+                <w:sz w:val="22"/>
+                <w:szCs w:val="22"/>
+              </w:rPr>
+              <w:t xml:space="preserve"> e preciso colocar em produção o meu GitHub Pages. Quais são as diretrizes para que meu portfólio tenha impacto profissional e esteja pronto para ser apresentado a recrutadores e professores?</w:t>
             </w:r>
           </w:p>
         </w:tc>
@@ -3912,6 +5274,7 @@
               </w:rPr>
               <w:t xml:space="preserve">Para causar um excelente impacto profissional com o seu </w:t>
             </w:r>
+            <w:proofErr w:type="spellStart"/>
             <w:r>
               <w:rPr>
                 <w:rFonts w:ascii="Arial" w:eastAsia="Arial" w:hAnsi="Arial" w:cs="Arial"/>
@@ -3923,6 +5286,7 @@
               </w:rPr>
               <w:t>PortfolioHUB</w:t>
             </w:r>
+            <w:proofErr w:type="spellEnd"/>
             <w:r>
               <w:rPr>
                 <w:rFonts w:ascii="Arial" w:eastAsia="Arial" w:hAnsi="Arial" w:cs="Arial"/>
@@ -4056,7 +5420,27 @@
                 <w:sz w:val="21"/>
                 <w:szCs w:val="21"/>
               </w:rPr>
-              <w:t xml:space="preserve"> Explique o que é o PortfolioHUB e qual o objetivo dele.</w:t>
+              <w:t xml:space="preserve"> Explique o que é o </w:t>
+            </w:r>
+            <w:proofErr w:type="spellStart"/>
+            <w:r>
+              <w:rPr>
+                <w:rFonts w:ascii="Arial" w:eastAsia="Arial" w:hAnsi="Arial" w:cs="Arial"/>
+                <w:color w:val="2C3E50"/>
+                <w:sz w:val="21"/>
+                <w:szCs w:val="21"/>
+              </w:rPr>
+              <w:t>PortfolioHUB</w:t>
+            </w:r>
+            <w:proofErr w:type="spellEnd"/>
+            <w:r>
+              <w:rPr>
+                <w:rFonts w:ascii="Arial" w:eastAsia="Arial" w:hAnsi="Arial" w:cs="Arial"/>
+                <w:color w:val="2C3E50"/>
+                <w:sz w:val="21"/>
+                <w:szCs w:val="21"/>
+              </w:rPr>
+              <w:t xml:space="preserve"> e qual o objetivo dele.</w:t>
             </w:r>
           </w:p>
           <w:p>
@@ -4092,7 +5476,67 @@
                 <w:sz w:val="21"/>
                 <w:szCs w:val="21"/>
               </w:rPr>
-              <w:t xml:space="preserve"> Liste as ferramentas utilizadas (ex: HTML/CSS, JavaScript, Python, etc.) usando badges visuais.</w:t>
+              <w:t xml:space="preserve"> Liste as ferramentas utilizadas (</w:t>
+            </w:r>
+            <w:proofErr w:type="spellStart"/>
+            <w:r>
+              <w:rPr>
+                <w:rFonts w:ascii="Arial" w:eastAsia="Arial" w:hAnsi="Arial" w:cs="Arial"/>
+                <w:color w:val="2C3E50"/>
+                <w:sz w:val="21"/>
+                <w:szCs w:val="21"/>
+              </w:rPr>
+              <w:t>ex</w:t>
+            </w:r>
+            <w:proofErr w:type="spellEnd"/>
+            <w:r>
+              <w:rPr>
+                <w:rFonts w:ascii="Arial" w:eastAsia="Arial" w:hAnsi="Arial" w:cs="Arial"/>
+                <w:color w:val="2C3E50"/>
+                <w:sz w:val="21"/>
+                <w:szCs w:val="21"/>
+              </w:rPr>
+              <w:t xml:space="preserve">: HTML/CSS, </w:t>
+            </w:r>
+            <w:proofErr w:type="spellStart"/>
+            <w:r>
+              <w:rPr>
+                <w:rFonts w:ascii="Arial" w:eastAsia="Arial" w:hAnsi="Arial" w:cs="Arial"/>
+                <w:color w:val="2C3E50"/>
+                <w:sz w:val="21"/>
+                <w:szCs w:val="21"/>
+              </w:rPr>
+              <w:t>JavaScript</w:t>
+            </w:r>
+            <w:proofErr w:type="spellEnd"/>
+            <w:r>
+              <w:rPr>
+                <w:rFonts w:ascii="Arial" w:eastAsia="Arial" w:hAnsi="Arial" w:cs="Arial"/>
+                <w:color w:val="2C3E50"/>
+                <w:sz w:val="21"/>
+                <w:szCs w:val="21"/>
+              </w:rPr>
+              <w:t xml:space="preserve">, Python, etc.) usando </w:t>
+            </w:r>
+            <w:proofErr w:type="spellStart"/>
+            <w:r>
+              <w:rPr>
+                <w:rFonts w:ascii="Arial" w:eastAsia="Arial" w:hAnsi="Arial" w:cs="Arial"/>
+                <w:color w:val="2C3E50"/>
+                <w:sz w:val="21"/>
+                <w:szCs w:val="21"/>
+              </w:rPr>
+              <w:t>badges</w:t>
+            </w:r>
+            <w:proofErr w:type="spellEnd"/>
+            <w:r>
+              <w:rPr>
+                <w:rFonts w:ascii="Arial" w:eastAsia="Arial" w:hAnsi="Arial" w:cs="Arial"/>
+                <w:color w:val="2C3E50"/>
+                <w:sz w:val="21"/>
+                <w:szCs w:val="21"/>
+              </w:rPr>
+              <w:t xml:space="preserve"> visuais.</w:t>
             </w:r>
           </w:p>
           <w:p>
@@ -4282,7 +5726,27 @@
                 <w:sz w:val="21"/>
                 <w:szCs w:val="21"/>
               </w:rPr>
-              <w:t xml:space="preserve"> Foque no impacto (ex: </w:t>
+              <w:t xml:space="preserve"> Foque no impacto (</w:t>
+            </w:r>
+            <w:proofErr w:type="spellStart"/>
+            <w:r>
+              <w:rPr>
+                <w:rFonts w:ascii="Arial" w:eastAsia="Arial" w:hAnsi="Arial" w:cs="Arial"/>
+                <w:color w:val="2C3E50"/>
+                <w:sz w:val="21"/>
+                <w:szCs w:val="21"/>
+              </w:rPr>
+              <w:t>ex</w:t>
+            </w:r>
+            <w:proofErr w:type="spellEnd"/>
+            <w:r>
+              <w:rPr>
+                <w:rFonts w:ascii="Arial" w:eastAsia="Arial" w:hAnsi="Arial" w:cs="Arial"/>
+                <w:color w:val="2C3E50"/>
+                <w:sz w:val="21"/>
+                <w:szCs w:val="21"/>
+              </w:rPr>
+              <w:t xml:space="preserve">: </w:t>
             </w:r>
             <w:r>
               <w:rPr>
@@ -4430,7 +5894,31 @@
                 <w:sz w:val="21"/>
                 <w:szCs w:val="21"/>
               </w:rPr>
-              <w:t>target="_blank"</w:t>
+              <w:t>target="_</w:t>
+            </w:r>
+            <w:proofErr w:type="spellStart"/>
+            <w:r>
+              <w:rPr>
+                <w:rFonts w:ascii="Arial" w:eastAsia="Arial" w:hAnsi="Arial" w:cs="Arial"/>
+                <w:i/>
+                <w:iCs/>
+                <w:color w:val="2C3E50"/>
+                <w:sz w:val="21"/>
+                <w:szCs w:val="21"/>
+              </w:rPr>
+              <w:t>blank</w:t>
+            </w:r>
+            <w:proofErr w:type="spellEnd"/>
+            <w:r>
+              <w:rPr>
+                <w:rFonts w:ascii="Arial" w:eastAsia="Arial" w:hAnsi="Arial" w:cs="Arial"/>
+                <w:i/>
+                <w:iCs/>
+                <w:color w:val="2C3E50"/>
+                <w:sz w:val="21"/>
+                <w:szCs w:val="21"/>
+              </w:rPr>
+              <w:t>"</w:t>
             </w:r>
             <w:r>
               <w:rPr>
@@ -4704,7 +6192,31 @@
                 <w:sz w:val="22"/>
                 <w:szCs w:val="22"/>
               </w:rPr>
-              <w:t xml:space="preserve">Desejo fazer uma apresentação final do meu PortfolioHUB em um vídeo a ser publicado no YouTube, com duração de aproximadamente 5 minutos. Quero a </w:t>
+              <w:t xml:space="preserve">Desejo fazer uma apresentação final do meu </w:t>
+            </w:r>
+            <w:proofErr w:type="spellStart"/>
+            <w:r>
+              <w:rPr>
+                <w:rFonts w:ascii="Arial" w:eastAsia="Arial" w:hAnsi="Arial" w:cs="Arial"/>
+                <w:i/>
+                <w:iCs/>
+                <w:color w:val="1E3A5F"/>
+                <w:sz w:val="22"/>
+                <w:szCs w:val="22"/>
+              </w:rPr>
+              <w:t>PortfolioHUB</w:t>
+            </w:r>
+            <w:proofErr w:type="spellEnd"/>
+            <w:r>
+              <w:rPr>
+                <w:rFonts w:ascii="Arial" w:eastAsia="Arial" w:hAnsi="Arial" w:cs="Arial"/>
+                <w:i/>
+                <w:iCs/>
+                <w:color w:val="1E3A5F"/>
+                <w:sz w:val="22"/>
+                <w:szCs w:val="22"/>
+              </w:rPr>
+              <w:t xml:space="preserve"> em um vídeo a ser publicado no YouTube, com duração de aproximadamente 5 minutos. Quero a </w:t>
             </w:r>
             <w:r>
               <w:rPr>
@@ -4947,7 +6459,47 @@
                 <w:sz w:val="21"/>
                 <w:szCs w:val="21"/>
               </w:rPr>
-              <w:t xml:space="preserve"> "Olá a todos! Meu nome é Gustavo, sou estudante de Ciência de Dados e Machine Learning no CEUB. Estou concluindo o meu Bootcamp I e hoje vou apresentar o PortfolioHUB: o ecossistema digital que centraliza e demonstra os meus projetos práticos e a minha evolução técnica na área de dados."</w:t>
+              <w:t xml:space="preserve"> "Olá a todos! Meu nome é Gustavo, sou estudante de Ciência de Dados e Machine Learning no CEUB. Estou concluindo o meu </w:t>
+            </w:r>
+            <w:proofErr w:type="spellStart"/>
+            <w:r>
+              <w:rPr>
+                <w:rFonts w:ascii="Arial" w:eastAsia="Arial" w:hAnsi="Arial" w:cs="Arial"/>
+                <w:color w:val="2C3E50"/>
+                <w:sz w:val="21"/>
+                <w:szCs w:val="21"/>
+              </w:rPr>
+              <w:t>Bootcamp</w:t>
+            </w:r>
+            <w:proofErr w:type="spellEnd"/>
+            <w:r>
+              <w:rPr>
+                <w:rFonts w:ascii="Arial" w:eastAsia="Arial" w:hAnsi="Arial" w:cs="Arial"/>
+                <w:color w:val="2C3E50"/>
+                <w:sz w:val="21"/>
+                <w:szCs w:val="21"/>
+              </w:rPr>
+              <w:t xml:space="preserve"> I e hoje vou apresentar o </w:t>
+            </w:r>
+            <w:proofErr w:type="spellStart"/>
+            <w:r>
+              <w:rPr>
+                <w:rFonts w:ascii="Arial" w:eastAsia="Arial" w:hAnsi="Arial" w:cs="Arial"/>
+                <w:color w:val="2C3E50"/>
+                <w:sz w:val="21"/>
+                <w:szCs w:val="21"/>
+              </w:rPr>
+              <w:t>PortfolioHUB</w:t>
+            </w:r>
+            <w:proofErr w:type="spellEnd"/>
+            <w:r>
+              <w:rPr>
+                <w:rFonts w:ascii="Arial" w:eastAsia="Arial" w:hAnsi="Arial" w:cs="Arial"/>
+                <w:color w:val="2C3E50"/>
+                <w:sz w:val="21"/>
+                <w:szCs w:val="21"/>
+              </w:rPr>
+              <w:t>: o ecossistema digital que centraliza e demonstra os meus projetos práticos e a minha evolução técnica na área de dados."</w:t>
             </w:r>
           </w:p>
           <w:p>
@@ -5010,7 +6562,27 @@
                 <w:sz w:val="21"/>
                 <w:szCs w:val="21"/>
               </w:rPr>
-              <w:t>Compartilhamento de tela navegando pelo seu repositório Gustavolg95/PortfolioHUB. Mostre o README.md.</w:t>
+              <w:t>Compartilhamento de tela navegando pelo seu repositório Gustavolg95/</w:t>
+            </w:r>
+            <w:proofErr w:type="spellStart"/>
+            <w:r>
+              <w:rPr>
+                <w:rFonts w:ascii="Arial" w:eastAsia="Arial" w:hAnsi="Arial" w:cs="Arial"/>
+                <w:color w:val="2C3E50"/>
+                <w:sz w:val="21"/>
+                <w:szCs w:val="21"/>
+              </w:rPr>
+              <w:t>PortfolioHUB</w:t>
+            </w:r>
+            <w:proofErr w:type="spellEnd"/>
+            <w:r>
+              <w:rPr>
+                <w:rFonts w:ascii="Arial" w:eastAsia="Arial" w:hAnsi="Arial" w:cs="Arial"/>
+                <w:color w:val="2C3E50"/>
+                <w:sz w:val="21"/>
+                <w:szCs w:val="21"/>
+              </w:rPr>
+              <w:t>. Mostre o README.md.</w:t>
             </w:r>
           </w:p>
           <w:p>
@@ -5109,7 +6681,38 @@
                 <w:sz w:val="21"/>
                 <w:szCs w:val="21"/>
               </w:rPr>
-              <w:t>Tela do código mostrando o arquivo .gitignore ou as configurações de segurança do GitHub (</w:t>
+              <w:t xml:space="preserve">Tela do código mostrando o </w:t>
+            </w:r>
+            <w:proofErr w:type="gramStart"/>
+            <w:r>
+              <w:rPr>
+                <w:rFonts w:ascii="Arial" w:eastAsia="Arial" w:hAnsi="Arial" w:cs="Arial"/>
+                <w:color w:val="2C3E50"/>
+                <w:sz w:val="21"/>
+                <w:szCs w:val="21"/>
+              </w:rPr>
+              <w:t>arquivo .</w:t>
+            </w:r>
+            <w:proofErr w:type="spellStart"/>
+            <w:r>
+              <w:rPr>
+                <w:rFonts w:ascii="Arial" w:eastAsia="Arial" w:hAnsi="Arial" w:cs="Arial"/>
+                <w:color w:val="2C3E50"/>
+                <w:sz w:val="21"/>
+                <w:szCs w:val="21"/>
+              </w:rPr>
+              <w:t>gitignore</w:t>
+            </w:r>
+            <w:proofErr w:type="spellEnd"/>
+            <w:proofErr w:type="gramEnd"/>
+            <w:r>
+              <w:rPr>
+                <w:rFonts w:ascii="Arial" w:eastAsia="Arial" w:hAnsi="Arial" w:cs="Arial"/>
+                <w:color w:val="2C3E50"/>
+                <w:sz w:val="21"/>
+                <w:szCs w:val="21"/>
+              </w:rPr>
+              <w:t xml:space="preserve"> ou as configurações de segurança do GitHub (</w:t>
             </w:r>
             <w:r>
               <w:rPr>
@@ -5120,7 +6723,31 @@
                 <w:sz w:val="21"/>
                 <w:szCs w:val="21"/>
               </w:rPr>
-              <w:t>Settings &gt; Code Security</w:t>
+              <w:t xml:space="preserve">Settings &gt; </w:t>
+            </w:r>
+            <w:proofErr w:type="spellStart"/>
+            <w:r>
+              <w:rPr>
+                <w:rFonts w:ascii="Arial" w:eastAsia="Arial" w:hAnsi="Arial" w:cs="Arial"/>
+                <w:i/>
+                <w:iCs/>
+                <w:color w:val="2C3E50"/>
+                <w:sz w:val="21"/>
+                <w:szCs w:val="21"/>
+              </w:rPr>
+              <w:t>Code</w:t>
+            </w:r>
+            <w:proofErr w:type="spellEnd"/>
+            <w:r>
+              <w:rPr>
+                <w:rFonts w:ascii="Arial" w:eastAsia="Arial" w:hAnsi="Arial" w:cs="Arial"/>
+                <w:i/>
+                <w:iCs/>
+                <w:color w:val="2C3E50"/>
+                <w:sz w:val="21"/>
+                <w:szCs w:val="21"/>
+              </w:rPr>
+              <w:t xml:space="preserve"> Security</w:t>
             </w:r>
             <w:r>
               <w:rPr>
@@ -5165,8 +6792,40 @@
                 <w:sz w:val="21"/>
                 <w:szCs w:val="21"/>
               </w:rPr>
-              <w:t xml:space="preserve">"Um portfólio público exige cuidados. Para garantir a segurança dos dados, adotei três práticas essenciais: primeiro, o uso rigoroso do .gitignore para impedir o vazamento de chaves de API e arquivos de configuração local. Segundo, ativei o </w:t>
-            </w:r>
+              <w:t xml:space="preserve">"Um portfólio público exige cuidados. Para garantir a segurança dos dados, adotei três práticas essenciais: primeiro, o uso rigoroso </w:t>
+            </w:r>
+            <w:proofErr w:type="gramStart"/>
+            <w:r>
+              <w:rPr>
+                <w:rFonts w:ascii="Arial" w:eastAsia="Arial" w:hAnsi="Arial" w:cs="Arial"/>
+                <w:color w:val="2C3E50"/>
+                <w:sz w:val="21"/>
+                <w:szCs w:val="21"/>
+              </w:rPr>
+              <w:t>do .</w:t>
+            </w:r>
+            <w:proofErr w:type="spellStart"/>
+            <w:r>
+              <w:rPr>
+                <w:rFonts w:ascii="Arial" w:eastAsia="Arial" w:hAnsi="Arial" w:cs="Arial"/>
+                <w:color w:val="2C3E50"/>
+                <w:sz w:val="21"/>
+                <w:szCs w:val="21"/>
+              </w:rPr>
+              <w:t>gitignore</w:t>
+            </w:r>
+            <w:proofErr w:type="spellEnd"/>
+            <w:proofErr w:type="gramEnd"/>
+            <w:r>
+              <w:rPr>
+                <w:rFonts w:ascii="Arial" w:eastAsia="Arial" w:hAnsi="Arial" w:cs="Arial"/>
+                <w:color w:val="2C3E50"/>
+                <w:sz w:val="21"/>
+                <w:szCs w:val="21"/>
+              </w:rPr>
+              <w:t xml:space="preserve"> para impedir o vazamento de chaves de API e arquivos de configuração local. Segundo, ativei o </w:t>
+            </w:r>
+            <w:proofErr w:type="spellStart"/>
             <w:r>
               <w:rPr>
                 <w:rFonts w:ascii="Arial" w:eastAsia="Arial" w:hAnsi="Arial" w:cs="Arial"/>
@@ -5176,17 +6835,9 @@
                 <w:sz w:val="21"/>
                 <w:szCs w:val="21"/>
               </w:rPr>
-              <w:t>Secret Scanning</w:t>
-            </w:r>
-            <w:r>
-              <w:rPr>
-                <w:rFonts w:ascii="Arial" w:eastAsia="Arial" w:hAnsi="Arial" w:cs="Arial"/>
-                <w:color w:val="2C3E50"/>
-                <w:sz w:val="21"/>
-                <w:szCs w:val="21"/>
-              </w:rPr>
-              <w:t xml:space="preserve"> do GitHub para bloquear qualquer credencial por acidente. E terceiro, configurei alertas do </w:t>
-            </w:r>
+              <w:t>Secret</w:t>
+            </w:r>
+            <w:proofErr w:type="spellEnd"/>
             <w:r>
               <w:rPr>
                 <w:rFonts w:ascii="Arial" w:eastAsia="Arial" w:hAnsi="Arial" w:cs="Arial"/>
@@ -5196,16 +6847,71 @@
                 <w:sz w:val="21"/>
                 <w:szCs w:val="21"/>
               </w:rPr>
+              <w:t xml:space="preserve"> </w:t>
+            </w:r>
+            <w:proofErr w:type="spellStart"/>
+            <w:r>
+              <w:rPr>
+                <w:rFonts w:ascii="Arial" w:eastAsia="Arial" w:hAnsi="Arial" w:cs="Arial"/>
+                <w:i/>
+                <w:iCs/>
+                <w:color w:val="2C3E50"/>
+                <w:sz w:val="21"/>
+                <w:szCs w:val="21"/>
+              </w:rPr>
+              <w:t>Scanning</w:t>
+            </w:r>
+            <w:proofErr w:type="spellEnd"/>
+            <w:r>
+              <w:rPr>
+                <w:rFonts w:ascii="Arial" w:eastAsia="Arial" w:hAnsi="Arial" w:cs="Arial"/>
+                <w:color w:val="2C3E50"/>
+                <w:sz w:val="21"/>
+                <w:szCs w:val="21"/>
+              </w:rPr>
+              <w:t xml:space="preserve"> do GitHub para bloquear qualquer credencial por acidente. E terceiro, configurei alertas do </w:t>
+            </w:r>
+            <w:proofErr w:type="spellStart"/>
+            <w:r>
+              <w:rPr>
+                <w:rFonts w:ascii="Arial" w:eastAsia="Arial" w:hAnsi="Arial" w:cs="Arial"/>
+                <w:i/>
+                <w:iCs/>
+                <w:color w:val="2C3E50"/>
+                <w:sz w:val="21"/>
+                <w:szCs w:val="21"/>
+              </w:rPr>
               <w:t>Dependabot</w:t>
             </w:r>
-            <w:r>
-              <w:rPr>
-                <w:rFonts w:ascii="Arial" w:eastAsia="Arial" w:hAnsi="Arial" w:cs="Arial"/>
-                <w:color w:val="2C3E50"/>
-                <w:sz w:val="21"/>
-                <w:szCs w:val="21"/>
-              </w:rPr>
-              <w:t xml:space="preserve"> para corrigir vulnerabilidades automaticamente, além de regras de proteção na branch principal."</w:t>
+            <w:proofErr w:type="spellEnd"/>
+            <w:r>
+              <w:rPr>
+                <w:rFonts w:ascii="Arial" w:eastAsia="Arial" w:hAnsi="Arial" w:cs="Arial"/>
+                <w:color w:val="2C3E50"/>
+                <w:sz w:val="21"/>
+                <w:szCs w:val="21"/>
+              </w:rPr>
+              <w:t xml:space="preserve"> para corrigir vulnerabilidades automaticamente, além de regras de proteção na </w:t>
+            </w:r>
+            <w:proofErr w:type="spellStart"/>
+            <w:r>
+              <w:rPr>
+                <w:rFonts w:ascii="Arial" w:eastAsia="Arial" w:hAnsi="Arial" w:cs="Arial"/>
+                <w:color w:val="2C3E50"/>
+                <w:sz w:val="21"/>
+                <w:szCs w:val="21"/>
+              </w:rPr>
+              <w:t>branch</w:t>
+            </w:r>
+            <w:proofErr w:type="spellEnd"/>
+            <w:r>
+              <w:rPr>
+                <w:rFonts w:ascii="Arial" w:eastAsia="Arial" w:hAnsi="Arial" w:cs="Arial"/>
+                <w:color w:val="2C3E50"/>
+                <w:sz w:val="21"/>
+                <w:szCs w:val="21"/>
+              </w:rPr>
+              <w:t xml:space="preserve"> principal."</w:t>
             </w:r>
           </w:p>
           <w:p>
@@ -5406,7 +7112,27 @@
                 <w:sz w:val="21"/>
                 <w:szCs w:val="21"/>
               </w:rPr>
-              <w:t>"Por fim, o PortfolioHUB está totalmente integrado à minha presença digital. O link está em destaque no meu LinkedIn, criando uma ponte direta para quem avalia meu perfil. Esse projeto consolida tudo o que aprendi até aqui no CEUB e marca o início da minha jornada no mercado de dados. Muito obrigado pela atenção, os links estão na descrição do vídeo e vamos nos conectar!"</w:t>
+              <w:t xml:space="preserve">"Por fim, o </w:t>
+            </w:r>
+            <w:proofErr w:type="spellStart"/>
+            <w:r>
+              <w:rPr>
+                <w:rFonts w:ascii="Arial" w:eastAsia="Arial" w:hAnsi="Arial" w:cs="Arial"/>
+                <w:color w:val="2C3E50"/>
+                <w:sz w:val="21"/>
+                <w:szCs w:val="21"/>
+              </w:rPr>
+              <w:t>PortfolioHUB</w:t>
+            </w:r>
+            <w:proofErr w:type="spellEnd"/>
+            <w:r>
+              <w:rPr>
+                <w:rFonts w:ascii="Arial" w:eastAsia="Arial" w:hAnsi="Arial" w:cs="Arial"/>
+                <w:color w:val="2C3E50"/>
+                <w:sz w:val="21"/>
+                <w:szCs w:val="21"/>
+              </w:rPr>
+              <w:t xml:space="preserve"> está totalmente integrado à minha presença digital. O link está em destaque no meu LinkedIn, criando uma ponte direta para quem avalia meu perfil. Esse projeto consolida tudo o que aprendi até aqui no CEUB e marca o início da minha jornada no mercado de dados. Muito obrigado pela atenção, os links estão na descrição do vídeo e vamos nos conectar!"</w:t>
             </w:r>
           </w:p>
           <w:p>
@@ -5861,8 +7587,59 @@
           <w:sz w:val="22"/>
           <w:szCs w:val="22"/>
         </w:rPr>
-        <w:t>Criar repositório público 'PortfolioHUB' no GitHub com branch main</w:t>
-      </w:r>
+        <w:t>Criar repositório público '</w:t>
+      </w:r>
+      <w:proofErr w:type="spellStart"/>
+      <w:r>
+        <w:rPr>
+          <w:rFonts w:ascii="Arial" w:eastAsia="Arial" w:hAnsi="Arial" w:cs="Arial"/>
+          <w:color w:val="2C3E50"/>
+          <w:sz w:val="22"/>
+          <w:szCs w:val="22"/>
+        </w:rPr>
+        <w:t>PortfolioHUB</w:t>
+      </w:r>
+      <w:proofErr w:type="spellEnd"/>
+      <w:r>
+        <w:rPr>
+          <w:rFonts w:ascii="Arial" w:eastAsia="Arial" w:hAnsi="Arial" w:cs="Arial"/>
+          <w:color w:val="2C3E50"/>
+          <w:sz w:val="22"/>
+          <w:szCs w:val="22"/>
+        </w:rPr>
+        <w:t xml:space="preserve">' no GitHub com </w:t>
+      </w:r>
+      <w:proofErr w:type="spellStart"/>
+      <w:r>
+        <w:rPr>
+          <w:rFonts w:ascii="Arial" w:eastAsia="Arial" w:hAnsi="Arial" w:cs="Arial"/>
+          <w:color w:val="2C3E50"/>
+          <w:sz w:val="22"/>
+          <w:szCs w:val="22"/>
+        </w:rPr>
+        <w:t>branch</w:t>
+      </w:r>
+      <w:proofErr w:type="spellEnd"/>
+      <w:r>
+        <w:rPr>
+          <w:rFonts w:ascii="Arial" w:eastAsia="Arial" w:hAnsi="Arial" w:cs="Arial"/>
+          <w:color w:val="2C3E50"/>
+          <w:sz w:val="22"/>
+          <w:szCs w:val="22"/>
+        </w:rPr>
+        <w:t xml:space="preserve"> </w:t>
+      </w:r>
+      <w:proofErr w:type="spellStart"/>
+      <w:r>
+        <w:rPr>
+          <w:rFonts w:ascii="Arial" w:eastAsia="Arial" w:hAnsi="Arial" w:cs="Arial"/>
+          <w:color w:val="2C3E50"/>
+          <w:sz w:val="22"/>
+          <w:szCs w:val="22"/>
+        </w:rPr>
+        <w:t>main</w:t>
+      </w:r>
+      <w:proofErr w:type="spellEnd"/>
     </w:p>
     <w:p>
       <w:pPr>
@@ -5881,7 +7658,27 @@
           <w:sz w:val="22"/>
           <w:szCs w:val="22"/>
         </w:rPr>
-        <w:t>Organizar estrutura de pastas: site/, certificados/, documentos/, apresentacoes/, projetos/</w:t>
+        <w:t xml:space="preserve">Organizar estrutura de pastas: site/, certificados/, documentos/, </w:t>
+      </w:r>
+      <w:proofErr w:type="spellStart"/>
+      <w:r>
+        <w:rPr>
+          <w:rFonts w:ascii="Arial" w:eastAsia="Arial" w:hAnsi="Arial" w:cs="Arial"/>
+          <w:color w:val="2C3E50"/>
+          <w:sz w:val="22"/>
+          <w:szCs w:val="22"/>
+        </w:rPr>
+        <w:t>apresentacoes</w:t>
+      </w:r>
+      <w:proofErr w:type="spellEnd"/>
+      <w:r>
+        <w:rPr>
+          <w:rFonts w:ascii="Arial" w:eastAsia="Arial" w:hAnsi="Arial" w:cs="Arial"/>
+          <w:color w:val="2C3E50"/>
+          <w:sz w:val="22"/>
+          <w:szCs w:val="22"/>
+        </w:rPr>
+        <w:t>/, projetos/</w:t>
       </w:r>
     </w:p>
     <w:p>
@@ -5921,8 +7718,30 @@
           <w:sz w:val="22"/>
           <w:szCs w:val="22"/>
         </w:rPr>
-        <w:t>Criar arquivo .gitignore</w:t>
-      </w:r>
+        <w:t xml:space="preserve">Criar </w:t>
+      </w:r>
+      <w:proofErr w:type="gramStart"/>
+      <w:r>
+        <w:rPr>
+          <w:rFonts w:ascii="Arial" w:eastAsia="Arial" w:hAnsi="Arial" w:cs="Arial"/>
+          <w:color w:val="2C3E50"/>
+          <w:sz w:val="22"/>
+          <w:szCs w:val="22"/>
+        </w:rPr>
+        <w:t>arquivo .</w:t>
+      </w:r>
+      <w:proofErr w:type="spellStart"/>
+      <w:r>
+        <w:rPr>
+          <w:rFonts w:ascii="Arial" w:eastAsia="Arial" w:hAnsi="Arial" w:cs="Arial"/>
+          <w:color w:val="2C3E50"/>
+          <w:sz w:val="22"/>
+          <w:szCs w:val="22"/>
+        </w:rPr>
+        <w:t>gitignore</w:t>
+      </w:r>
+      <w:proofErr w:type="spellEnd"/>
+      <w:proofErr w:type="gramEnd"/>
     </w:p>
     <w:p>
       <w:pPr>
@@ -5941,7 +7760,129 @@
           <w:sz w:val="22"/>
           <w:szCs w:val="22"/>
         </w:rPr>
-        <w:t>Adotar convenção semântica de commits: feat:, docs:, security:, fix:</w:t>
+        <w:t xml:space="preserve">Adotar convenção semântica de </w:t>
+      </w:r>
+      <w:proofErr w:type="spellStart"/>
+      <w:r>
+        <w:rPr>
+          <w:rFonts w:ascii="Arial" w:eastAsia="Arial" w:hAnsi="Arial" w:cs="Arial"/>
+          <w:color w:val="2C3E50"/>
+          <w:sz w:val="22"/>
+          <w:szCs w:val="22"/>
+        </w:rPr>
+        <w:t>commits</w:t>
+      </w:r>
+      <w:proofErr w:type="spellEnd"/>
+      <w:r>
+        <w:rPr>
+          <w:rFonts w:ascii="Arial" w:eastAsia="Arial" w:hAnsi="Arial" w:cs="Arial"/>
+          <w:color w:val="2C3E50"/>
+          <w:sz w:val="22"/>
+          <w:szCs w:val="22"/>
+        </w:rPr>
+        <w:t xml:space="preserve">: </w:t>
+      </w:r>
+      <w:proofErr w:type="gramStart"/>
+      <w:r>
+        <w:rPr>
+          <w:rFonts w:ascii="Arial" w:eastAsia="Arial" w:hAnsi="Arial" w:cs="Arial"/>
+          <w:color w:val="2C3E50"/>
+          <w:sz w:val="22"/>
+          <w:szCs w:val="22"/>
+        </w:rPr>
+        <w:t>feat:,</w:t>
+      </w:r>
+      <w:proofErr w:type="gramEnd"/>
+      <w:r>
+        <w:rPr>
+          <w:rFonts w:ascii="Arial" w:eastAsia="Arial" w:hAnsi="Arial" w:cs="Arial"/>
+          <w:color w:val="2C3E50"/>
+          <w:sz w:val="22"/>
+          <w:szCs w:val="22"/>
+        </w:rPr>
+        <w:t xml:space="preserve"> </w:t>
+      </w:r>
+      <w:proofErr w:type="spellStart"/>
+      <w:proofErr w:type="gramStart"/>
+      <w:r>
+        <w:rPr>
+          <w:rFonts w:ascii="Arial" w:eastAsia="Arial" w:hAnsi="Arial" w:cs="Arial"/>
+          <w:color w:val="2C3E50"/>
+          <w:sz w:val="22"/>
+          <w:szCs w:val="22"/>
+        </w:rPr>
+        <w:t>docs</w:t>
+      </w:r>
+      <w:proofErr w:type="spellEnd"/>
+      <w:r>
+        <w:rPr>
+          <w:rFonts w:ascii="Arial" w:eastAsia="Arial" w:hAnsi="Arial" w:cs="Arial"/>
+          <w:color w:val="2C3E50"/>
+          <w:sz w:val="22"/>
+          <w:szCs w:val="22"/>
+        </w:rPr>
+        <w:t>:,</w:t>
+      </w:r>
+      <w:proofErr w:type="gramEnd"/>
+      <w:r>
+        <w:rPr>
+          <w:rFonts w:ascii="Arial" w:eastAsia="Arial" w:hAnsi="Arial" w:cs="Arial"/>
+          <w:color w:val="2C3E50"/>
+          <w:sz w:val="22"/>
+          <w:szCs w:val="22"/>
+        </w:rPr>
+        <w:t xml:space="preserve"> </w:t>
+      </w:r>
+      <w:proofErr w:type="spellStart"/>
+      <w:proofErr w:type="gramStart"/>
+      <w:r>
+        <w:rPr>
+          <w:rFonts w:ascii="Arial" w:eastAsia="Arial" w:hAnsi="Arial" w:cs="Arial"/>
+          <w:color w:val="2C3E50"/>
+          <w:sz w:val="22"/>
+          <w:szCs w:val="22"/>
+        </w:rPr>
+        <w:t>security</w:t>
+      </w:r>
+      <w:proofErr w:type="spellEnd"/>
+      <w:r>
+        <w:rPr>
+          <w:rFonts w:ascii="Arial" w:eastAsia="Arial" w:hAnsi="Arial" w:cs="Arial"/>
+          <w:color w:val="2C3E50"/>
+          <w:sz w:val="22"/>
+          <w:szCs w:val="22"/>
+        </w:rPr>
+        <w:t>:,</w:t>
+      </w:r>
+      <w:proofErr w:type="gramEnd"/>
+      <w:r>
+        <w:rPr>
+          <w:rFonts w:ascii="Arial" w:eastAsia="Arial" w:hAnsi="Arial" w:cs="Arial"/>
+          <w:color w:val="2C3E50"/>
+          <w:sz w:val="22"/>
+          <w:szCs w:val="22"/>
+        </w:rPr>
+        <w:t xml:space="preserve"> </w:t>
+      </w:r>
+      <w:proofErr w:type="spellStart"/>
+      <w:r>
+        <w:rPr>
+          <w:rFonts w:ascii="Arial" w:eastAsia="Arial" w:hAnsi="Arial" w:cs="Arial"/>
+          <w:color w:val="2C3E50"/>
+          <w:sz w:val="22"/>
+          <w:szCs w:val="22"/>
+        </w:rPr>
+        <w:t>fix</w:t>
+      </w:r>
+      <w:proofErr w:type="spellEnd"/>
+      <w:r>
+        <w:rPr>
+          <w:rFonts w:ascii="Arial" w:eastAsia="Arial" w:hAnsi="Arial" w:cs="Arial"/>
+          <w:color w:val="2C3E50"/>
+          <w:sz w:val="22"/>
+          <w:szCs w:val="22"/>
+        </w:rPr>
+        <w:t>:</w:t>
       </w:r>
     </w:p>
     <w:p>
@@ -6017,14 +7958,107 @@
         <w:spacing w:after="100"/>
         <w:jc w:val="both"/>
       </w:pPr>
-      <w:r>
-        <w:rPr>
-          <w:rFonts w:ascii="Arial" w:eastAsia="Arial" w:hAnsi="Arial" w:cs="Arial"/>
-          <w:color w:val="2C3E50"/>
-          <w:sz w:val="22"/>
-          <w:szCs w:val="22"/>
-        </w:rPr>
-        <w:t>Configurar .gitignore completo protegendo .env, *.pem, *.key e arquivos de sistema</w:t>
+      <w:proofErr w:type="gramStart"/>
+      <w:r>
+        <w:rPr>
+          <w:rFonts w:ascii="Arial" w:eastAsia="Arial" w:hAnsi="Arial" w:cs="Arial"/>
+          <w:color w:val="2C3E50"/>
+          <w:sz w:val="22"/>
+          <w:szCs w:val="22"/>
+        </w:rPr>
+        <w:t>Configurar .</w:t>
+      </w:r>
+      <w:proofErr w:type="spellStart"/>
+      <w:r>
+        <w:rPr>
+          <w:rFonts w:ascii="Arial" w:eastAsia="Arial" w:hAnsi="Arial" w:cs="Arial"/>
+          <w:color w:val="2C3E50"/>
+          <w:sz w:val="22"/>
+          <w:szCs w:val="22"/>
+        </w:rPr>
+        <w:t>gitignore</w:t>
+      </w:r>
+      <w:proofErr w:type="spellEnd"/>
+      <w:proofErr w:type="gramEnd"/>
+      <w:r>
+        <w:rPr>
+          <w:rFonts w:ascii="Arial" w:eastAsia="Arial" w:hAnsi="Arial" w:cs="Arial"/>
+          <w:color w:val="2C3E50"/>
+          <w:sz w:val="22"/>
+          <w:szCs w:val="22"/>
+        </w:rPr>
+        <w:t xml:space="preserve"> completo </w:t>
+      </w:r>
+      <w:proofErr w:type="gramStart"/>
+      <w:r>
+        <w:rPr>
+          <w:rFonts w:ascii="Arial" w:eastAsia="Arial" w:hAnsi="Arial" w:cs="Arial"/>
+          <w:color w:val="2C3E50"/>
+          <w:sz w:val="22"/>
+          <w:szCs w:val="22"/>
+        </w:rPr>
+        <w:t>protegendo .</w:t>
+      </w:r>
+      <w:proofErr w:type="spellStart"/>
+      <w:r>
+        <w:rPr>
+          <w:rFonts w:ascii="Arial" w:eastAsia="Arial" w:hAnsi="Arial" w:cs="Arial"/>
+          <w:color w:val="2C3E50"/>
+          <w:sz w:val="22"/>
+          <w:szCs w:val="22"/>
+        </w:rPr>
+        <w:t>env</w:t>
+      </w:r>
+      <w:proofErr w:type="spellEnd"/>
+      <w:proofErr w:type="gramEnd"/>
+      <w:r>
+        <w:rPr>
+          <w:rFonts w:ascii="Arial" w:eastAsia="Arial" w:hAnsi="Arial" w:cs="Arial"/>
+          <w:color w:val="2C3E50"/>
+          <w:sz w:val="22"/>
+          <w:szCs w:val="22"/>
+        </w:rPr>
+        <w:t>, *.</w:t>
+      </w:r>
+      <w:proofErr w:type="spellStart"/>
+      <w:r>
+        <w:rPr>
+          <w:rFonts w:ascii="Arial" w:eastAsia="Arial" w:hAnsi="Arial" w:cs="Arial"/>
+          <w:color w:val="2C3E50"/>
+          <w:sz w:val="22"/>
+          <w:szCs w:val="22"/>
+        </w:rPr>
+        <w:t>pem</w:t>
+      </w:r>
+      <w:proofErr w:type="spellEnd"/>
+      <w:r>
+        <w:rPr>
+          <w:rFonts w:ascii="Arial" w:eastAsia="Arial" w:hAnsi="Arial" w:cs="Arial"/>
+          <w:color w:val="2C3E50"/>
+          <w:sz w:val="22"/>
+          <w:szCs w:val="22"/>
+        </w:rPr>
+        <w:t>, *.</w:t>
+      </w:r>
+      <w:proofErr w:type="spellStart"/>
+      <w:r>
+        <w:rPr>
+          <w:rFonts w:ascii="Arial" w:eastAsia="Arial" w:hAnsi="Arial" w:cs="Arial"/>
+          <w:color w:val="2C3E50"/>
+          <w:sz w:val="22"/>
+          <w:szCs w:val="22"/>
+        </w:rPr>
+        <w:t>key</w:t>
+      </w:r>
+      <w:proofErr w:type="spellEnd"/>
+      <w:r>
+        <w:rPr>
+          <w:rFonts w:ascii="Arial" w:eastAsia="Arial" w:hAnsi="Arial" w:cs="Arial"/>
+          <w:color w:val="2C3E50"/>
+          <w:sz w:val="22"/>
+          <w:szCs w:val="22"/>
+        </w:rPr>
+        <w:t xml:space="preserve"> e arquivos de sistema</w:t>
       </w:r>
     </w:p>
     <w:p>
@@ -6064,7 +8098,27 @@
           <w:sz w:val="22"/>
           <w:szCs w:val="22"/>
         </w:rPr>
-        <w:t>Ativar Dependabot Alerts nas configurações de segurança do repositório</w:t>
+        <w:t xml:space="preserve">Ativar </w:t>
+      </w:r>
+      <w:proofErr w:type="spellStart"/>
+      <w:r>
+        <w:rPr>
+          <w:rFonts w:ascii="Arial" w:eastAsia="Arial" w:hAnsi="Arial" w:cs="Arial"/>
+          <w:color w:val="2C3E50"/>
+          <w:sz w:val="22"/>
+          <w:szCs w:val="22"/>
+        </w:rPr>
+        <w:t>Dependabot</w:t>
+      </w:r>
+      <w:proofErr w:type="spellEnd"/>
+      <w:r>
+        <w:rPr>
+          <w:rFonts w:ascii="Arial" w:eastAsia="Arial" w:hAnsi="Arial" w:cs="Arial"/>
+          <w:color w:val="2C3E50"/>
+          <w:sz w:val="22"/>
+          <w:szCs w:val="22"/>
+        </w:rPr>
+        <w:t xml:space="preserve"> Alerts nas configurações de segurança do repositório</w:t>
       </w:r>
     </w:p>
     <w:p>
@@ -6084,8 +8138,19 @@
           <w:sz w:val="22"/>
           <w:szCs w:val="22"/>
         </w:rPr>
-        <w:t>Verificar que nenhum dado sensível está no histórico de commits</w:t>
-      </w:r>
+        <w:t xml:space="preserve">Verificar que nenhum dado sensível está no histórico de </w:t>
+      </w:r>
+      <w:proofErr w:type="spellStart"/>
+      <w:r>
+        <w:rPr>
+          <w:rFonts w:ascii="Arial" w:eastAsia="Arial" w:hAnsi="Arial" w:cs="Arial"/>
+          <w:color w:val="2C3E50"/>
+          <w:sz w:val="22"/>
+          <w:szCs w:val="22"/>
+        </w:rPr>
+        <w:t>commits</w:t>
+      </w:r>
+      <w:proofErr w:type="spellEnd"/>
     </w:p>
     <w:p>
       <w:pPr>
@@ -6100,6 +8165,7 @@
           <w:lang w:val="en-US"/>
         </w:rPr>
       </w:pPr>
+      <w:proofErr w:type="spellStart"/>
       <w:r>
         <w:rPr>
           <w:rFonts w:ascii="Arial" w:eastAsia="Arial" w:hAnsi="Arial" w:cs="Arial"/>
@@ -6108,7 +8174,40 @@
           <w:szCs w:val="22"/>
           <w:lang w:val="en-US"/>
         </w:rPr>
-        <w:t>Ativar Branch Protection na branch main</w:t>
+        <w:t>Ativar</w:t>
+      </w:r>
+      <w:proofErr w:type="spellEnd"/>
+      <w:r>
+        <w:rPr>
+          <w:rFonts w:ascii="Arial" w:eastAsia="Arial" w:hAnsi="Arial" w:cs="Arial"/>
+          <w:color w:val="2C3E50"/>
+          <w:sz w:val="22"/>
+          <w:szCs w:val="22"/>
+          <w:lang w:val="en-US"/>
+        </w:rPr>
+        <w:t xml:space="preserve"> Branch Protection </w:t>
+      </w:r>
+      <w:proofErr w:type="spellStart"/>
+      <w:r>
+        <w:rPr>
+          <w:rFonts w:ascii="Arial" w:eastAsia="Arial" w:hAnsi="Arial" w:cs="Arial"/>
+          <w:color w:val="2C3E50"/>
+          <w:sz w:val="22"/>
+          <w:szCs w:val="22"/>
+          <w:lang w:val="en-US"/>
+        </w:rPr>
+        <w:t>na</w:t>
+      </w:r>
+      <w:proofErr w:type="spellEnd"/>
+      <w:r>
+        <w:rPr>
+          <w:rFonts w:ascii="Arial" w:eastAsia="Arial" w:hAnsi="Arial" w:cs="Arial"/>
+          <w:color w:val="2C3E50"/>
+          <w:sz w:val="22"/>
+          <w:szCs w:val="22"/>
+          <w:lang w:val="en-US"/>
+        </w:rPr>
+        <w:t xml:space="preserve"> branch main</w:t>
       </w:r>
     </w:p>
     <w:p>
@@ -6154,7 +8253,47 @@
           <w:sz w:val="22"/>
           <w:szCs w:val="22"/>
         </w:rPr>
-        <w:t>Configurar GitHub Pages na branch main, pasta raiz (/)</w:t>
+        <w:t xml:space="preserve">Configurar GitHub Pages na </w:t>
+      </w:r>
+      <w:proofErr w:type="spellStart"/>
+      <w:r>
+        <w:rPr>
+          <w:rFonts w:ascii="Arial" w:eastAsia="Arial" w:hAnsi="Arial" w:cs="Arial"/>
+          <w:color w:val="2C3E50"/>
+          <w:sz w:val="22"/>
+          <w:szCs w:val="22"/>
+        </w:rPr>
+        <w:t>branch</w:t>
+      </w:r>
+      <w:proofErr w:type="spellEnd"/>
+      <w:r>
+        <w:rPr>
+          <w:rFonts w:ascii="Arial" w:eastAsia="Arial" w:hAnsi="Arial" w:cs="Arial"/>
+          <w:color w:val="2C3E50"/>
+          <w:sz w:val="22"/>
+          <w:szCs w:val="22"/>
+        </w:rPr>
+        <w:t xml:space="preserve"> </w:t>
+      </w:r>
+      <w:proofErr w:type="spellStart"/>
+      <w:r>
+        <w:rPr>
+          <w:rFonts w:ascii="Arial" w:eastAsia="Arial" w:hAnsi="Arial" w:cs="Arial"/>
+          <w:color w:val="2C3E50"/>
+          <w:sz w:val="22"/>
+          <w:szCs w:val="22"/>
+        </w:rPr>
+        <w:t>main</w:t>
+      </w:r>
+      <w:proofErr w:type="spellEnd"/>
+      <w:r>
+        <w:rPr>
+          <w:rFonts w:ascii="Arial" w:eastAsia="Arial" w:hAnsi="Arial" w:cs="Arial"/>
+          <w:color w:val="2C3E50"/>
+          <w:sz w:val="22"/>
+          <w:szCs w:val="22"/>
+        </w:rPr>
+        <w:t>, pasta raiz (/)</w:t>
       </w:r>
     </w:p>
     <w:p>
@@ -6174,7 +8313,47 @@
           <w:sz w:val="22"/>
           <w:szCs w:val="22"/>
         </w:rPr>
-        <w:t>Definir níveis de acesso: Owner (estudante) com escrita, Read para visitantes públicos</w:t>
+        <w:t xml:space="preserve">Definir níveis de acesso: </w:t>
+      </w:r>
+      <w:proofErr w:type="spellStart"/>
+      <w:r>
+        <w:rPr>
+          <w:rFonts w:ascii="Arial" w:eastAsia="Arial" w:hAnsi="Arial" w:cs="Arial"/>
+          <w:color w:val="2C3E50"/>
+          <w:sz w:val="22"/>
+          <w:szCs w:val="22"/>
+        </w:rPr>
+        <w:t>Owner</w:t>
+      </w:r>
+      <w:proofErr w:type="spellEnd"/>
+      <w:r>
+        <w:rPr>
+          <w:rFonts w:ascii="Arial" w:eastAsia="Arial" w:hAnsi="Arial" w:cs="Arial"/>
+          <w:color w:val="2C3E50"/>
+          <w:sz w:val="22"/>
+          <w:szCs w:val="22"/>
+        </w:rPr>
+        <w:t xml:space="preserve"> (estudante) com escrita, </w:t>
+      </w:r>
+      <w:proofErr w:type="spellStart"/>
+      <w:r>
+        <w:rPr>
+          <w:rFonts w:ascii="Arial" w:eastAsia="Arial" w:hAnsi="Arial" w:cs="Arial"/>
+          <w:color w:val="2C3E50"/>
+          <w:sz w:val="22"/>
+          <w:szCs w:val="22"/>
+        </w:rPr>
+        <w:t>Read</w:t>
+      </w:r>
+      <w:proofErr w:type="spellEnd"/>
+      <w:r>
+        <w:rPr>
+          <w:rFonts w:ascii="Arial" w:eastAsia="Arial" w:hAnsi="Arial" w:cs="Arial"/>
+          <w:color w:val="2C3E50"/>
+          <w:sz w:val="22"/>
+          <w:szCs w:val="22"/>
+        </w:rPr>
+        <w:t xml:space="preserve"> para visitantes públicos</w:t>
       </w:r>
     </w:p>
     <w:p>
@@ -6214,7 +8393,27 @@
           <w:sz w:val="22"/>
           <w:szCs w:val="22"/>
         </w:rPr>
-        <w:t>Usar histórico de commits como rastreabilidade de todas as alterações</w:t>
+        <w:t xml:space="preserve">Usar histórico de </w:t>
+      </w:r>
+      <w:proofErr w:type="spellStart"/>
+      <w:r>
+        <w:rPr>
+          <w:rFonts w:ascii="Arial" w:eastAsia="Arial" w:hAnsi="Arial" w:cs="Arial"/>
+          <w:color w:val="2C3E50"/>
+          <w:sz w:val="22"/>
+          <w:szCs w:val="22"/>
+        </w:rPr>
+        <w:t>commits</w:t>
+      </w:r>
+      <w:proofErr w:type="spellEnd"/>
+      <w:r>
+        <w:rPr>
+          <w:rFonts w:ascii="Arial" w:eastAsia="Arial" w:hAnsi="Arial" w:cs="Arial"/>
+          <w:color w:val="2C3E50"/>
+          <w:sz w:val="22"/>
+          <w:szCs w:val="22"/>
+        </w:rPr>
+        <w:t xml:space="preserve"> como rastreabilidade de todas as alterações</w:t>
       </w:r>
     </w:p>
     <w:p>
@@ -6337,7 +8536,27 @@
           <w:sz w:val="22"/>
           <w:szCs w:val="22"/>
         </w:rPr>
-        <w:t>Criar entrada 'PortfolioHUB' na seção Projetos com descrição e tecnologias</w:t>
+        <w:t>Criar entrada '</w:t>
+      </w:r>
+      <w:proofErr w:type="spellStart"/>
+      <w:r>
+        <w:rPr>
+          <w:rFonts w:ascii="Arial" w:eastAsia="Arial" w:hAnsi="Arial" w:cs="Arial"/>
+          <w:color w:val="2C3E50"/>
+          <w:sz w:val="22"/>
+          <w:szCs w:val="22"/>
+        </w:rPr>
+        <w:t>PortfolioHUB</w:t>
+      </w:r>
+      <w:proofErr w:type="spellEnd"/>
+      <w:r>
+        <w:rPr>
+          <w:rFonts w:ascii="Arial" w:eastAsia="Arial" w:hAnsi="Arial" w:cs="Arial"/>
+          <w:color w:val="2C3E50"/>
+          <w:sz w:val="22"/>
+          <w:szCs w:val="22"/>
+        </w:rPr>
+        <w:t>' na seção Projetos com descrição e tecnologias</w:t>
       </w:r>
     </w:p>
     <w:p>
@@ -6377,8 +8596,39 @@
           <w:sz w:val="22"/>
           <w:szCs w:val="22"/>
         </w:rPr>
-        <w:t>Atualizar habilidades com: Git, GitHub, GitHub Pages, HTML, CSS, JavaScript</w:t>
-      </w:r>
+        <w:t xml:space="preserve">Atualizar habilidades com: </w:t>
+      </w:r>
+      <w:proofErr w:type="spellStart"/>
+      <w:r>
+        <w:rPr>
+          <w:rFonts w:ascii="Arial" w:eastAsia="Arial" w:hAnsi="Arial" w:cs="Arial"/>
+          <w:color w:val="2C3E50"/>
+          <w:sz w:val="22"/>
+          <w:szCs w:val="22"/>
+        </w:rPr>
+        <w:t>Git</w:t>
+      </w:r>
+      <w:proofErr w:type="spellEnd"/>
+      <w:r>
+        <w:rPr>
+          <w:rFonts w:ascii="Arial" w:eastAsia="Arial" w:hAnsi="Arial" w:cs="Arial"/>
+          <w:color w:val="2C3E50"/>
+          <w:sz w:val="22"/>
+          <w:szCs w:val="22"/>
+        </w:rPr>
+        <w:t xml:space="preserve">, GitHub, GitHub Pages, HTML, CSS, </w:t>
+      </w:r>
+      <w:proofErr w:type="spellStart"/>
+      <w:r>
+        <w:rPr>
+          <w:rFonts w:ascii="Arial" w:eastAsia="Arial" w:hAnsi="Arial" w:cs="Arial"/>
+          <w:color w:val="2C3E50"/>
+          <w:sz w:val="22"/>
+          <w:szCs w:val="22"/>
+        </w:rPr>
+        <w:t>JavaScript</w:t>
+      </w:r>
+      <w:proofErr w:type="spellEnd"/>
     </w:p>
     <w:p>
       <w:pPr>
@@ -6441,7 +8691,27 @@
           <w:szCs w:val="22"/>
         </w:rPr>
         <w:lastRenderedPageBreak/>
-        <w:t>Verificar responsividade com DevTools (F12) em telas de 360px a 1920px</w:t>
+        <w:t xml:space="preserve">Verificar responsividade com </w:t>
+      </w:r>
+      <w:proofErr w:type="spellStart"/>
+      <w:r>
+        <w:rPr>
+          <w:rFonts w:ascii="Arial" w:eastAsia="Arial" w:hAnsi="Arial" w:cs="Arial"/>
+          <w:color w:val="2C3E50"/>
+          <w:sz w:val="22"/>
+          <w:szCs w:val="22"/>
+        </w:rPr>
+        <w:t>DevTools</w:t>
+      </w:r>
+      <w:proofErr w:type="spellEnd"/>
+      <w:r>
+        <w:rPr>
+          <w:rFonts w:ascii="Arial" w:eastAsia="Arial" w:hAnsi="Arial" w:cs="Arial"/>
+          <w:color w:val="2C3E50"/>
+          <w:sz w:val="22"/>
+          <w:szCs w:val="22"/>
+        </w:rPr>
+        <w:t xml:space="preserve"> (F12) em telas de 360px a 1920px</w:t>
       </w:r>
     </w:p>
     <w:p>
@@ -7057,6 +9327,7 @@
       <w:pPr>
         <w:jc w:val="center"/>
       </w:pPr>
+      <w:proofErr w:type="spellStart"/>
       <w:r>
         <w:rPr>
           <w:rFonts w:ascii="Arial" w:eastAsia="Arial" w:hAnsi="Arial" w:cs="Arial"/>
@@ -7064,7 +9335,17 @@
           <w:sz w:val="18"/>
           <w:szCs w:val="18"/>
         </w:rPr>
-        <w:t>Bootcamp I — CEUB 2026 | © Gustavo Lisboa Gonçalves</w:t>
+        <w:t>Bootcamp</w:t>
+      </w:r>
+      <w:proofErr w:type="spellEnd"/>
+      <w:r>
+        <w:rPr>
+          <w:rFonts w:ascii="Arial" w:eastAsia="Arial" w:hAnsi="Arial" w:cs="Arial"/>
+          <w:color w:val="666666"/>
+          <w:sz w:val="18"/>
+          <w:szCs w:val="18"/>
+        </w:rPr>
+        <w:t xml:space="preserve"> I — CEUB 2026 | © Gustavo Lisboa Gonçalves</w:t>
       </w:r>
     </w:p>
     <w:sectPr>
@@ -7123,7 +9404,6 @@
         <w:docPartUnique/>
       </w:docPartObj>
     </w:sdtPr>
-    <w:sdtEndPr/>
     <w:sdtContent>
       <w:p>
         <w:pPr>

</xml_diff>